<commit_message>
Tema 3.A.21: fuera la frase de Joan Robinson (Víctor la guarda para otro tema)
Co-Authored-By: Claude Opus 5.5 <noreply@anthropic.com>
Claude-Session: https://claude.ai/code/session_01PWJgAjs4PN1Rvp3aLA4tqT
</commit_message>
<xml_diff>
--- a/oposicion/temario/tercer-ejercicio/3A21.docx
+++ b/oposicion/temario/tercer-ejercicio/3A21.docx
@@ -2272,7 +2272,7 @@
         <w:t xml:space="preserve">Walras</w:t>
       </w:r>
       <w:r>
-        <w:t xml:space="preserve">, equilibrio general, punto fijo, distancia al equilibrio, núcleo, dicotomía clásica y bienes contingentes). Al empezar el bloque I, la imagen del mapa a escala de uno a uno de Joan</w:t>
+        <w:t xml:space="preserve">, equilibrio general, punto fijo, distancia al equilibrio, núcleo, dicotomía clásica y bienes contingentes). Los gráficos imprescindibles son la caja de la producción con la FPP y los precios, la caja de intercambio (que crece desde I.3 hasta III.2), el punto fijo de</w:t>
       </w:r>
       <w:r>
         <w:t xml:space="preserve"> </w:t>
@@ -2281,21 +2281,6 @@
         <w:rPr>
           <w:smallCaps/>
         </w:rPr>
-        <w:t xml:space="preserve">Robinson</w:t>
-      </w:r>
-      <w:r>
-        <w:t xml:space="preserve"> </w:t>
-      </w:r>
-      <w:r>
-        <w:t xml:space="preserve">justifica en una frase por qué el modelo hace supuestos tan fuertes. Los gráficos imprescindibles son la caja de la producción con la FPP y los precios, la caja de intercambio (que crece desde I.3 hasta III.2), el punto fijo de</w:t>
-      </w:r>
-      <w:r>
-        <w:t xml:space="preserve"> </w:t>
-      </w:r>
-      <w:r>
-        <w:rPr>
-          <w:smallCaps/>
-        </w:rPr>
         <w:t xml:space="preserve">Brouwer</w:t>
       </w:r>
       <w:r>
@@ -2306,7 +2291,7 @@
       </w:r>
     </w:p>
     <w:bookmarkEnd w:id="26"/>
-    <w:bookmarkStart w:id="67" w:name="X163c51afc878a6cc9a7706a5fb04df9ac9f66b1"/>
+    <w:bookmarkStart w:id="66" w:name="X163c51afc878a6cc9a7706a5fb04df9ac9f66b1"/>
     <w:p>
       <w:pPr>
         <w:pStyle w:val="Heading1"/>
@@ -2369,72 +2354,7 @@
         </w:numPr>
       </w:pPr>
       <w:r>
-        <w:t xml:space="preserve">Joan</w:t>
-      </w:r>
-      <w:r>
-        <w:t xml:space="preserve"> </w:t>
-      </w:r>
-      <w:r>
-        <w:rPr>
-          <w:smallCaps/>
-        </w:rPr>
-        <w:t xml:space="preserve">Robinson</w:t>
-      </w:r>
-      <w:r>
-        <w:t xml:space="preserve"> </w:t>
-      </w:r>
-      <w:r>
-        <w:t xml:space="preserve">lo resume con una imagen: «un modelo que tomara en cuenta toda la diversidad de la realidad sería tan poco útil como un mapa a escala de uno a uno»</w:t>
-      </w:r>
-      <w:r>
-        <w:t xml:space="preserve"> </w:t>
-      </w:r>
-      <w:r>
-        <w:t xml:space="preserve">(</w:t>
-      </w:r>
-      <w:hyperlink w:anchor="ref-Robinson1962Economic">
-        <w:r>
-          <w:rPr>
-            <w:rStyle w:val="Hyperlink"/>
-            <w:smallCaps/>
-          </w:rPr>
-          <w:t xml:space="preserve">Robinson</w:t>
-        </w:r>
-        <w:r>
-          <w:rPr>
-            <w:rStyle w:val="Hyperlink"/>
-          </w:rPr>
-          <w:t xml:space="preserve"> </w:t>
-        </w:r>
-        <w:r>
-          <w:rPr>
-            <w:rStyle w:val="Hyperlink"/>
-          </w:rPr>
-          <w:t xml:space="preserve">1962, 33</w:t>
-        </w:r>
-      </w:hyperlink>
-      <w:r>
-        <w:t xml:space="preserve">)</w:t>
-      </w:r>
-      <w:r>
-        <w:t xml:space="preserve">.</w:t>
-      </w:r>
-      <w:r>
-        <w:rPr>
-          <w:rStyle w:val="FootnoteReference"/>
-        </w:rPr>
-        <w:footnoteReference w:id="27"/>
-      </w:r>
-    </w:p>
-    <w:p>
-      <w:pPr>
-        <w:numPr>
-          <w:ilvl w:val="1"/>
-          <w:numId w:val="1011"/>
-        </w:numPr>
-      </w:pPr>
-      <w:r>
-        <w:t xml:space="preserve">Por eso el modelo hace supuestos tan fuertes (2 bienes, 2 factores, 2 consumidores, 2 empresas, competencia perfecta, convexidad): no pretenden ser realistas, sino dejar a la vista el mecanismo que interesa, cómo los precios coordinan a todos los agentes a la vez. El bloque III comprueba qué queda de ese mecanismo cuando se relajan.</w:t>
+        <w:t xml:space="preserve">Para lograrlo, el modelo hace supuestos muy fuertes (2 bienes, 2 factores, 2 consumidores, 2 empresas, competencia perfecta, convexidad): no pretenden ser realistas, sino dejar a la vista el mecanismo que interesa, cómo los precios coordinan a todos los agentes a la vez. El bloque III comprueba qué queda de ese mecanismo cuando se relajan.</w:t>
       </w:r>
     </w:p>
     <w:p>
@@ -2577,7 +2497,7 @@
       <w:r>
         <w:t xml:space="preserve"> </w:t>
       </w:r>
-      <w:hyperlink r:id="rId28">
+      <w:hyperlink r:id="rId27">
         <w:r>
           <w:rPr>
             <w:rStyle w:val="Hyperlink"/>
@@ -2600,7 +2520,7 @@
       <w:r>
         <w:t xml:space="preserve"> </w:t>
       </w:r>
-      <w:hyperlink r:id="rId29">
+      <w:hyperlink r:id="rId28">
         <w:r>
           <w:rPr>
             <w:rStyle w:val="Hyperlink"/>
@@ -2609,7 +2529,7 @@
         </w:r>
       </w:hyperlink>
     </w:p>
-    <w:bookmarkStart w:id="38" w:name="supuestos"/>
+    <w:bookmarkStart w:id="37" w:name="supuestos"/>
     <w:p>
       <w:pPr>
         <w:pStyle w:val="Heading2"/>
@@ -2679,7 +2599,7 @@
         <w:t xml:space="preserve">: todos los mercados se analizan simultáneamente. Hay tantos mercados como mercancías (bienes y factores), y en cada uno hay una función de demanda, una función de oferta y una condición de vaciado: la cantidad demandada debe igualar a la ofrecida (tabla 1).</w:t>
       </w:r>
     </w:p>
-    <w:bookmarkStart w:id="30" w:name="tab:ecuaciones"/>
+    <w:bookmarkStart w:id="29" w:name="tab:ecuaciones"/>
     <w:p>
       <w:pPr>
         <w:pStyle w:val="TableCaption"/>
@@ -3389,7 +3309,7 @@
         </w:tc>
       </w:tr>
     </w:tbl>
-    <w:bookmarkEnd w:id="30"/>
+    <w:bookmarkEnd w:id="29"/>
     <w:p>
       <w:pPr>
         <w:pStyle w:val="BodyText"/>
@@ -3577,7 +3497,7 @@
         <w:rPr>
           <w:rStyle w:val="FootnoteReference"/>
         </w:rPr>
-        <w:footnoteReference w:id="31"/>
+        <w:footnoteReference w:id="30"/>
       </w:r>
     </w:p>
     <w:p>
@@ -3853,7 +3773,7 @@
         <w:rPr>
           <w:rStyle w:val="FootnoteReference"/>
         </w:rPr>
-        <w:footnoteReference w:id="32"/>
+        <w:footnoteReference w:id="31"/>
       </w:r>
     </w:p>
     <w:p>
@@ -4232,7 +4152,7 @@
         <w:rPr>
           <w:rStyle w:val="FootnoteReference"/>
         </w:rPr>
-        <w:footnoteReference w:id="33"/>
+        <w:footnoteReference w:id="32"/>
       </w:r>
       <w:r>
         <w:t xml:space="preserve"> </w:t>
@@ -4797,7 +4717,7 @@
         <w:rPr>
           <w:rStyle w:val="FootnoteReference"/>
         </w:rPr>
-        <w:footnoteReference w:id="34"/>
+        <w:footnoteReference w:id="33"/>
       </w:r>
     </w:p>
     <w:p>
@@ -4828,7 +4748,7 @@
         <w:rPr>
           <w:rStyle w:val="FootnoteReference"/>
         </w:rPr>
-        <w:footnoteReference w:id="35"/>
+        <w:footnoteReference w:id="34"/>
       </w:r>
       <w:r>
         <w:t xml:space="preserve"> </w:t>
@@ -4987,7 +4907,7 @@
         <w:rPr>
           <w:rStyle w:val="FootnoteReference"/>
         </w:rPr>
-        <w:footnoteReference w:id="36"/>
+        <w:footnoteReference w:id="35"/>
       </w:r>
       <w:r>
         <w:t xml:space="preserve"> </w:t>
@@ -5211,11 +5131,11 @@
         <w:rPr>
           <w:rStyle w:val="FootnoteReference"/>
         </w:rPr>
-        <w:footnoteReference w:id="37"/>
-      </w:r>
-    </w:p>
-    <w:bookmarkEnd w:id="38"/>
-    <w:bookmarkStart w:id="60" w:name="desarrollo"/>
+        <w:footnoteReference w:id="36"/>
+      </w:r>
+    </w:p>
+    <w:bookmarkEnd w:id="37"/>
+    <w:bookmarkStart w:id="59" w:name="desarrollo"/>
     <w:p>
       <w:pPr>
         <w:pStyle w:val="Heading2"/>
@@ -5250,7 +5170,7 @@
         <w:t xml:space="preserve">.</w:t>
       </w:r>
     </w:p>
-    <w:bookmarkStart w:id="48" w:name="productores-y-oferta"/>
+    <w:bookmarkStart w:id="47" w:name="productores-y-oferta"/>
     <w:p>
       <w:pPr>
         <w:pStyle w:val="Heading3"/>
@@ -5318,7 +5238,7 @@
         <w:rPr>
           <w:rStyle w:val="FootnoteReference"/>
         </w:rPr>
-        <w:footnoteReference w:id="39"/>
+        <w:footnoteReference w:id="38"/>
       </w:r>
     </w:p>
     <w:p>
@@ -6418,7 +6338,7 @@
         <w:rPr>
           <w:rStyle w:val="FootnoteReference"/>
         </w:rPr>
-        <w:footnoteReference w:id="40"/>
+        <w:footnoteReference w:id="39"/>
       </w:r>
       <w:r>
         <w:t xml:space="preserve"> </w:t>
@@ -6629,7 +6549,7 @@
         <w:rPr>
           <w:rStyle w:val="FootnoteReference"/>
         </w:rPr>
-        <w:footnoteReference w:id="41"/>
+        <w:footnoteReference w:id="40"/>
       </w:r>
     </w:p>
     <w:p>
@@ -6662,7 +6582,7 @@
         <w:rPr>
           <w:rStyle w:val="FootnoteReference"/>
         </w:rPr>
-        <w:footnoteReference w:id="42"/>
+        <w:footnoteReference w:id="41"/>
       </w:r>
       <w:r>
         <w:t xml:space="preserve"> </w:t>
@@ -7043,10 +6963,10 @@
         <w:rPr>
           <w:rStyle w:val="FootnoteReference"/>
         </w:rPr>
-        <w:footnoteReference w:id="43"/>
-      </w:r>
-    </w:p>
-    <w:bookmarkStart w:id="47" w:name="fig:caja-produccion-precios"/>
+        <w:footnoteReference w:id="42"/>
+      </w:r>
+    </w:p>
+    <w:bookmarkStart w:id="46" w:name="fig:caja-produccion-precios"/>
     <w:p>
       <w:pPr>
         <w:pStyle w:val="ImageCaption"/>
@@ -7155,18 +7075,18 @@
           <wp:inline>
             <wp:extent cx="5364072" cy="2223307"/>
             <wp:effectExtent b="0" l="0" r="0" t="0"/>
-            <wp:docPr descr="" title="" id="45" name="Picture"/>
+            <wp:docPr descr="" title="" id="44" name="Picture"/>
             <a:graphic>
               <a:graphicData uri="http://schemas.openxmlformats.org/drawingml/2006/picture">
                 <pic:pic>
                   <pic:nvPicPr>
-                    <pic:cNvPr descr="C:\Users\vgutierrez\Documents\src\victorgutierrezmarcos.github.io-revision\oposicion\temario\fuentes\3A21\graficos/caja-produccion-precios.png" id="46" name="Picture"/>
+                    <pic:cNvPr descr="C:\Users\vgutierrez\Documents\src\victorgutierrezmarcos.github.io-revision\oposicion\temario\fuentes\3A21\graficos/caja-produccion-precios.png" id="45" name="Picture"/>
                     <pic:cNvPicPr>
                       <a:picLocks noChangeArrowheads="1" noChangeAspect="1"/>
                     </pic:cNvPicPr>
                   </pic:nvPicPr>
                   <pic:blipFill>
-                    <a:blip r:embed="rId44"/>
+                    <a:blip r:embed="rId43"/>
                     <a:stretch>
                       <a:fillRect/>
                     </a:stretch>
@@ -7193,7 +7113,7 @@
         </w:drawing>
       </w:r>
     </w:p>
-    <w:bookmarkEnd w:id="47"/>
+    <w:bookmarkEnd w:id="46"/>
     <w:p>
       <w:pPr>
         <w:pStyle w:val="Piedeimagen"/>
@@ -7231,8 +7151,8 @@
         <w:t xml:space="preserve">.</w:t>
       </w:r>
     </w:p>
-    <w:bookmarkEnd w:id="48"/>
-    <w:bookmarkStart w:id="51" w:name="consumidores-y-demanda"/>
+    <w:bookmarkEnd w:id="47"/>
+    <w:bookmarkStart w:id="50" w:name="consumidores-y-demanda"/>
     <w:p>
       <w:pPr>
         <w:pStyle w:val="Heading3"/>
@@ -8371,7 +8291,7 @@
         <w:t xml:space="preserve">, sea cual sea su precio.</w:t>
       </w:r>
     </w:p>
-    <w:bookmarkStart w:id="50" w:name="la-demanda-de-mercado"/>
+    <w:bookmarkStart w:id="49" w:name="la-demanda-de-mercado"/>
     <w:p>
       <w:pPr>
         <w:pStyle w:val="Heading4"/>
@@ -9562,7 +9482,7 @@
         <w:rPr>
           <w:rStyle w:val="FootnoteReference"/>
         </w:rPr>
-        <w:footnoteReference w:id="49"/>
+        <w:footnoteReference w:id="48"/>
       </w:r>
       <w:r>
         <w:t xml:space="preserve"> </w:t>
@@ -9634,9 +9554,9 @@
         <w:t xml:space="preserve">(II.1.2).</w:t>
       </w:r>
     </w:p>
+    <w:bookmarkEnd w:id="49"/>
     <w:bookmarkEnd w:id="50"/>
-    <w:bookmarkEnd w:id="51"/>
-    <w:bookmarkStart w:id="57" w:name="función-de-exceso-de-demanda"/>
+    <w:bookmarkStart w:id="56" w:name="función-de-exceso-de-demanda"/>
     <w:p>
       <w:pPr>
         <w:pStyle w:val="Heading3"/>
@@ -10049,7 +9969,7 @@
         <w:rPr>
           <w:rStyle w:val="FootnoteReference"/>
         </w:rPr>
-        <w:footnoteReference w:id="52"/>
+        <w:footnoteReference w:id="51"/>
       </w:r>
       <w:r>
         <w:t xml:space="preserve"> </w:t>
@@ -11474,7 +11394,7 @@
         <w:t xml:space="preserve">(1935).</w:t>
       </w:r>
     </w:p>
-    <w:bookmarkStart w:id="56" w:name="fig:bienes-libres"/>
+    <w:bookmarkStart w:id="55" w:name="fig:bienes-libres"/>
     <w:p>
       <w:pPr>
         <w:pStyle w:val="ImageCaption"/>
@@ -11498,18 +11418,18 @@
           <wp:inline>
             <wp:extent cx="4831946" cy="4510836"/>
             <wp:effectExtent b="0" l="0" r="0" t="0"/>
-            <wp:docPr descr="" title="" id="54" name="Picture"/>
+            <wp:docPr descr="" title="" id="53" name="Picture"/>
             <a:graphic>
               <a:graphicData uri="http://schemas.openxmlformats.org/drawingml/2006/picture">
                 <pic:pic>
                   <pic:nvPicPr>
-                    <pic:cNvPr descr="C:\Users\vgutierrez\Documents\src\victorgutierrezmarcos.github.io-revision\oposicion\temario\fuentes\3A21\graficos/bienes-libres.png" id="55" name="Picture"/>
+                    <pic:cNvPr descr="C:\Users\vgutierrez\Documents\src\victorgutierrezmarcos.github.io-revision\oposicion\temario\fuentes\3A21\graficos/bienes-libres.png" id="54" name="Picture"/>
                     <pic:cNvPicPr>
                       <a:picLocks noChangeArrowheads="1" noChangeAspect="1"/>
                     </pic:cNvPicPr>
                   </pic:nvPicPr>
                   <pic:blipFill>
-                    <a:blip r:embed="rId53"/>
+                    <a:blip r:embed="rId52"/>
                     <a:stretch>
                       <a:fillRect/>
                     </a:stretch>
@@ -11536,7 +11456,7 @@
         </w:drawing>
       </w:r>
     </w:p>
-    <w:bookmarkEnd w:id="56"/>
+    <w:bookmarkEnd w:id="55"/>
     <w:p>
       <w:pPr>
         <w:pStyle w:val="Piedeimagen"/>
@@ -11589,8 +11509,8 @@
         <w:t xml:space="preserve">.</w:t>
       </w:r>
     </w:p>
-    <w:bookmarkEnd w:id="57"/>
-    <w:bookmarkStart w:id="59" w:name="ley-de-walras"/>
+    <w:bookmarkEnd w:id="56"/>
+    <w:bookmarkStart w:id="58" w:name="ley-de-walras"/>
     <w:p>
       <w:pPr>
         <w:pStyle w:val="Heading3"/>
@@ -12757,12 +12677,12 @@
         <w:rPr>
           <w:rStyle w:val="FootnoteReference"/>
         </w:rPr>
-        <w:footnoteReference w:id="58"/>
-      </w:r>
-    </w:p>
+        <w:footnoteReference w:id="57"/>
+      </w:r>
+    </w:p>
+    <w:bookmarkEnd w:id="58"/>
     <w:bookmarkEnd w:id="59"/>
-    <w:bookmarkEnd w:id="60"/>
-    <w:bookmarkStart w:id="66" w:name="Xfceb14383c13f9f95ee2161f7600f7470cb255d"/>
+    <w:bookmarkStart w:id="65" w:name="Xfceb14383c13f9f95ee2161f7600f7470cb255d"/>
     <w:p>
       <w:pPr>
         <w:pStyle w:val="Heading2"/>
@@ -13842,7 +13762,7 @@
         <w:t xml:space="preserve">.</w:t>
       </w:r>
     </w:p>
-    <w:bookmarkStart w:id="65" w:name="X31b95f6f7bf94949bb61cb7d9838cd09fea50cb"/>
+    <w:bookmarkStart w:id="64" w:name="X31b95f6f7bf94949bb61cb7d9838cd09fea50cb"/>
     <w:p>
       <w:pPr>
         <w:pStyle w:val="Heading4"/>
@@ -14745,7 +14665,7 @@
         <w:t xml:space="preserve">.</w:t>
       </w:r>
     </w:p>
-    <w:bookmarkStart w:id="64" w:name="fig:caja-intercambio-equilibrio"/>
+    <w:bookmarkStart w:id="63" w:name="fig:caja-intercambio-equilibrio"/>
     <w:p>
       <w:pPr>
         <w:pStyle w:val="ImageCaption"/>
@@ -14792,18 +14712,18 @@
           <wp:inline>
             <wp:extent cx="4476750" cy="3187759"/>
             <wp:effectExtent b="0" l="0" r="0" t="0"/>
-            <wp:docPr descr="" title="" id="62" name="Picture"/>
+            <wp:docPr descr="" title="" id="61" name="Picture"/>
             <a:graphic>
               <a:graphicData uri="http://schemas.openxmlformats.org/drawingml/2006/picture">
                 <pic:pic>
                   <pic:nvPicPr>
-                    <pic:cNvPr descr="C:\Users\vgutierrez\Documents\src\victorgutierrezmarcos.github.io-revision\oposicion\temario\fuentes\3A21\graficos/caja-intercambio-equilibrio.png" id="63" name="Picture"/>
+                    <pic:cNvPr descr="C:\Users\vgutierrez\Documents\src\victorgutierrezmarcos.github.io-revision\oposicion\temario\fuentes\3A21\graficos/caja-intercambio-equilibrio.png" id="62" name="Picture"/>
                     <pic:cNvPicPr>
                       <a:picLocks noChangeArrowheads="1" noChangeAspect="1"/>
                     </pic:cNvPicPr>
                   </pic:nvPicPr>
                   <pic:blipFill>
-                    <a:blip r:embed="rId61"/>
+                    <a:blip r:embed="rId60"/>
                     <a:stretch>
                       <a:fillRect/>
                     </a:stretch>
@@ -14830,7 +14750,7 @@
         </w:drawing>
       </w:r>
     </w:p>
-    <w:bookmarkEnd w:id="64"/>
+    <w:bookmarkEnd w:id="63"/>
     <w:p>
       <w:pPr>
         <w:pStyle w:val="Piedeimagen"/>
@@ -15002,10 +14922,10 @@
         <w:t xml:space="preserve">. Conviene subrayarlo en el cante para que no parezca el equilibrio parcial con más mercados.</w:t>
       </w:r>
     </w:p>
+    <w:bookmarkEnd w:id="64"/>
     <w:bookmarkEnd w:id="65"/>
     <w:bookmarkEnd w:id="66"/>
-    <w:bookmarkEnd w:id="67"/>
-    <w:bookmarkStart w:id="120" w:name="X90e969293803a2829db5e18a058a49cfe82ee19"/>
+    <w:bookmarkStart w:id="119" w:name="X90e969293803a2829db5e18a058a49cfe82ee19"/>
     <w:p>
       <w:pPr>
         <w:pStyle w:val="Heading1"/>
@@ -15252,7 +15172,7 @@
         <w:t xml:space="preserve">y los 2 teoremas fundamentales con su nombre completo, su idea y sus supuestos, en palabras (2′). Las demostraciones de la existencia, de la unicidad (por el axioma débil y por los sustitutivos brutos) y de la estabilidad del tanteo están en el anexo B; la estabilidad en un mercado, en el anexo D; la estática comparativa y los teoremas del bienestar en detalle, en sus anexos.</w:t>
       </w:r>
     </w:p>
-    <w:bookmarkStart w:id="106" w:name="X5a4919df8437aeb3f18121298073782f7479990"/>
+    <w:bookmarkStart w:id="105" w:name="X5a4919df8437aeb3f18121298073782f7479990"/>
     <w:p>
       <w:pPr>
         <w:pStyle w:val="Heading2"/>
@@ -15358,7 +15278,7 @@
         <w:t xml:space="preserve">: cada pregunta presupone la anterior. Primero, si hay algún equilibrio; después, cuántos hay, y por último, si la economía llega a alguno.</w:t>
       </w:r>
     </w:p>
-    <w:bookmarkStart w:id="85" w:name="existencia"/>
+    <w:bookmarkStart w:id="84" w:name="existencia"/>
     <w:p>
       <w:pPr>
         <w:pStyle w:val="Heading3"/>
@@ -15373,7 +15293,7 @@
         <w:t xml:space="preserve">Existencia</w:t>
       </w:r>
     </w:p>
-    <w:bookmarkStart w:id="70" w:name="a-idea"/>
+    <w:bookmarkStart w:id="69" w:name="a-idea"/>
     <w:p>
       <w:pPr>
         <w:pStyle w:val="Heading4"/>
@@ -15487,7 +15407,7 @@
         <w:rPr>
           <w:rStyle w:val="FootnoteReference"/>
         </w:rPr>
-        <w:footnoteReference w:id="68"/>
+        <w:footnoteReference w:id="67"/>
       </w:r>
     </w:p>
     <w:p>
@@ -15811,11 +15731,11 @@
         <w:rPr>
           <w:rStyle w:val="FootnoteReference"/>
         </w:rPr>
-        <w:footnoteReference w:id="69"/>
-      </w:r>
-    </w:p>
-    <w:bookmarkEnd w:id="70"/>
-    <w:bookmarkStart w:id="81" w:name="b-modelo"/>
+        <w:footnoteReference w:id="68"/>
+      </w:r>
+    </w:p>
+    <w:bookmarkEnd w:id="69"/>
+    <w:bookmarkStart w:id="80" w:name="b-modelo"/>
     <w:p>
       <w:pPr>
         <w:pStyle w:val="Heading4"/>
@@ -15824,7 +15744,7 @@
         <w:t xml:space="preserve">b) Modelo</w:t>
       </w:r>
     </w:p>
-    <w:bookmarkStart w:id="77" w:name="i-supuestos"/>
+    <w:bookmarkStart w:id="76" w:name="i-supuestos"/>
     <w:p>
       <w:pPr>
         <w:pStyle w:val="Heading5"/>
@@ -15914,7 +15834,7 @@
         <w:rPr>
           <w:rStyle w:val="FootnoteReference"/>
         </w:rPr>
-        <w:footnoteReference w:id="71"/>
+        <w:footnoteReference w:id="70"/>
       </w:r>
     </w:p>
     <w:p>
@@ -16257,10 +16177,10 @@
         <w:rPr>
           <w:rStyle w:val="FootnoteReference"/>
         </w:rPr>
-        <w:footnoteReference w:id="72"/>
-      </w:r>
-    </w:p>
-    <w:bookmarkStart w:id="76" w:name="fig:brouwer"/>
+        <w:footnoteReference w:id="71"/>
+      </w:r>
+    </w:p>
+    <w:bookmarkStart w:id="75" w:name="fig:brouwer"/>
     <w:p>
       <w:pPr>
         <w:pStyle w:val="ImageCaption"/>
@@ -16299,18 +16219,18 @@
           <wp:inline>
             <wp:extent cx="2385391" cy="2110153"/>
             <wp:effectExtent b="0" l="0" r="0" t="0"/>
-            <wp:docPr descr="" title="" id="74" name="Picture"/>
+            <wp:docPr descr="" title="" id="73" name="Picture"/>
             <a:graphic>
               <a:graphicData uri="http://schemas.openxmlformats.org/drawingml/2006/picture">
                 <pic:pic>
                   <pic:nvPicPr>
-                    <pic:cNvPr descr="C:\Users\vgutierrez\Documents\src\victorgutierrezmarcos.github.io-revision\oposicion\temario\fuentes\3A21\graficos/brouwer.png" id="75" name="Picture"/>
+                    <pic:cNvPr descr="C:\Users\vgutierrez\Documents\src\victorgutierrezmarcos.github.io-revision\oposicion\temario\fuentes\3A21\graficos/brouwer.png" id="74" name="Picture"/>
                     <pic:cNvPicPr>
                       <a:picLocks noChangeArrowheads="1" noChangeAspect="1"/>
                     </pic:cNvPicPr>
                   </pic:nvPicPr>
                   <pic:blipFill>
-                    <a:blip r:embed="rId73"/>
+                    <a:blip r:embed="rId72"/>
                     <a:stretch>
                       <a:fillRect/>
                     </a:stretch>
@@ -16337,7 +16257,7 @@
         </w:drawing>
       </w:r>
     </w:p>
-    <w:bookmarkEnd w:id="76"/>
+    <w:bookmarkEnd w:id="75"/>
     <w:p>
       <w:pPr>
         <w:pStyle w:val="Piedeimagen"/>
@@ -16375,8 +16295,8 @@
         <w:t xml:space="preserve">.</w:t>
       </w:r>
     </w:p>
-    <w:bookmarkEnd w:id="77"/>
-    <w:bookmarkStart w:id="79" w:name="ii-desarrollo"/>
+    <w:bookmarkEnd w:id="76"/>
+    <w:bookmarkStart w:id="78" w:name="ii-desarrollo"/>
     <w:p>
       <w:pPr>
         <w:pStyle w:val="Heading5"/>
@@ -16975,7 +16895,7 @@
         <w:rPr>
           <w:rStyle w:val="FootnoteReference"/>
         </w:rPr>
-        <w:footnoteReference w:id="78"/>
+        <w:footnoteReference w:id="77"/>
       </w:r>
       <w:r>
         <w:t xml:space="preserve"> </w:t>
@@ -17139,8 +17059,8 @@
         <w:t xml:space="preserve">, los de precio positivo tienen exceso de demanda nulo (bienes económicos): se cumple (11) (demostración en el anexo B).</w:t>
       </w:r>
     </w:p>
-    <w:bookmarkEnd w:id="79"/>
-    <w:bookmarkStart w:id="80" w:name="iii-implicaciones"/>
+    <w:bookmarkEnd w:id="78"/>
+    <w:bookmarkStart w:id="79" w:name="iii-implicaciones"/>
     <w:p>
       <w:pPr>
         <w:pStyle w:val="Heading5"/>
@@ -17197,9 +17117,9 @@
         <w:t xml:space="preserve">: dice que hay un equilibrio, no cómo encontrarlo ni si el tanteo lleva a él.</w:t>
       </w:r>
     </w:p>
+    <w:bookmarkEnd w:id="79"/>
     <w:bookmarkEnd w:id="80"/>
-    <w:bookmarkEnd w:id="81"/>
-    <w:bookmarkStart w:id="84" w:name="c-valoración"/>
+    <w:bookmarkStart w:id="83" w:name="c-valoración"/>
     <w:p>
       <w:pPr>
         <w:pStyle w:val="Heading4"/>
@@ -17287,7 +17207,7 @@
       <w:r>
         <w:t xml:space="preserve">, introducción a los teoremas de punto fijo y a la existencia de equilibrios en economía (</w:t>
       </w:r>
-      <w:hyperlink r:id="rId82">
+      <w:hyperlink r:id="rId81">
         <w:r>
           <w:rPr>
             <w:rStyle w:val="Hyperlink"/>
@@ -17357,7 +17277,7 @@
       <w:r>
         <w:t xml:space="preserve">(</w:t>
       </w:r>
-      <w:hyperlink r:id="rId83">
+      <w:hyperlink r:id="rId82">
         <w:r>
           <w:rPr>
             <w:rStyle w:val="Hyperlink"/>
@@ -17369,9 +17289,9 @@
         <w:t xml:space="preserve">).</w:t>
       </w:r>
     </w:p>
+    <w:bookmarkEnd w:id="83"/>
     <w:bookmarkEnd w:id="84"/>
-    <w:bookmarkEnd w:id="85"/>
-    <w:bookmarkStart w:id="98" w:name="unicidad"/>
+    <w:bookmarkStart w:id="97" w:name="unicidad"/>
     <w:p>
       <w:pPr>
         <w:pStyle w:val="Heading3"/>
@@ -17394,7 +17314,7 @@
         <w:t xml:space="preserve">Una vez que sabemos que el equilibrio existe, la pregunta siguiente es cuántos hay.</w:t>
       </w:r>
     </w:p>
-    <w:bookmarkStart w:id="91" w:name="a-idea-1"/>
+    <w:bookmarkStart w:id="90" w:name="a-idea-1"/>
     <w:p>
       <w:pPr>
         <w:pStyle w:val="Heading4"/>
@@ -17533,7 +17453,7 @@
         <w:rPr>
           <w:rStyle w:val="FootnoteReference"/>
         </w:rPr>
-        <w:footnoteReference w:id="86"/>
+        <w:footnoteReference w:id="85"/>
       </w:r>
       <w:r>
         <w:t xml:space="preserve"> </w:t>
@@ -17728,7 +17648,7 @@
         <w:t xml:space="preserve">hacen falta supuestos adicionales: es el modelo que sigue.</w:t>
       </w:r>
     </w:p>
-    <w:bookmarkStart w:id="90" w:name="fig:equilibrios-multiples"/>
+    <w:bookmarkStart w:id="89" w:name="fig:equilibrios-multiples"/>
     <w:p>
       <w:pPr>
         <w:pStyle w:val="ImageCaption"/>
@@ -17766,18 +17686,18 @@
           <wp:inline>
             <wp:extent cx="3067368" cy="2626988"/>
             <wp:effectExtent b="0" l="0" r="0" t="0"/>
-            <wp:docPr descr="" title="" id="88" name="Picture"/>
+            <wp:docPr descr="" title="" id="87" name="Picture"/>
             <a:graphic>
               <a:graphicData uri="http://schemas.openxmlformats.org/drawingml/2006/picture">
                 <pic:pic>
                   <pic:nvPicPr>
-                    <pic:cNvPr descr="C:\Users\vgutierrez\Documents\src\victorgutierrezmarcos.github.io-revision\oposicion\temario\fuentes\3A21\graficos/equilibrios-multiples.png" id="89" name="Picture"/>
+                    <pic:cNvPr descr="C:\Users\vgutierrez\Documents\src\victorgutierrezmarcos.github.io-revision\oposicion\temario\fuentes\3A21\graficos/equilibrios-multiples.png" id="88" name="Picture"/>
                     <pic:cNvPicPr>
                       <a:picLocks noChangeArrowheads="1" noChangeAspect="1"/>
                     </pic:cNvPicPr>
                   </pic:nvPicPr>
                   <pic:blipFill>
-                    <a:blip r:embed="rId87"/>
+                    <a:blip r:embed="rId86"/>
                     <a:stretch>
                       <a:fillRect/>
                     </a:stretch>
@@ -17804,7 +17724,7 @@
         </w:drawing>
       </w:r>
     </w:p>
-    <w:bookmarkEnd w:id="90"/>
+    <w:bookmarkEnd w:id="89"/>
     <w:p>
       <w:pPr>
         <w:pStyle w:val="Piedeimagen"/>
@@ -17872,8 +17792,8 @@
         <w:t xml:space="preserve">.</w:t>
       </w:r>
     </w:p>
-    <w:bookmarkEnd w:id="91"/>
-    <w:bookmarkStart w:id="95" w:name="b-modelo-1"/>
+    <w:bookmarkEnd w:id="90"/>
+    <w:bookmarkStart w:id="94" w:name="b-modelo-1"/>
     <w:p>
       <w:pPr>
         <w:pStyle w:val="Heading4"/>
@@ -17882,7 +17802,7 @@
         <w:t xml:space="preserve">b) Modelo</w:t>
       </w:r>
     </w:p>
-    <w:bookmarkStart w:id="92" w:name="i-supuestos-1"/>
+    <w:bookmarkStart w:id="91" w:name="i-supuestos-1"/>
     <w:p>
       <w:pPr>
         <w:pStyle w:val="Heading5"/>
@@ -18189,8 +18109,8 @@
         <w:t xml:space="preserve">: la demanda de mercado se comporta como la de un único consumidor coherente, que nunca elige una cesta pudiendo pagar otra y la otra pudiendo pagar la primera.</w:t>
       </w:r>
     </w:p>
-    <w:bookmarkEnd w:id="92"/>
-    <w:bookmarkStart w:id="93" w:name="ii-desarrollo-1"/>
+    <w:bookmarkEnd w:id="91"/>
+    <w:bookmarkStart w:id="92" w:name="ii-desarrollo-1"/>
     <w:p>
       <w:pPr>
         <w:pStyle w:val="Heading5"/>
@@ -19126,8 +19046,8 @@
         <w:t xml:space="preserve">: las 2, paso a paso y por reducción al absurdo, están en el anexo B.2.</w:t>
       </w:r>
     </w:p>
-    <w:bookmarkEnd w:id="93"/>
-    <w:bookmarkStart w:id="94" w:name="iii-implicaciones-1"/>
+    <w:bookmarkEnd w:id="92"/>
+    <w:bookmarkStart w:id="93" w:name="iii-implicaciones-1"/>
     <w:p>
       <w:pPr>
         <w:pStyle w:val="Heading5"/>
@@ -19249,9 +19169,9 @@
         <w:t xml:space="preserve">: la condición (16) es la misma que asegura que el tanteo converge (II.1.3).</w:t>
       </w:r>
     </w:p>
+    <w:bookmarkEnd w:id="93"/>
     <w:bookmarkEnd w:id="94"/>
-    <w:bookmarkEnd w:id="95"/>
-    <w:bookmarkStart w:id="97" w:name="c-valoración-1"/>
+    <w:bookmarkStart w:id="96" w:name="c-valoración-1"/>
     <w:p>
       <w:pPr>
         <w:pStyle w:val="Heading4"/>
@@ -19559,7 +19479,7 @@
         <w:rPr>
           <w:rStyle w:val="FootnoteReference"/>
         </w:rPr>
-        <w:footnoteReference w:id="96"/>
+        <w:footnoteReference w:id="95"/>
       </w:r>
     </w:p>
     <w:p>
@@ -19657,9 +19577,9 @@
         <w:t xml:space="preserve">. Es lo que hace tan difícil la pregunta siguiente.</w:t>
       </w:r>
     </w:p>
+    <w:bookmarkEnd w:id="96"/>
     <w:bookmarkEnd w:id="97"/>
-    <w:bookmarkEnd w:id="98"/>
-    <w:bookmarkStart w:id="105" w:name="estabilidad"/>
+    <w:bookmarkStart w:id="104" w:name="estabilidad"/>
     <w:p>
       <w:pPr>
         <w:pStyle w:val="Heading3"/>
@@ -19682,7 +19602,7 @@
         <w:t xml:space="preserve">Saber que el equilibrio existe, e incluso que es único, no basta: falta saber si la economía llega a él.</w:t>
       </w:r>
     </w:p>
-    <w:bookmarkStart w:id="99" w:name="a-idea-2"/>
+    <w:bookmarkStart w:id="98" w:name="a-idea-2"/>
     <w:p>
       <w:pPr>
         <w:pStyle w:val="Heading4"/>
@@ -19978,8 +19898,8 @@
         <w:t xml:space="preserve">: un cambio en el precio de un bien desplaza los excesos de demanda de todos los demás, que mueven a su vez sus precios y vuelven a afectar al primero. No basta con mirar la pendiente de cada mercado por separado: hay que estudiar el sistema entero a la vez.</w:t>
       </w:r>
     </w:p>
-    <w:bookmarkEnd w:id="99"/>
-    <w:bookmarkStart w:id="103" w:name="b-modelo-2"/>
+    <w:bookmarkEnd w:id="98"/>
+    <w:bookmarkStart w:id="102" w:name="b-modelo-2"/>
     <w:p>
       <w:pPr>
         <w:pStyle w:val="Heading4"/>
@@ -19988,7 +19908,7 @@
         <w:t xml:space="preserve">b) Modelo</w:t>
       </w:r>
     </w:p>
-    <w:bookmarkStart w:id="100" w:name="i-supuestos-2"/>
+    <w:bookmarkStart w:id="99" w:name="i-supuestos-2"/>
     <w:p>
       <w:pPr>
         <w:pStyle w:val="Heading5"/>
@@ -20355,8 +20275,8 @@
         <w:t xml:space="preserve">: con las propiedades de la existencia y la condición (16) de la unicidad, que se cumple, por ejemplo, si todos los bienes son sustitutivos brutos.</w:t>
       </w:r>
     </w:p>
-    <w:bookmarkEnd w:id="100"/>
-    <w:bookmarkStart w:id="101" w:name="ii-desarrollo-2"/>
+    <w:bookmarkEnd w:id="99"/>
+    <w:bookmarkStart w:id="100" w:name="ii-desarrollo-2"/>
     <w:p>
       <w:pPr>
         <w:pStyle w:val="Heading5"/>
@@ -21344,8 +21264,8 @@
         <w:t xml:space="preserve">) atraen los precios y son estables; los otros los repelen y son inestables. Con varios equilibrios, estables e inestables se alternan.</w:t>
       </w:r>
     </w:p>
-    <w:bookmarkEnd w:id="101"/>
-    <w:bookmarkStart w:id="102" w:name="iii-implicaciones-2"/>
+    <w:bookmarkEnd w:id="100"/>
+    <w:bookmarkStart w:id="101" w:name="iii-implicaciones-2"/>
     <w:p>
       <w:pPr>
         <w:pStyle w:val="Heading5"/>
@@ -21622,9 +21542,9 @@
         <w:t xml:space="preserve">es decreciente y el único corte es de arriba abajo: el único equilibrio es estable.</w:t>
       </w:r>
     </w:p>
+    <w:bookmarkEnd w:id="101"/>
     <w:bookmarkEnd w:id="102"/>
-    <w:bookmarkEnd w:id="103"/>
-    <w:bookmarkStart w:id="104" w:name="c-valoración-2"/>
+    <w:bookmarkStart w:id="103" w:name="c-valoración-2"/>
     <w:p>
       <w:pPr>
         <w:pStyle w:val="Heading4"/>
@@ -21788,10 +21708,10 @@
         <w:t xml:space="preserve">.</w:t>
       </w:r>
     </w:p>
+    <w:bookmarkEnd w:id="103"/>
     <w:bookmarkEnd w:id="104"/>
     <w:bookmarkEnd w:id="105"/>
-    <w:bookmarkEnd w:id="106"/>
-    <w:bookmarkStart w:id="119" w:name="X4944875e55b06db14e46a61122fe3618dd158cb"/>
+    <w:bookmarkStart w:id="118" w:name="X4944875e55b06db14e46a61122fe3618dd158cb"/>
     <w:p>
       <w:pPr>
         <w:pStyle w:val="Heading2"/>
@@ -21814,7 +21734,7 @@
         <w:t xml:space="preserve">Una vez estudiado qué dice el equilibrio como descripción de la economía (análisis positivo), pasamos a preguntarnos si es bueno (análisis normativo). Para ello hace falta, primero, un criterio con el que juzgar las asignaciones.</w:t>
       </w:r>
     </w:p>
-    <w:bookmarkStart w:id="109" w:name="optimalidad-de-pareto"/>
+    <w:bookmarkStart w:id="108" w:name="optimalidad-de-pareto"/>
     <w:p>
       <w:pPr>
         <w:pStyle w:val="Heading3"/>
@@ -21888,7 +21808,7 @@
         <w:rPr>
           <w:rStyle w:val="FootnoteReference"/>
         </w:rPr>
-        <w:footnoteReference w:id="107"/>
+        <w:footnoteReference w:id="106"/>
       </w:r>
       <w:r>
         <w:t xml:space="preserve"> </w:t>
@@ -21962,7 +21882,7 @@
         <w:rPr>
           <w:rStyle w:val="FootnoteReference"/>
         </w:rPr>
-        <w:footnoteReference w:id="108"/>
+        <w:footnoteReference w:id="107"/>
       </w:r>
       <w:r>
         <w:t xml:space="preserve"> </w:t>
@@ -22136,8 +22056,8 @@
         <w:t xml:space="preserve">(gráfico 6).</w:t>
       </w:r>
     </w:p>
-    <w:bookmarkEnd w:id="109"/>
-    <w:bookmarkStart w:id="118" w:name="Xf6b71314e4bd9502f3b430192fabe484e5fec32"/>
+    <w:bookmarkEnd w:id="108"/>
+    <w:bookmarkStart w:id="117" w:name="Xf6b71314e4bd9502f3b430192fabe484e5fec32"/>
     <w:p>
       <w:pPr>
         <w:pStyle w:val="Heading3"/>
@@ -22375,7 +22295,7 @@
         <w:t xml:space="preserve">.</w:t>
       </w:r>
     </w:p>
-    <w:bookmarkStart w:id="112" w:name="X8d4837e936b22851e30f91a44f2ca81d1012e14"/>
+    <w:bookmarkStart w:id="111" w:name="X8d4837e936b22851e30f91a44f2ca81d1012e14"/>
     <w:p>
       <w:pPr>
         <w:pStyle w:val="Heading4"/>
@@ -22495,7 +22415,7 @@
         <w:rPr>
           <w:rStyle w:val="FootnoteReference"/>
         </w:rPr>
-        <w:footnoteReference w:id="110"/>
+        <w:footnoteReference w:id="109"/>
       </w:r>
     </w:p>
     <w:p>
@@ -22607,11 +22527,11 @@
         <w:rPr>
           <w:rStyle w:val="FootnoteReference"/>
         </w:rPr>
-        <w:footnoteReference w:id="111"/>
-      </w:r>
-    </w:p>
-    <w:bookmarkEnd w:id="112"/>
-    <w:bookmarkStart w:id="117" w:name="X7f8aff33acd132d4bfed736052763b8221204bc"/>
+        <w:footnoteReference w:id="110"/>
+      </w:r>
+    </w:p>
+    <w:bookmarkEnd w:id="111"/>
+    <w:bookmarkStart w:id="116" w:name="X7f8aff33acd132d4bfed736052763b8221204bc"/>
     <w:p>
       <w:pPr>
         <w:pStyle w:val="Heading4"/>
@@ -22869,7 +22789,7 @@
         <w:t xml:space="preserve">: cómo hacer esas transferencias. Las de suma fija que dependen de las características de cada uno no son factibles (la información es privada) y los impuestos reales distorsionan, de modo que reaparece el dilema entre equidad y eficiencia.</w:t>
       </w:r>
     </w:p>
-    <w:bookmarkStart w:id="116" w:name="fig:caja-intercambio-teoremas"/>
+    <w:bookmarkStart w:id="115" w:name="fig:caja-intercambio-teoremas"/>
     <w:p>
       <w:pPr>
         <w:pStyle w:val="ImageCaption"/>
@@ -22987,18 +22907,18 @@
           <wp:inline>
             <wp:extent cx="4476750" cy="3187759"/>
             <wp:effectExtent b="0" l="0" r="0" t="0"/>
-            <wp:docPr descr="" title="" id="114" name="Picture"/>
+            <wp:docPr descr="" title="" id="113" name="Picture"/>
             <a:graphic>
               <a:graphicData uri="http://schemas.openxmlformats.org/drawingml/2006/picture">
                 <pic:pic>
                   <pic:nvPicPr>
-                    <pic:cNvPr descr="C:\Users\vgutierrez\Documents\src\victorgutierrezmarcos.github.io-revision\oposicion\temario\fuentes\3A21\graficos/caja-intercambio-teoremas.png" id="115" name="Picture"/>
+                    <pic:cNvPr descr="C:\Users\vgutierrez\Documents\src\victorgutierrezmarcos.github.io-revision\oposicion\temario\fuentes\3A21\graficos/caja-intercambio-teoremas.png" id="114" name="Picture"/>
                     <pic:cNvPicPr>
                       <a:picLocks noChangeArrowheads="1" noChangeAspect="1"/>
                     </pic:cNvPicPr>
                   </pic:nvPicPr>
                   <pic:blipFill>
-                    <a:blip r:embed="rId113"/>
+                    <a:blip r:embed="rId112"/>
                     <a:stretch>
                       <a:fillRect/>
                     </a:stretch>
@@ -23025,7 +22945,7 @@
         </w:drawing>
       </w:r>
     </w:p>
-    <w:bookmarkEnd w:id="116"/>
+    <w:bookmarkEnd w:id="115"/>
     <w:p>
       <w:pPr>
         <w:pStyle w:val="Piedeimagen"/>
@@ -23309,11 +23229,11 @@
         <w:t xml:space="preserve">. En el cante, cada teorema se nombra completo la primera vez y después con sus siglas.</w:t>
       </w:r>
     </w:p>
+    <w:bookmarkEnd w:id="116"/>
     <w:bookmarkEnd w:id="117"/>
     <w:bookmarkEnd w:id="118"/>
     <w:bookmarkEnd w:id="119"/>
-    <w:bookmarkEnd w:id="120"/>
-    <w:bookmarkStart w:id="169" w:name="Xd3d80b8c81cad0f6d140864381d502b40ebce4e"/>
+    <w:bookmarkStart w:id="168" w:name="Xd3d80b8c81cad0f6d140864381d502b40ebce4e"/>
     <w:p>
       <w:pPr>
         <w:pStyle w:val="Heading1"/>
@@ -23561,7 +23481,7 @@
         <w:t xml:space="preserve">y un ejemplo.</w:t>
       </w:r>
     </w:p>
-    <w:bookmarkStart w:id="132" w:name="teoría-del-intercambio-de-edgeworth"/>
+    <w:bookmarkStart w:id="131" w:name="teoría-del-intercambio-de-edgeworth"/>
     <w:p>
       <w:pPr>
         <w:pStyle w:val="Heading2"/>
@@ -23593,7 +23513,7 @@
         <w:t xml:space="preserve">Empezamos por el supuesto más irreal del bloque I: el subastador que anuncia los precios.</w:t>
       </w:r>
     </w:p>
-    <w:bookmarkStart w:id="121" w:name="a-idea-3"/>
+    <w:bookmarkStart w:id="120" w:name="a-idea-3"/>
     <w:p>
       <w:pPr>
         <w:pStyle w:val="Heading4"/>
@@ -23664,8 +23584,8 @@
         <w:t xml:space="preserve">) hasta que nadie quiera cambiar.</w:t>
       </w:r>
     </w:p>
-    <w:bookmarkEnd w:id="121"/>
-    <w:bookmarkStart w:id="130" w:name="b-modelo-3"/>
+    <w:bookmarkEnd w:id="120"/>
+    <w:bookmarkStart w:id="129" w:name="b-modelo-3"/>
     <w:p>
       <w:pPr>
         <w:pStyle w:val="Heading4"/>
@@ -23674,7 +23594,7 @@
         <w:t xml:space="preserve">b) Modelo</w:t>
       </w:r>
     </w:p>
-    <w:bookmarkStart w:id="122" w:name="i-supuestos-3"/>
+    <w:bookmarkStart w:id="121" w:name="i-supuestos-3"/>
     <w:p>
       <w:pPr>
         <w:pStyle w:val="Heading5"/>
@@ -23712,8 +23632,8 @@
         <w:t xml:space="preserve">, en la caja de intercambio de I.3 (gráfico 7), que negocian sin precios dados.</w:t>
       </w:r>
     </w:p>
-    <w:bookmarkEnd w:id="122"/>
-    <w:bookmarkStart w:id="127" w:name="ii-desarrollo-3"/>
+    <w:bookmarkEnd w:id="121"/>
+    <w:bookmarkStart w:id="126" w:name="ii-desarrollo-3"/>
     <w:p>
       <w:pPr>
         <w:pStyle w:val="Heading5"/>
@@ -23804,7 +23724,7 @@
         <w:t xml:space="preserve">: si no estuviera en la curva de contrato, los 2 podrían mejorar.</w:t>
       </w:r>
     </w:p>
-    <w:bookmarkStart w:id="126" w:name="fig:caja-intercambio-nucleo"/>
+    <w:bookmarkStart w:id="125" w:name="fig:caja-intercambio-nucleo"/>
     <w:p>
       <w:pPr>
         <w:pStyle w:val="ImageCaption"/>
@@ -23880,18 +23800,18 @@
           <wp:inline>
             <wp:extent cx="3700780" cy="2635214"/>
             <wp:effectExtent b="0" l="0" r="0" t="0"/>
-            <wp:docPr descr="" title="" id="124" name="Picture"/>
+            <wp:docPr descr="" title="" id="123" name="Picture"/>
             <a:graphic>
               <a:graphicData uri="http://schemas.openxmlformats.org/drawingml/2006/picture">
                 <pic:pic>
                   <pic:nvPicPr>
-                    <pic:cNvPr descr="C:\Users\vgutierrez\Documents\src\victorgutierrezmarcos.github.io-revision\oposicion\temario\fuentes\3A21\graficos/caja-intercambio-nucleo.png" id="125" name="Picture"/>
+                    <pic:cNvPr descr="C:\Users\vgutierrez\Documents\src\victorgutierrezmarcos.github.io-revision\oposicion\temario\fuentes\3A21\graficos/caja-intercambio-nucleo.png" id="124" name="Picture"/>
                     <pic:cNvPicPr>
                       <a:picLocks noChangeArrowheads="1" noChangeAspect="1"/>
                     </pic:cNvPicPr>
                   </pic:nvPicPr>
                   <pic:blipFill>
-                    <a:blip r:embed="rId123"/>
+                    <a:blip r:embed="rId122"/>
                     <a:stretch>
                       <a:fillRect/>
                     </a:stretch>
@@ -23918,7 +23838,7 @@
         </w:drawing>
       </w:r>
     </w:p>
-    <w:bookmarkEnd w:id="126"/>
+    <w:bookmarkEnd w:id="125"/>
     <w:p>
       <w:pPr>
         <w:pStyle w:val="Piedeimagen"/>
@@ -24030,8 +23950,8 @@
         <w:t xml:space="preserve">.</w:t>
       </w:r>
     </w:p>
-    <w:bookmarkEnd w:id="127"/>
-    <w:bookmarkStart w:id="129" w:name="iii-implicaciones-3"/>
+    <w:bookmarkEnd w:id="126"/>
+    <w:bookmarkStart w:id="128" w:name="iii-implicaciones-3"/>
     <w:p>
       <w:pPr>
         <w:pStyle w:val="Heading5"/>
@@ -24202,12 +24122,12 @@
         <w:rPr>
           <w:rStyle w:val="FootnoteReference"/>
         </w:rPr>
-        <w:footnoteReference w:id="128"/>
-      </w:r>
-    </w:p>
+        <w:footnoteReference w:id="127"/>
+      </w:r>
+    </w:p>
+    <w:bookmarkEnd w:id="128"/>
     <w:bookmarkEnd w:id="129"/>
-    <w:bookmarkEnd w:id="130"/>
-    <w:bookmarkStart w:id="131" w:name="c-valoración-3"/>
+    <w:bookmarkStart w:id="130" w:name="c-valoración-3"/>
     <w:p>
       <w:pPr>
         <w:pStyle w:val="Heading4"/>
@@ -24236,9 +24156,9 @@
         <w:t xml:space="preserve">conjetura que, al aumentar el número de agentes, el tramo se estrecha hasta el equilibrio competitivo. Es el punto de partida del enfoque del núcleo.</w:t>
       </w:r>
     </w:p>
+    <w:bookmarkEnd w:id="130"/>
     <w:bookmarkEnd w:id="131"/>
-    <w:bookmarkEnd w:id="132"/>
-    <w:bookmarkStart w:id="147" w:name="enfoque-del-núcleo-debreu-y-scarf-1963"/>
+    <w:bookmarkStart w:id="146" w:name="enfoque-del-núcleo-debreu-y-scarf-1963"/>
     <w:p>
       <w:pPr>
         <w:pStyle w:val="Heading2"/>
@@ -24285,7 +24205,7 @@
         <w:t xml:space="preserve">Una vez visto que con 2 agentes la negociación deja el resultado indeterminado, pasamos a preguntarnos qué ocurre cuando negocian muchos: es el enfoque del núcleo.</w:t>
       </w:r>
     </w:p>
-    <w:bookmarkStart w:id="140" w:name="el-núcleo-de-una-economía"/>
+    <w:bookmarkStart w:id="139" w:name="el-núcleo-de-una-economía"/>
     <w:p>
       <w:pPr>
         <w:pStyle w:val="Heading3"/>
@@ -24300,7 +24220,7 @@
         <w:t xml:space="preserve">El núcleo de una economía</w:t>
       </w:r>
     </w:p>
-    <w:bookmarkStart w:id="133" w:name="a-idea-4"/>
+    <w:bookmarkStart w:id="132" w:name="a-idea-4"/>
     <w:p>
       <w:pPr>
         <w:pStyle w:val="Heading4"/>
@@ -24429,8 +24349,8 @@
         <w:t xml:space="preserve">, no utilidad: en una economía de intercambio la utilidad no es transferible.</w:t>
       </w:r>
     </w:p>
-    <w:bookmarkEnd w:id="133"/>
-    <w:bookmarkStart w:id="137" w:name="b-modelo-4"/>
+    <w:bookmarkEnd w:id="132"/>
+    <w:bookmarkStart w:id="136" w:name="b-modelo-4"/>
     <w:p>
       <w:pPr>
         <w:pStyle w:val="Heading4"/>
@@ -24439,7 +24359,7 @@
         <w:t xml:space="preserve">b) Modelo</w:t>
       </w:r>
     </w:p>
-    <w:bookmarkStart w:id="134" w:name="i-supuestos-4"/>
+    <w:bookmarkStart w:id="133" w:name="i-supuestos-4"/>
     <w:p>
       <w:pPr>
         <w:pStyle w:val="Heading5"/>
@@ -24543,8 +24463,8 @@
         <w:t xml:space="preserve">puede repartirse sus propias dotaciones; los acuerdos son vinculantes y formar coaliciones no cuesta nada.</w:t>
       </w:r>
     </w:p>
-    <w:bookmarkEnd w:id="134"/>
-    <w:bookmarkStart w:id="135" w:name="ii-desarrollo-4"/>
+    <w:bookmarkEnd w:id="133"/>
+    <w:bookmarkStart w:id="134" w:name="ii-desarrollo-4"/>
     <w:p>
       <w:pPr>
         <w:pStyle w:val="Heading5"/>
@@ -25048,8 +24968,8 @@
         <w:t xml:space="preserve">.</w:t>
       </w:r>
     </w:p>
-    <w:bookmarkEnd w:id="135"/>
-    <w:bookmarkStart w:id="136" w:name="iii-implicaciones-4"/>
+    <w:bookmarkEnd w:id="134"/>
+    <w:bookmarkStart w:id="135" w:name="iii-implicaciones-4"/>
     <w:p>
       <w:pPr>
         <w:pStyle w:val="Heading5"/>
@@ -25288,9 +25208,9 @@
         <w:t xml:space="preserve">: la precio-aceptación deja de ser un supuesto y pasa a ser un resultado: en una economía grande ningún grupo puede hacer nada mejor que lo que le da el mercado. No solo los precios son endógenos, sino también el hecho mismo de que los haya.</w:t>
       </w:r>
     </w:p>
+    <w:bookmarkEnd w:id="135"/>
     <w:bookmarkEnd w:id="136"/>
-    <w:bookmarkEnd w:id="137"/>
-    <w:bookmarkStart w:id="138" w:name="c-extensiones"/>
+    <w:bookmarkStart w:id="137" w:name="c-extensiones"/>
     <w:p>
       <w:pPr>
         <w:pStyle w:val="Heading4"/>
@@ -25374,8 +25294,8 @@
         <w:t xml:space="preserve">.</w:t>
       </w:r>
     </w:p>
-    <w:bookmarkEnd w:id="138"/>
-    <w:bookmarkStart w:id="139" w:name="d-valoración"/>
+    <w:bookmarkEnd w:id="137"/>
+    <w:bookmarkStart w:id="138" w:name="d-valoración"/>
     <w:p>
       <w:pPr>
         <w:pStyle w:val="Heading4"/>
@@ -25410,9 +25330,9 @@
         <w:t xml:space="preserve">sigue ahí. Y el núcleo no dice cómo se llega a él: es un concepto de equilibrio, no un proceso. Con pocos agentes, además, cada uno tiene incentivos a influir en los precios, que es lo que estudia el apartado siguiente.</w:t>
       </w:r>
     </w:p>
+    <w:bookmarkEnd w:id="138"/>
     <w:bookmarkEnd w:id="139"/>
-    <w:bookmarkEnd w:id="140"/>
-    <w:bookmarkStart w:id="145" w:name="comportamiento-estratégico"/>
+    <w:bookmarkStart w:id="144" w:name="comportamiento-estratégico"/>
     <w:p>
       <w:pPr>
         <w:pStyle w:val="Heading3"/>
@@ -26083,7 +26003,7 @@
         <w:t xml:space="preserve">.</w:t>
       </w:r>
     </w:p>
-    <w:bookmarkStart w:id="144" w:name="fig:monopolio-intercambio"/>
+    <w:bookmarkStart w:id="143" w:name="fig:monopolio-intercambio"/>
     <w:p>
       <w:pPr>
         <w:pStyle w:val="ImageCaption"/>
@@ -26143,18 +26063,18 @@
           <wp:inline>
             <wp:extent cx="3282950" cy="2337690"/>
             <wp:effectExtent b="0" l="0" r="0" t="0"/>
-            <wp:docPr descr="" title="" id="142" name="Picture"/>
+            <wp:docPr descr="" title="" id="141" name="Picture"/>
             <a:graphic>
               <a:graphicData uri="http://schemas.openxmlformats.org/drawingml/2006/picture">
                 <pic:pic>
                   <pic:nvPicPr>
-                    <pic:cNvPr descr="C:\Users\vgutierrez\Documents\src\victorgutierrezmarcos.github.io-revision\oposicion\temario\fuentes\3A21\graficos/monopolio-intercambio.png" id="143" name="Picture"/>
+                    <pic:cNvPr descr="C:\Users\vgutierrez\Documents\src\victorgutierrezmarcos.github.io-revision\oposicion\temario\fuentes\3A21\graficos/monopolio-intercambio.png" id="142" name="Picture"/>
                     <pic:cNvPicPr>
                       <a:picLocks noChangeArrowheads="1" noChangeAspect="1"/>
                     </pic:cNvPicPr>
                   </pic:nvPicPr>
                   <pic:blipFill>
-                    <a:blip r:embed="rId141"/>
+                    <a:blip r:embed="rId140"/>
                     <a:stretch>
                       <a:fillRect/>
                     </a:stretch>
@@ -26181,7 +26101,7 @@
         </w:drawing>
       </w:r>
     </w:p>
-    <w:bookmarkEnd w:id="144"/>
+    <w:bookmarkEnd w:id="143"/>
     <w:p>
       <w:pPr>
         <w:pStyle w:val="Piedeimagen"/>
@@ -26481,8 +26401,8 @@
         <w:t xml:space="preserve">responde que los precios no solo resuelven un sistema de ecuaciones: transmiten un conocimiento disperso, local y en parte tácito que ningún planificador puede reunir.</w:t>
       </w:r>
     </w:p>
-    <w:bookmarkEnd w:id="145"/>
-    <w:bookmarkStart w:id="146" w:name="no-convexidades-y-equilibrios-múltiples"/>
+    <w:bookmarkEnd w:id="144"/>
+    <w:bookmarkStart w:id="145" w:name="no-convexidades-y-equilibrios-múltiples"/>
     <w:p>
       <w:pPr>
         <w:pStyle w:val="Heading3"/>
@@ -27371,9 +27291,9 @@
         <w:t xml:space="preserve">.</w:t>
       </w:r>
     </w:p>
+    <w:bookmarkEnd w:id="145"/>
     <w:bookmarkEnd w:id="146"/>
-    <w:bookmarkEnd w:id="147"/>
-    <w:bookmarkStart w:id="155" w:name="Xc8f02bb6c0fa2f03d2aab3898ee4cd8b92f363f"/>
+    <w:bookmarkStart w:id="154" w:name="Xc8f02bb6c0fa2f03d2aab3898ee4cd8b92f363f"/>
     <w:p>
       <w:pPr>
         <w:pStyle w:val="Heading2"/>
@@ -27405,7 +27325,7 @@
         <w:t xml:space="preserve">Hasta aquí el modelo funciona sin dinero; pasamos ahora a preguntarnos si puede tenerlo y qué cambia si lo tiene.</w:t>
       </w:r>
     </w:p>
-    <w:bookmarkStart w:id="148" w:name="a-idea-5"/>
+    <w:bookmarkStart w:id="147" w:name="a-idea-5"/>
     <w:p>
       <w:pPr>
         <w:pStyle w:val="Heading4"/>
@@ -27900,8 +27820,8 @@
         <w:t xml:space="preserve">muestra que la primera es insostenible, pero que la segunda se mantiene.</w:t>
       </w:r>
     </w:p>
-    <w:bookmarkEnd w:id="148"/>
-    <w:bookmarkStart w:id="153" w:name="b-modelo-5"/>
+    <w:bookmarkEnd w:id="147"/>
+    <w:bookmarkStart w:id="152" w:name="b-modelo-5"/>
     <w:p>
       <w:pPr>
         <w:pStyle w:val="Heading4"/>
@@ -27910,7 +27830,7 @@
         <w:t xml:space="preserve">b) Modelo</w:t>
       </w:r>
     </w:p>
-    <w:bookmarkStart w:id="149" w:name="i-supuestos-5"/>
+    <w:bookmarkStart w:id="148" w:name="i-supuestos-5"/>
     <w:p>
       <w:pPr>
         <w:pStyle w:val="Heading5"/>
@@ -28186,8 +28106,8 @@
         <w:t xml:space="preserve">al final del periodo.</w:t>
       </w:r>
     </w:p>
-    <w:bookmarkEnd w:id="149"/>
-    <w:bookmarkStart w:id="151" w:name="ii-desarrollo-5"/>
+    <w:bookmarkEnd w:id="148"/>
+    <w:bookmarkStart w:id="150" w:name="ii-desarrollo-5"/>
     <w:p>
       <w:pPr>
         <w:pStyle w:val="Heading5"/>
@@ -28800,7 +28720,7 @@
         <w:rPr>
           <w:rStyle w:val="FootnoteReference"/>
         </w:rPr>
-        <w:footnoteReference w:id="150"/>
+        <w:footnoteReference w:id="149"/>
       </w:r>
     </w:p>
     <w:p>
@@ -29939,8 +29859,8 @@
         <w:t xml:space="preserve">.</w:t>
       </w:r>
     </w:p>
-    <w:bookmarkEnd w:id="151"/>
-    <w:bookmarkStart w:id="152" w:name="iii-implicaciones-5"/>
+    <w:bookmarkEnd w:id="150"/>
+    <w:bookmarkStart w:id="151" w:name="iii-implicaciones-5"/>
     <w:p>
       <w:pPr>
         <w:pStyle w:val="Heading5"/>
@@ -30297,9 +30217,9 @@
         <w:t xml:space="preserve">.</w:t>
       </w:r>
     </w:p>
+    <w:bookmarkEnd w:id="151"/>
     <w:bookmarkEnd w:id="152"/>
-    <w:bookmarkEnd w:id="153"/>
-    <w:bookmarkStart w:id="154" w:name="c-valoración-4"/>
+    <w:bookmarkStart w:id="153" w:name="c-valoración-4"/>
     <w:p>
       <w:pPr>
         <w:pStyle w:val="Heading4"/>
@@ -30752,9 +30672,9 @@
         <w:t xml:space="preserve">.</w:t>
       </w:r>
     </w:p>
+    <w:bookmarkEnd w:id="153"/>
     <w:bookmarkEnd w:id="154"/>
-    <w:bookmarkEnd w:id="155"/>
-    <w:bookmarkStart w:id="165" w:name="X10a3fe127cfe3bbc2bbf7a3306d773bdb9a73e5"/>
+    <w:bookmarkStart w:id="164" w:name="X10a3fe127cfe3bbc2bbf7a3306d773bdb9a73e5"/>
     <w:p>
       <w:pPr>
         <w:pStyle w:val="Heading2"/>
@@ -30798,7 +30718,7 @@
         <w:t xml:space="preserve">El dinero no encontraba sitio porque en el modelo todo se acuerda en el momento inicial; pasamos ahora a ver cómo ese mismo supuesto permite introducir el tiempo y la incertidumbre.</w:t>
       </w:r>
     </w:p>
-    <w:bookmarkStart w:id="156" w:name="a-idea-6"/>
+    <w:bookmarkStart w:id="155" w:name="a-idea-6"/>
     <w:p>
       <w:pPr>
         <w:pStyle w:val="Heading4"/>
@@ -30904,8 +30824,8 @@
         <w:t xml:space="preserve">.</w:t>
       </w:r>
     </w:p>
-    <w:bookmarkEnd w:id="156"/>
-    <w:bookmarkStart w:id="160" w:name="b-modelo-6"/>
+    <w:bookmarkEnd w:id="155"/>
+    <w:bookmarkStart w:id="159" w:name="b-modelo-6"/>
     <w:p>
       <w:pPr>
         <w:pStyle w:val="Heading4"/>
@@ -30914,7 +30834,7 @@
         <w:t xml:space="preserve">b) Modelo</w:t>
       </w:r>
     </w:p>
-    <w:bookmarkStart w:id="157" w:name="i-supuestos-6"/>
+    <w:bookmarkStart w:id="156" w:name="i-supuestos-6"/>
     <w:p>
       <w:pPr>
         <w:pStyle w:val="Heading5"/>
@@ -31207,8 +31127,8 @@
         <w:t xml:space="preserve">: todos saben qué estado ha ocurrido (información simétrica) y las preferencias sobre planes contingentes son convexas. No hace falta la utilidad esperada; si se usa, la aversión al riesgo basta para la convexidad.</w:t>
       </w:r>
     </w:p>
-    <w:bookmarkEnd w:id="157"/>
-    <w:bookmarkStart w:id="158" w:name="ii-desarrollo-6"/>
+    <w:bookmarkEnd w:id="156"/>
+    <w:bookmarkStart w:id="157" w:name="ii-desarrollo-6"/>
     <w:p>
       <w:pPr>
         <w:pStyle w:val="Heading5"/>
@@ -31709,8 +31629,8 @@
         <w:t xml:space="preserve">, y los consumidores aversos al riesgo consumen lo mismo en todos los estados: se aseguran por completo.</w:t>
       </w:r>
     </w:p>
-    <w:bookmarkEnd w:id="158"/>
-    <w:bookmarkStart w:id="159" w:name="iii-implicaciones-6"/>
+    <w:bookmarkEnd w:id="157"/>
+    <w:bookmarkStart w:id="158" w:name="iii-implicaciones-6"/>
     <w:p>
       <w:pPr>
         <w:pStyle w:val="Heading5"/>
@@ -32070,9 +31990,9 @@
         <w:t xml:space="preserve">.</w:t>
       </w:r>
     </w:p>
+    <w:bookmarkEnd w:id="158"/>
     <w:bookmarkEnd w:id="159"/>
-    <w:bookmarkEnd w:id="160"/>
-    <w:bookmarkStart w:id="161" w:name="Xe793d4e90cab0e8cdbf1085687307497fa588a5"/>
+    <w:bookmarkStart w:id="160" w:name="Xe793d4e90cab0e8cdbf1085687307497fa588a5"/>
     <w:p>
       <w:pPr>
         <w:pStyle w:val="Heading4"/>
@@ -32501,8 +32421,8 @@
         <w:t xml:space="preserve">.</w:t>
       </w:r>
     </w:p>
-    <w:bookmarkEnd w:id="161"/>
-    <w:bookmarkStart w:id="162" w:name="d-evidencia-empírica"/>
+    <w:bookmarkEnd w:id="160"/>
+    <w:bookmarkStart w:id="161" w:name="d-evidencia-empírica"/>
     <w:p>
       <w:pPr>
         <w:pStyle w:val="Heading4"/>
@@ -32554,8 +32474,8 @@
         <w:t xml:space="preserve">propone crearlos.</w:t>
       </w:r>
     </w:p>
-    <w:bookmarkEnd w:id="162"/>
-    <w:bookmarkStart w:id="164" w:name="e-valoración"/>
+    <w:bookmarkEnd w:id="161"/>
+    <w:bookmarkStart w:id="163" w:name="e-valoración"/>
     <w:p>
       <w:pPr>
         <w:pStyle w:val="Heading4"/>
@@ -32578,7 +32498,7 @@
         <w:rPr>
           <w:rStyle w:val="FootnoteReference"/>
         </w:rPr>
-        <w:footnoteReference w:id="163"/>
+        <w:footnoteReference w:id="162"/>
       </w:r>
       <w:r>
         <w:t xml:space="preserve"> </w:t>
@@ -32629,9 +32549,9 @@
         <w:t xml:space="preserve">, y su ausencia justifica intervenciones como los seguros obligatorios o la protección social.</w:t>
       </w:r>
     </w:p>
+    <w:bookmarkEnd w:id="163"/>
     <w:bookmarkEnd w:id="164"/>
-    <w:bookmarkEnd w:id="165"/>
-    <w:bookmarkStart w:id="168" w:name="X31a243db8302fbc2dbd4c029d72756edf02d7de"/>
+    <w:bookmarkStart w:id="167" w:name="X31a243db8302fbc2dbd4c029d72756edf02d7de"/>
     <w:p>
       <w:pPr>
         <w:pStyle w:val="Heading2"/>
@@ -32952,7 +32872,7 @@
         <w:rPr>
           <w:rStyle w:val="FootnoteReference"/>
         </w:rPr>
-        <w:footnoteReference w:id="166"/>
+        <w:footnoteReference w:id="165"/>
       </w:r>
     </w:p>
     <w:p>
@@ -33574,7 +33494,7 @@
         <w:rPr>
           <w:rStyle w:val="FootnoteReference"/>
         </w:rPr>
-        <w:footnoteReference w:id="167"/>
+        <w:footnoteReference w:id="166"/>
       </w:r>
     </w:p>
     <w:p>
@@ -33613,9 +33533,9 @@
         <w:t xml:space="preserve">: el equilibrio walrasiano resiste que se quite el subastador si los agentes son muchos (núcleo), pero no el poder de mercado, las no convexidades, el dinero sin valor intrínseco ni los mercados incompletos; aun así, sigue siendo la referencia con la que se evalúan las políticas.</w:t>
       </w:r>
     </w:p>
+    <w:bookmarkEnd w:id="167"/>
     <w:bookmarkEnd w:id="168"/>
-    <w:bookmarkEnd w:id="169"/>
-    <w:bookmarkStart w:id="170" w:name="conclusión"/>
+    <w:bookmarkStart w:id="169" w:name="conclusión"/>
     <w:p>
       <w:pPr>
         <w:pStyle w:val="Heading1"/>
@@ -34184,19 +34104,7 @@
         <w:t xml:space="preserve">Opinión</w:t>
       </w:r>
       <w:r>
-        <w:t xml:space="preserve">: el equilibrio general competitivo no describe ninguna economía real, ni lo pretende: como en la imagen de Joan</w:t>
-      </w:r>
-      <w:r>
-        <w:t xml:space="preserve"> </w:t>
-      </w:r>
-      <w:r>
-        <w:rPr>
-          <w:smallCaps/>
-        </w:rPr>
-        <w:t xml:space="preserve">Robinson</w:t>
-      </w:r>
-      <w:r>
-        <w:t xml:space="preserve">, un mapa sirve precisamente porque deja cosas fuera. Su valor es servir de referencia exacta, porque dice qué tendría que cumplir una economía para que la mano invisible funcione, y cada supuesto que no se cumple señala dónde puede fallar y, por tanto, dónde puede tener sentido la intervención pública.</w:t>
+        <w:t xml:space="preserve">: el equilibrio general competitivo no describe ninguna economía real, ni lo pretende: un modelo sirve precisamente porque deja cosas fuera. Su valor es servir de referencia exacta, porque dice qué tendría que cumplir una economía para que la mano invisible funcione, y cada supuesto que no se cumple señala dónde puede fallar y, por tanto, dónde puede tener sentido la intervención pública.</w:t>
       </w:r>
     </w:p>
     <w:p>
@@ -34246,8 +34154,8 @@
         </w:sectPr>
       </w:pPr>
     </w:p>
-    <w:bookmarkEnd w:id="170"/>
-    <w:bookmarkStart w:id="176" w:name="anexo:modelo-general"/>
+    <w:bookmarkEnd w:id="169"/>
+    <w:bookmarkStart w:id="175" w:name="anexo:modelo-general"/>
     <w:p>
       <w:pPr>
         <w:pStyle w:val="Heading1"/>
@@ -35845,7 +35753,7 @@
         <w:t xml:space="preserve">.</w:t>
       </w:r>
     </w:p>
-    <w:bookmarkStart w:id="175" w:name="X0178a4486eb54e97361975b6f9f4727743fe8ab"/>
+    <w:bookmarkStart w:id="174" w:name="X0178a4486eb54e97361975b6f9f4727743fe8ab"/>
     <w:p>
       <w:pPr>
         <w:pStyle w:val="Heading2"/>
@@ -36564,7 +36472,7 @@
         <w:t xml:space="preserve">(gráfico 9).</w:t>
       </w:r>
     </w:p>
-    <w:bookmarkStart w:id="174" w:name="fig:maximizacion-dos-etapas"/>
+    <w:bookmarkStart w:id="173" w:name="fig:maximizacion-dos-etapas"/>
     <w:p>
       <w:pPr>
         <w:pStyle w:val="ImageCaption"/>
@@ -36623,18 +36531,18 @@
           <wp:inline>
             <wp:extent cx="3282950" cy="1960761"/>
             <wp:effectExtent b="0" l="0" r="0" t="0"/>
-            <wp:docPr descr="" title="" id="172" name="Picture"/>
+            <wp:docPr descr="" title="" id="171" name="Picture"/>
             <a:graphic>
               <a:graphicData uri="http://schemas.openxmlformats.org/drawingml/2006/picture">
                 <pic:pic>
                   <pic:nvPicPr>
-                    <pic:cNvPr descr="C:\Users\vgutierrez\Documents\src\victorgutierrezmarcos.github.io-revision\oposicion\temario\fuentes\3A21\graficos/maximizacion-dos-etapas.png" id="173" name="Picture"/>
+                    <pic:cNvPr descr="C:\Users\vgutierrez\Documents\src\victorgutierrezmarcos.github.io-revision\oposicion\temario\fuentes\3A21\graficos/maximizacion-dos-etapas.png" id="172" name="Picture"/>
                     <pic:cNvPicPr>
                       <a:picLocks noChangeArrowheads="1" noChangeAspect="1"/>
                     </pic:cNvPicPr>
                   </pic:nvPicPr>
                   <pic:blipFill>
-                    <a:blip r:embed="rId171"/>
+                    <a:blip r:embed="rId170"/>
                     <a:stretch>
                       <a:fillRect/>
                     </a:stretch>
@@ -36661,7 +36569,7 @@
         </w:drawing>
       </w:r>
     </w:p>
-    <w:bookmarkEnd w:id="174"/>
+    <w:bookmarkEnd w:id="173"/>
     <w:p>
       <w:pPr>
         <w:pStyle w:val="Piedeimagen"/>
@@ -36726,9 +36634,9 @@
         <w:t xml:space="preserve">.</w:t>
       </w:r>
     </w:p>
+    <w:bookmarkEnd w:id="174"/>
     <w:bookmarkEnd w:id="175"/>
-    <w:bookmarkEnd w:id="176"/>
-    <w:bookmarkStart w:id="198" w:name="anexo:existencia"/>
+    <w:bookmarkStart w:id="197" w:name="anexo:existencia"/>
     <w:p>
       <w:pPr>
         <w:pStyle w:val="Heading1"/>
@@ -36760,7 +36668,7 @@
         <w:t xml:space="preserve">(B.1), la unicidad por el axioma débil y por los sustitutivos brutos (B.2) y la estabilidad del tanteo con la distancia al equilibrio (B.3).</w:t>
       </w:r>
     </w:p>
-    <w:bookmarkStart w:id="183" w:name="b.1.-demostración-de-la-existencia"/>
+    <w:bookmarkStart w:id="182" w:name="b.1.-demostración-de-la-existencia"/>
     <w:p>
       <w:pPr>
         <w:pStyle w:val="Heading2"/>
@@ -36769,7 +36677,7 @@
         <w:t xml:space="preserve">B.1. Demostración de la existencia</w:t>
       </w:r>
     </w:p>
-    <w:bookmarkStart w:id="177" w:name="los-teoremas-del-punto-fijo"/>
+    <w:bookmarkStart w:id="176" w:name="los-teoremas-del-punto-fijo"/>
     <w:p>
       <w:pPr>
         <w:pStyle w:val="Heading4"/>
@@ -37575,8 +37483,8 @@
         <w:t xml:space="preserve">da un punto fijo, y queda probar que ese punto fijo es un equilibrio (paso 3).</w:t>
       </w:r>
     </w:p>
-    <w:bookmarkEnd w:id="177"/>
-    <w:bookmarkStart w:id="179" w:name="supuestos-1"/>
+    <w:bookmarkEnd w:id="176"/>
+    <w:bookmarkStart w:id="178" w:name="supuestos-1"/>
     <w:p>
       <w:pPr>
         <w:pStyle w:val="Heading4"/>
@@ -37726,7 +37634,7 @@
         <w:rPr>
           <w:rStyle w:val="FootnoteReference"/>
         </w:rPr>
-        <w:footnoteReference w:id="178"/>
+        <w:footnoteReference w:id="177"/>
       </w:r>
     </w:p>
     <w:p>
@@ -37820,8 +37728,8 @@
         <w:t xml:space="preserve">.</w:t>
       </w:r>
     </w:p>
-    <w:bookmarkEnd w:id="179"/>
-    <w:bookmarkStart w:id="180" w:name="paso-1-el-conjunto-de-precios"/>
+    <w:bookmarkEnd w:id="178"/>
+    <w:bookmarkStart w:id="179" w:name="paso-1-el-conjunto-de-precios"/>
     <w:p>
       <w:pPr>
         <w:pStyle w:val="Heading4"/>
@@ -38560,8 +38468,8 @@
         <w:t xml:space="preserve">.</w:t>
       </w:r>
     </w:p>
-    <w:bookmarkEnd w:id="180"/>
-    <w:bookmarkStart w:id="181" w:name="paso-2-la-función-del-subastador"/>
+    <w:bookmarkEnd w:id="179"/>
+    <w:bookmarkStart w:id="180" w:name="paso-2-la-función-del-subastador"/>
     <w:p>
       <w:pPr>
         <w:pStyle w:val="Heading4"/>
@@ -40499,8 +40407,8 @@
         </m:oMath>
       </m:oMathPara>
     </w:p>
-    <w:bookmarkEnd w:id="181"/>
-    <w:bookmarkStart w:id="182" w:name="paso-3-el-punto-fijo-es-un-equilibrio"/>
+    <w:bookmarkEnd w:id="180"/>
+    <w:bookmarkStart w:id="181" w:name="paso-3-el-punto-fijo-es-un-equilibrio"/>
     <w:p>
       <w:pPr>
         <w:pStyle w:val="Heading4"/>
@@ -42166,9 +42074,9 @@
         <w:t xml:space="preserve">(III.5).</w:t>
       </w:r>
     </w:p>
+    <w:bookmarkEnd w:id="181"/>
     <w:bookmarkEnd w:id="182"/>
-    <w:bookmarkEnd w:id="183"/>
-    <w:bookmarkStart w:id="193" w:name="anexo:unicidad"/>
+    <w:bookmarkStart w:id="192" w:name="anexo:unicidad"/>
     <w:p>
       <w:pPr>
         <w:pStyle w:val="Heading2"/>
@@ -42198,7 +42106,7 @@
         <w:t xml:space="preserve">: se supone que hay 2 equilibrios distintos y se llega a una contradicción.</w:t>
       </w:r>
     </w:p>
-    <w:bookmarkStart w:id="188" w:name="X43a61c2b333aea3533a396288fdd1e8dc25e697"/>
+    <w:bookmarkStart w:id="187" w:name="X43a61c2b333aea3533a396288fdd1e8dc25e697"/>
     <w:p>
       <w:pPr>
         <w:pStyle w:val="Heading4"/>
@@ -42278,7 +42186,7 @@
         <w:t xml:space="preserve">, y eso es justo lo que el axioma débil prohíbe.</w:t>
       </w:r>
     </w:p>
-    <w:bookmarkStart w:id="184" w:name="supuestos-2"/>
+    <w:bookmarkStart w:id="183" w:name="supuestos-2"/>
     <w:p>
       <w:pPr>
         <w:pStyle w:val="Heading5"/>
@@ -43415,8 +43323,8 @@
         <w:t xml:space="preserve">.</w:t>
       </w:r>
     </w:p>
-    <w:bookmarkEnd w:id="184"/>
-    <w:bookmarkStart w:id="185" w:name="demostración"/>
+    <w:bookmarkEnd w:id="183"/>
+    <w:bookmarkStart w:id="184" w:name="demostración"/>
     <w:p>
       <w:pPr>
         <w:pStyle w:val="Heading5"/>
@@ -45091,8 +44999,8 @@
         </m:r>
       </m:oMath>
     </w:p>
-    <w:bookmarkEnd w:id="185"/>
-    <w:bookmarkStart w:id="186" w:name="versión-con-el-exceso-de-demanda"/>
+    <w:bookmarkEnd w:id="184"/>
+    <w:bookmarkStart w:id="185" w:name="versión-con-el-exceso-de-demanda"/>
     <w:p>
       <w:pPr>
         <w:pStyle w:val="Heading5"/>
@@ -45876,8 +45784,8 @@
         <w:t xml:space="preserve">): por eso, en esta versión, solo asegura que el conjunto de equilibrios es convexo; con equilibrios aislados (economía regular), es un punto.</w:t>
       </w:r>
     </w:p>
-    <w:bookmarkEnd w:id="186"/>
-    <w:bookmarkStart w:id="187" w:name="valoración"/>
+    <w:bookmarkEnd w:id="185"/>
+    <w:bookmarkStart w:id="186" w:name="valoración"/>
     <w:p>
       <w:pPr>
         <w:pStyle w:val="Heading5"/>
@@ -46029,9 +45937,9 @@
         <w:t xml:space="preserve">. Es pedir que la economía se comporte como un consumidor representativo.</w:t>
       </w:r>
     </w:p>
+    <w:bookmarkEnd w:id="186"/>
     <w:bookmarkEnd w:id="187"/>
-    <w:bookmarkEnd w:id="188"/>
-    <w:bookmarkStart w:id="192" w:name="unicidad-por-los-sustitutivos-brutos"/>
+    <w:bookmarkStart w:id="191" w:name="unicidad-por-los-sustitutivos-brutos"/>
     <w:p>
       <w:pPr>
         <w:pStyle w:val="Heading4"/>
@@ -46074,7 +45982,7 @@
         <w:t xml:space="preserve">se encarece al pasar de uno a otro vería a todos los demás encarecerse más que él; como todos son sustitutivos suyos, su demanda subiría y su mercado dejaría de vaciarse.</w:t>
       </w:r>
     </w:p>
-    <w:bookmarkStart w:id="189" w:name="supuestos-3"/>
+    <w:bookmarkStart w:id="188" w:name="supuestos-3"/>
     <w:p>
       <w:pPr>
         <w:pStyle w:val="Heading5"/>
@@ -46288,8 +46196,8 @@
         <w:t xml:space="preserve">. Al cambiar los precios cambian las demandas por los efectos sustitución y renta (también el de la dotación, I.2.2); la condición pide que el resultado neto sea siempre que encarecer un bien aumente la demanda de todos los demás.</w:t>
       </w:r>
     </w:p>
-    <w:bookmarkEnd w:id="189"/>
-    <w:bookmarkStart w:id="190" w:name="demostración-1"/>
+    <w:bookmarkEnd w:id="188"/>
+    <w:bookmarkStart w:id="189" w:name="demostración-1"/>
     <w:p>
       <w:pPr>
         <w:pStyle w:val="Heading5"/>
@@ -47855,8 +47763,8 @@
         <w:t xml:space="preserve">es siempre decreciente y solo corta el eje una vez.</w:t>
       </w:r>
     </w:p>
-    <w:bookmarkEnd w:id="190"/>
-    <w:bookmarkStart w:id="191" w:name="valoración-1"/>
+    <w:bookmarkEnd w:id="189"/>
+    <w:bookmarkStart w:id="190" w:name="valoración-1"/>
     <w:p>
       <w:pPr>
         <w:pStyle w:val="Heading5"/>
@@ -47993,10 +47901,10 @@
         <w:t xml:space="preserve">, con bienes complementarios, tiene un equilibrio único pero inestable). Y, por el teorema SMD, nada en la teoría del consumidor obliga a que se cumpla.</w:t>
       </w:r>
     </w:p>
+    <w:bookmarkEnd w:id="190"/>
     <w:bookmarkEnd w:id="191"/>
     <w:bookmarkEnd w:id="192"/>
-    <w:bookmarkEnd w:id="193"/>
-    <w:bookmarkStart w:id="197" w:name="anexo:estabilidad"/>
+    <w:bookmarkStart w:id="196" w:name="anexo:estabilidad"/>
     <w:p>
       <w:pPr>
         <w:pStyle w:val="Heading2"/>
@@ -48038,7 +47946,7 @@
         <w:t xml:space="preserve">para sistemas dinámicos, que no exige resolver las ecuaciones del tanteo.</w:t>
       </w:r>
     </w:p>
-    <w:bookmarkStart w:id="194" w:name="supuestos-4"/>
+    <w:bookmarkStart w:id="193" w:name="supuestos-4"/>
     <w:p>
       <w:pPr>
         <w:pStyle w:val="Heading4"/>
@@ -48554,8 +48462,8 @@
         <w:t xml:space="preserve">.</w:t>
       </w:r>
     </w:p>
-    <w:bookmarkEnd w:id="194"/>
-    <w:bookmarkStart w:id="195" w:name="demostración-2"/>
+    <w:bookmarkEnd w:id="193"/>
+    <w:bookmarkStart w:id="194" w:name="demostración-2"/>
     <w:p>
       <w:pPr>
         <w:pStyle w:val="Heading4"/>
@@ -50850,8 +50758,8 @@
         <w:t xml:space="preserve">está más barato que en el equilibrio y negativo cuando está más caro. Los 2 factores tienen siempre el mismo signo y el producto es positivo: se cumple la condición de estabilidad.</w:t>
       </w:r>
     </w:p>
-    <w:bookmarkEnd w:id="195"/>
-    <w:bookmarkStart w:id="196" w:name="valoración-2"/>
+    <w:bookmarkEnd w:id="194"/>
+    <w:bookmarkStart w:id="195" w:name="valoración-2"/>
     <w:p>
       <w:pPr>
         <w:pStyle w:val="Heading4"/>
@@ -51093,10 +51001,10 @@
         <w:t xml:space="preserve">la distancia al equilibrio no disminuye nunca: los precios describen órbitas cerradas a su alrededor sin llegar a él.</w:t>
       </w:r>
     </w:p>
+    <w:bookmarkEnd w:id="195"/>
     <w:bookmarkEnd w:id="196"/>
     <w:bookmarkEnd w:id="197"/>
-    <w:bookmarkEnd w:id="198"/>
-    <w:bookmarkStart w:id="201" w:name="anexo:pareto"/>
+    <w:bookmarkStart w:id="200" w:name="anexo:pareto"/>
     <w:p>
       <w:pPr>
         <w:pStyle w:val="Heading1"/>
@@ -51161,7 +51069,7 @@
         <w:t xml:space="preserve">con sus ventajas y críticas, y los 2 teoremas fundamentales con sus supuestos, la demostración del primero y su historia.</w:t>
       </w:r>
     </w:p>
-    <w:bookmarkStart w:id="199" w:name="c.1.-el-criterio-de-pareto"/>
+    <w:bookmarkStart w:id="198" w:name="c.1.-el-criterio-de-pareto"/>
     <w:p>
       <w:pPr>
         <w:pStyle w:val="Heading2"/>
@@ -51661,8 +51569,8 @@
         <w:t xml:space="preserve">, le reprocha confundir ese máximo con el óptimo social.</w:t>
       </w:r>
     </w:p>
-    <w:bookmarkEnd w:id="199"/>
-    <w:bookmarkStart w:id="200" w:name="c.2.-los-teoremas-fundamentales"/>
+    <w:bookmarkEnd w:id="198"/>
+    <w:bookmarkStart w:id="199" w:name="c.2.-los-teoremas-fundamentales"/>
     <w:p>
       <w:pPr>
         <w:pStyle w:val="Heading2"/>
@@ -53380,9 +53288,9 @@
         <w:t xml:space="preserve">, por separado.</w:t>
       </w:r>
     </w:p>
+    <w:bookmarkEnd w:id="199"/>
     <w:bookmarkEnd w:id="200"/>
-    <w:bookmarkEnd w:id="201"/>
-    <w:bookmarkStart w:id="207" w:name="anexo:estabilidad-parcial"/>
+    <w:bookmarkStart w:id="206" w:name="anexo:estabilidad-parcial"/>
     <w:p>
       <w:pPr>
         <w:pStyle w:val="Heading1"/>
@@ -54163,7 +54071,7 @@
         <w:t xml:space="preserve">, que son incompatibles.</w:t>
       </w:r>
     </w:p>
-    <w:bookmarkStart w:id="202" w:name="tab:estabilidad-parcial"/>
+    <w:bookmarkStart w:id="201" w:name="tab:estabilidad-parcial"/>
     <w:p>
       <w:pPr>
         <w:pStyle w:val="TableCaption"/>
@@ -54599,7 +54507,7 @@
         </w:tc>
       </w:tr>
     </w:tbl>
-    <w:bookmarkEnd w:id="202"/>
+    <w:bookmarkEnd w:id="201"/>
     <w:p>
       <w:pPr>
         <w:pStyle w:val="BodyText"/>
@@ -54665,7 +54573,7 @@
         <w:t xml:space="preserve">.</w:t>
       </w:r>
     </w:p>
-    <w:bookmarkStart w:id="206" w:name="fig:estabilidad-parcial"/>
+    <w:bookmarkStart w:id="205" w:name="fig:estabilidad-parcial"/>
     <w:p>
       <w:pPr>
         <w:pStyle w:val="ImageCaption"/>
@@ -54689,18 +54597,18 @@
           <wp:inline>
             <wp:extent cx="5969000" cy="2438127"/>
             <wp:effectExtent b="0" l="0" r="0" t="0"/>
-            <wp:docPr descr="" title="" id="204" name="Picture"/>
+            <wp:docPr descr="" title="" id="203" name="Picture"/>
             <a:graphic>
               <a:graphicData uri="http://schemas.openxmlformats.org/drawingml/2006/picture">
                 <pic:pic>
                   <pic:nvPicPr>
-                    <pic:cNvPr descr="C:\Users\vgutierrez\Documents\src\victorgutierrezmarcos.github.io-revision\oposicion\temario\fuentes\3A21\graficos/estabilidad-parcial.png" id="205" name="Picture"/>
+                    <pic:cNvPr descr="C:\Users\vgutierrez\Documents\src\victorgutierrezmarcos.github.io-revision\oposicion\temario\fuentes\3A21\graficos/estabilidad-parcial.png" id="204" name="Picture"/>
                     <pic:cNvPicPr>
                       <a:picLocks noChangeArrowheads="1" noChangeAspect="1"/>
                     </pic:cNvPicPr>
                   </pic:nvPicPr>
                   <pic:blipFill>
-                    <a:blip r:embed="rId203"/>
+                    <a:blip r:embed="rId202"/>
                     <a:stretch>
                       <a:fillRect/>
                     </a:stretch>
@@ -54727,7 +54635,7 @@
         </w:drawing>
       </w:r>
     </w:p>
-    <w:bookmarkEnd w:id="206"/>
+    <w:bookmarkEnd w:id="205"/>
     <w:p>
       <w:pPr>
         <w:pStyle w:val="Piedeimagen"/>
@@ -54801,8 +54709,8 @@
         <w:t xml:space="preserve">: si el equilibrio es estable, el propio mercado tiende a él sin intervención; si no, la mano invisible no basta. En equilibrio general la pregunta es la del tanteo multimercado (II.1.3 y anexo B.3).</w:t>
       </w:r>
     </w:p>
-    <w:bookmarkEnd w:id="207"/>
-    <w:bookmarkStart w:id="217" w:name="anexo:estatica"/>
+    <w:bookmarkEnd w:id="206"/>
+    <w:bookmarkStart w:id="216" w:name="anexo:estatica"/>
     <w:p>
       <w:pPr>
         <w:pStyle w:val="Heading1"/>
@@ -57212,7 +57120,7 @@
         <w:rPr>
           <w:rStyle w:val="FootnoteReference"/>
         </w:rPr>
-        <w:footnoteReference w:id="208"/>
+        <w:footnoteReference w:id="207"/>
       </w:r>
       <w:r>
         <w:t xml:space="preserve"> </w:t>
@@ -59107,7 +59015,7 @@
         <w:t xml:space="preserve">.</w:t>
       </w:r>
     </w:p>
-    <w:bookmarkStart w:id="212" w:name="fig:costes-unitarios"/>
+    <w:bookmarkStart w:id="211" w:name="fig:costes-unitarios"/>
     <w:p>
       <w:pPr>
         <w:pStyle w:val="ImageCaption"/>
@@ -59172,18 +59080,18 @@
           <wp:inline>
             <wp:extent cx="2984500" cy="2183512"/>
             <wp:effectExtent b="0" l="0" r="0" t="0"/>
-            <wp:docPr descr="" title="" id="210" name="Picture"/>
+            <wp:docPr descr="" title="" id="209" name="Picture"/>
             <a:graphic>
               <a:graphicData uri="http://schemas.openxmlformats.org/drawingml/2006/picture">
                 <pic:pic>
                   <pic:nvPicPr>
-                    <pic:cNvPr descr="C:\Users\vgutierrez\Documents\src\victorgutierrezmarcos.github.io-revision\oposicion\temario\fuentes\3A21\graficos/costes-unitarios.png" id="211" name="Picture"/>
+                    <pic:cNvPr descr="C:\Users\vgutierrez\Documents\src\victorgutierrezmarcos.github.io-revision\oposicion\temario\fuentes\3A21\graficos/costes-unitarios.png" id="210" name="Picture"/>
                     <pic:cNvPicPr>
                       <a:picLocks noChangeArrowheads="1" noChangeAspect="1"/>
                     </pic:cNvPicPr>
                   </pic:nvPicPr>
                   <pic:blipFill>
-                    <a:blip r:embed="rId209"/>
+                    <a:blip r:embed="rId208"/>
                     <a:stretch>
                       <a:fillRect/>
                     </a:stretch>
@@ -59210,7 +59118,7 @@
         </w:drawing>
       </w:r>
     </w:p>
-    <w:bookmarkEnd w:id="212"/>
+    <w:bookmarkEnd w:id="211"/>
     <w:p>
       <w:pPr>
         <w:pStyle w:val="Piedeimagen"/>
@@ -59280,7 +59188,7 @@
         <w:t xml:space="preserve">.</w:t>
       </w:r>
     </w:p>
-    <w:bookmarkStart w:id="216" w:name="fig:rybczynski"/>
+    <w:bookmarkStart w:id="215" w:name="fig:rybczynski"/>
     <w:p>
       <w:pPr>
         <w:pStyle w:val="ImageCaption"/>
@@ -59313,18 +59221,18 @@
           <wp:inline>
             <wp:extent cx="3568912" cy="2544417"/>
             <wp:effectExtent b="0" l="0" r="0" t="0"/>
-            <wp:docPr descr="" title="" id="214" name="Picture"/>
+            <wp:docPr descr="" title="" id="213" name="Picture"/>
             <a:graphic>
               <a:graphicData uri="http://schemas.openxmlformats.org/drawingml/2006/picture">
                 <pic:pic>
                   <pic:nvPicPr>
-                    <pic:cNvPr descr="C:\Users\vgutierrez\Documents\src\victorgutierrezmarcos.github.io-revision\oposicion\temario\fuentes\3A21\graficos/rybczynski.png" id="215" name="Picture"/>
+                    <pic:cNvPr descr="C:\Users\vgutierrez\Documents\src\victorgutierrezmarcos.github.io-revision\oposicion\temario\fuentes\3A21\graficos/rybczynski.png" id="214" name="Picture"/>
                     <pic:cNvPicPr>
                       <a:picLocks noChangeArrowheads="1" noChangeAspect="1"/>
                     </pic:cNvPicPr>
                   </pic:nvPicPr>
                   <pic:blipFill>
-                    <a:blip r:embed="rId213"/>
+                    <a:blip r:embed="rId212"/>
                     <a:stretch>
                       <a:fillRect/>
                     </a:stretch>
@@ -59351,7 +59259,7 @@
         </w:drawing>
       </w:r>
     </w:p>
-    <w:bookmarkEnd w:id="216"/>
+    <w:bookmarkEnd w:id="215"/>
     <w:p>
       <w:pPr>
         <w:pStyle w:val="Piedeimagen"/>
@@ -59421,8 +59329,8 @@
         <w:t xml:space="preserve">.</w:t>
       </w:r>
     </w:p>
-    <w:bookmarkEnd w:id="217"/>
-    <w:bookmarkStart w:id="220" w:name="anexo:test"/>
+    <w:bookmarkEnd w:id="216"/>
+    <w:bookmarkStart w:id="219" w:name="anexo:test"/>
     <w:p>
       <w:pPr>
         <w:pStyle w:val="Heading1"/>
@@ -59441,7 +59349,7 @@
       <w:r>
         <w:t xml:space="preserve"> </w:t>
       </w:r>
-      <w:hyperlink r:id="rId218">
+      <w:hyperlink r:id="rId217">
         <w:r>
           <w:rPr>
             <w:rStyle w:val="Hyperlink"/>
@@ -60239,7 +60147,7 @@
         <w:t xml:space="preserve">, 1973).</w:t>
       </w:r>
     </w:p>
-    <w:bookmarkStart w:id="219" w:name="preguntas-probables-del-tribunal"/>
+    <w:bookmarkStart w:id="218" w:name="preguntas-probables-del-tribunal"/>
     <w:p>
       <w:pPr>
         <w:pStyle w:val="Heading4"/>
@@ -60456,9 +60364,9 @@
         </w:sectPr>
       </w:pPr>
     </w:p>
+    <w:bookmarkEnd w:id="218"/>
     <w:bookmarkEnd w:id="219"/>
-    <w:bookmarkEnd w:id="220"/>
-    <w:bookmarkStart w:id="408" w:name="bibliography"/>
+    <w:bookmarkStart w:id="406" w:name="bibliography"/>
     <w:p>
       <w:pPr>
         <w:pStyle w:val="Heading1"/>
@@ -60467,8 +60375,8 @@
         <w:t xml:space="preserve">Bibliografía</w:t>
       </w:r>
     </w:p>
-    <w:bookmarkStart w:id="407" w:name="refs"/>
-    <w:bookmarkStart w:id="222" w:name="ref-AguiarEtAl2025GTAP12"/>
+    <w:bookmarkStart w:id="405" w:name="refs"/>
+    <w:bookmarkStart w:id="221" w:name="ref-AguiarEtAl2025GTAP12"/>
     <w:p>
       <w:pPr>
         <w:pStyle w:val="Bibliography"/>
@@ -60504,7 +60412,7 @@
       <w:r>
         <w:t xml:space="preserve"> </w:t>
       </w:r>
-      <w:hyperlink r:id="rId221">
+      <w:hyperlink r:id="rId220">
         <w:r>
           <w:rPr>
             <w:rStyle w:val="Hyperlink"/>
@@ -60516,8 +60424,8 @@
         <w:t xml:space="preserve">.</w:t>
       </w:r>
     </w:p>
-    <w:bookmarkEnd w:id="222"/>
-    <w:bookmarkStart w:id="224" w:name="ref-AndresBurrielEstrada2006BEMOD"/>
+    <w:bookmarkEnd w:id="221"/>
+    <w:bookmarkStart w:id="223" w:name="ref-AndresBurrielEstrada2006BEMOD"/>
     <w:p>
       <w:pPr>
         <w:pStyle w:val="Bibliography"/>
@@ -60537,7 +60445,7 @@
       <w:r>
         <w:t xml:space="preserve"> </w:t>
       </w:r>
-      <w:hyperlink r:id="rId223">
+      <w:hyperlink r:id="rId222">
         <w:r>
           <w:rPr>
             <w:rStyle w:val="Hyperlink"/>
@@ -60549,8 +60457,8 @@
         <w:t xml:space="preserve">.</w:t>
       </w:r>
     </w:p>
-    <w:bookmarkEnd w:id="224"/>
-    <w:bookmarkStart w:id="225" w:name="ref-ArchibaldLipsey1958Monetary"/>
+    <w:bookmarkEnd w:id="223"/>
+    <w:bookmarkStart w:id="224" w:name="ref-ArchibaldLipsey1958Monetary"/>
     <w:p>
       <w:pPr>
         <w:pStyle w:val="Bibliography"/>
@@ -60584,8 +60492,8 @@
         <w:t xml:space="preserve">26 (1): 1-22.</w:t>
       </w:r>
     </w:p>
-    <w:bookmarkEnd w:id="225"/>
-    <w:bookmarkStart w:id="226" w:name="ref-Arrow1951Extension"/>
+    <w:bookmarkEnd w:id="224"/>
+    <w:bookmarkStart w:id="225" w:name="ref-Arrow1951Extension"/>
     <w:p>
       <w:pPr>
         <w:pStyle w:val="Bibliography"/>
@@ -60616,8 +60524,8 @@
         <w:t xml:space="preserve">, editado por Jerzy Neyman, 507-32. Berkeley: University of California Press.</w:t>
       </w:r>
     </w:p>
-    <w:bookmarkEnd w:id="226"/>
-    <w:bookmarkStart w:id="227" w:name="ref-Arrow1953Role"/>
+    <w:bookmarkEnd w:id="225"/>
+    <w:bookmarkStart w:id="226" w:name="ref-Arrow1953Role"/>
     <w:p>
       <w:pPr>
         <w:pStyle w:val="Bibliography"/>
@@ -60648,8 +60556,8 @@
         <w:t xml:space="preserve">, 41-47. Colloques internationaux du CNRS 40. París: CNRS.</w:t>
       </w:r>
     </w:p>
-    <w:bookmarkEnd w:id="227"/>
-    <w:bookmarkStart w:id="228" w:name="ref-Arrow1963Uncertainty"/>
+    <w:bookmarkEnd w:id="226"/>
+    <w:bookmarkStart w:id="227" w:name="ref-Arrow1963Uncertainty"/>
     <w:p>
       <w:pPr>
         <w:pStyle w:val="Bibliography"/>
@@ -60683,8 +60591,8 @@
         <w:t xml:space="preserve">53 (5): 941-73.</w:t>
       </w:r>
     </w:p>
-    <w:bookmarkEnd w:id="228"/>
-    <w:bookmarkStart w:id="230" w:name="ref-Arrow1964Role"/>
+    <w:bookmarkEnd w:id="227"/>
+    <w:bookmarkStart w:id="229" w:name="ref-Arrow1964Role"/>
     <w:p>
       <w:pPr>
         <w:pStyle w:val="Bibliography"/>
@@ -60720,7 +60628,7 @@
       <w:r>
         <w:t xml:space="preserve"> </w:t>
       </w:r>
-      <w:hyperlink r:id="rId229">
+      <w:hyperlink r:id="rId228">
         <w:r>
           <w:rPr>
             <w:rStyle w:val="Hyperlink"/>
@@ -60732,8 +60640,8 @@
         <w:t xml:space="preserve">.</w:t>
       </w:r>
     </w:p>
-    <w:bookmarkEnd w:id="230"/>
-    <w:bookmarkStart w:id="231" w:name="ref-ArrowBlockHurwicz1959Stability"/>
+    <w:bookmarkEnd w:id="229"/>
+    <w:bookmarkStart w:id="230" w:name="ref-ArrowBlockHurwicz1959Stability"/>
     <w:p>
       <w:pPr>
         <w:pStyle w:val="Bibliography"/>
@@ -60767,8 +60675,8 @@
         <w:t xml:space="preserve">27 (1): 82-109.</w:t>
       </w:r>
     </w:p>
-    <w:bookmarkEnd w:id="231"/>
-    <w:bookmarkStart w:id="233" w:name="ref-ArrowDebreu1954Existence"/>
+    <w:bookmarkEnd w:id="230"/>
+    <w:bookmarkStart w:id="232" w:name="ref-ArrowDebreu1954Existence"/>
     <w:p>
       <w:pPr>
         <w:pStyle w:val="Bibliography"/>
@@ -60804,7 +60712,7 @@
       <w:r>
         <w:t xml:space="preserve"> </w:t>
       </w:r>
-      <w:hyperlink r:id="rId232">
+      <w:hyperlink r:id="rId231">
         <w:r>
           <w:rPr>
             <w:rStyle w:val="Hyperlink"/>
@@ -60816,8 +60724,8 @@
         <w:t xml:space="preserve">.</w:t>
       </w:r>
     </w:p>
-    <w:bookmarkEnd w:id="233"/>
-    <w:bookmarkStart w:id="234" w:name="ref-ArrowHahn1971General"/>
+    <w:bookmarkEnd w:id="232"/>
+    <w:bookmarkStart w:id="233" w:name="ref-ArrowHahn1971General"/>
     <w:p>
       <w:pPr>
         <w:pStyle w:val="Bibliography"/>
@@ -60839,8 +60747,8 @@
         <w:t xml:space="preserve">. San Francisco: Holden-Day.</w:t>
       </w:r>
     </w:p>
-    <w:bookmarkEnd w:id="234"/>
-    <w:bookmarkStart w:id="235" w:name="ref-Aumann1964Markets"/>
+    <w:bookmarkEnd w:id="233"/>
+    <w:bookmarkStart w:id="234" w:name="ref-Aumann1964Markets"/>
     <w:p>
       <w:pPr>
         <w:pStyle w:val="Bibliography"/>
@@ -60874,8 +60782,8 @@
         <w:t xml:space="preserve">32 (1/2): 39-50.</w:t>
       </w:r>
     </w:p>
-    <w:bookmarkEnd w:id="235"/>
-    <w:bookmarkStart w:id="236" w:name="ref-Aumann1975Values"/>
+    <w:bookmarkEnd w:id="234"/>
+    <w:bookmarkStart w:id="235" w:name="ref-Aumann1975Values"/>
     <w:p>
       <w:pPr>
         <w:pStyle w:val="Bibliography"/>
@@ -60909,8 +60817,8 @@
         <w:t xml:space="preserve">43 (4): 611-46.</w:t>
       </w:r>
     </w:p>
-    <w:bookmarkEnd w:id="236"/>
-    <w:bookmarkStart w:id="237" w:name="ref-BalaskoCass1989Structure"/>
+    <w:bookmarkEnd w:id="235"/>
+    <w:bookmarkStart w:id="236" w:name="ref-BalaskoCass1989Structure"/>
     <w:p>
       <w:pPr>
         <w:pStyle w:val="Bibliography"/>
@@ -60944,8 +60852,8 @@
         <w:t xml:space="preserve">57 (1): 135-62.</w:t>
       </w:r>
     </w:p>
-    <w:bookmarkEnd w:id="237"/>
-    <w:bookmarkStart w:id="239" w:name="ref-BarrageNordhaus2024DICE"/>
+    <w:bookmarkEnd w:id="236"/>
+    <w:bookmarkStart w:id="238" w:name="ref-BarrageNordhaus2024DICE"/>
     <w:p>
       <w:pPr>
         <w:pStyle w:val="Bibliography"/>
@@ -60981,7 +60889,7 @@
       <w:r>
         <w:t xml:space="preserve"> </w:t>
       </w:r>
-      <w:hyperlink r:id="rId238">
+      <w:hyperlink r:id="rId237">
         <w:r>
           <w:rPr>
             <w:rStyle w:val="Hyperlink"/>
@@ -60993,8 +60901,8 @@
         <w:t xml:space="preserve">.</w:t>
       </w:r>
     </w:p>
-    <w:bookmarkEnd w:id="239"/>
-    <w:bookmarkStart w:id="241" w:name="ref-Bastiat1845Sophismes"/>
+    <w:bookmarkEnd w:id="238"/>
+    <w:bookmarkStart w:id="240" w:name="ref-Bastiat1845Sophismes"/>
     <w:p>
       <w:pPr>
         <w:pStyle w:val="Bibliography"/>
@@ -61018,7 +60926,7 @@
       <w:r>
         <w:t xml:space="preserve"> </w:t>
       </w:r>
-      <w:hyperlink r:id="rId240">
+      <w:hyperlink r:id="rId239">
         <w:r>
           <w:rPr>
             <w:rStyle w:val="Hyperlink"/>
@@ -61030,8 +60938,8 @@
         <w:t xml:space="preserve">.</w:t>
       </w:r>
     </w:p>
-    <w:bookmarkEnd w:id="241"/>
-    <w:bookmarkStart w:id="242" w:name="ref-Bator1957Simple"/>
+    <w:bookmarkEnd w:id="240"/>
+    <w:bookmarkStart w:id="241" w:name="ref-Bator1957Simple"/>
     <w:p>
       <w:pPr>
         <w:pStyle w:val="Bibliography"/>
@@ -61065,8 +60973,8 @@
         <w:t xml:space="preserve">47 (1): 22-59.</w:t>
       </w:r>
     </w:p>
-    <w:bookmarkEnd w:id="242"/>
-    <w:bookmarkStart w:id="244" w:name="ref-Becker1965Allocation"/>
+    <w:bookmarkEnd w:id="241"/>
+    <w:bookmarkStart w:id="243" w:name="ref-Becker1965Allocation"/>
     <w:p>
       <w:pPr>
         <w:pStyle w:val="Bibliography"/>
@@ -61102,7 +61010,7 @@
       <w:r>
         <w:t xml:space="preserve"> </w:t>
       </w:r>
-      <w:hyperlink r:id="rId243">
+      <w:hyperlink r:id="rId242">
         <w:r>
           <w:rPr>
             <w:rStyle w:val="Hyperlink"/>
@@ -61114,8 +61022,8 @@
         <w:t xml:space="preserve">.</w:t>
       </w:r>
     </w:p>
-    <w:bookmarkEnd w:id="244"/>
-    <w:bookmarkStart w:id="245" w:name="ref-BeckerBaumol1952Classical"/>
+    <w:bookmarkEnd w:id="243"/>
+    <w:bookmarkStart w:id="244" w:name="ref-BeckerBaumol1952Classical"/>
     <w:p>
       <w:pPr>
         <w:pStyle w:val="Bibliography"/>
@@ -61149,8 +61057,8 @@
         <w:t xml:space="preserve">19 (76): 355-76.</w:t>
       </w:r>
     </w:p>
-    <w:bookmarkEnd w:id="245"/>
-    <w:bookmarkStart w:id="247" w:name="ref-BinmoreRubinsteinWolinsky1986Nash"/>
+    <w:bookmarkEnd w:id="244"/>
+    <w:bookmarkStart w:id="246" w:name="ref-BinmoreRubinsteinWolinsky1986Nash"/>
     <w:p>
       <w:pPr>
         <w:pStyle w:val="Bibliography"/>
@@ -61186,7 +61094,7 @@
       <w:r>
         <w:t xml:space="preserve"> </w:t>
       </w:r>
-      <w:hyperlink r:id="rId246">
+      <w:hyperlink r:id="rId245">
         <w:r>
           <w:rPr>
             <w:rStyle w:val="Hyperlink"/>
@@ -61198,8 +61106,8 @@
         <w:t xml:space="preserve">.</w:t>
       </w:r>
     </w:p>
-    <w:bookmarkEnd w:id="247"/>
-    <w:bookmarkStart w:id="249" w:name="ref-BoscaEtAl2010REMS"/>
+    <w:bookmarkEnd w:id="246"/>
+    <w:bookmarkStart w:id="248" w:name="ref-BoscaEtAl2010REMS"/>
     <w:p>
       <w:pPr>
         <w:pStyle w:val="Bibliography"/>
@@ -61235,7 +61143,7 @@
       <w:r>
         <w:t xml:space="preserve"> </w:t>
       </w:r>
-      <w:hyperlink r:id="rId248">
+      <w:hyperlink r:id="rId247">
         <w:r>
           <w:rPr>
             <w:rStyle w:val="Hyperlink"/>
@@ -61247,8 +61155,8 @@
         <w:t xml:space="preserve">.</w:t>
       </w:r>
     </w:p>
-    <w:bookmarkEnd w:id="249"/>
-    <w:bookmarkStart w:id="251" w:name="ref-BoscaEtAl2020Financial"/>
+    <w:bookmarkEnd w:id="248"/>
+    <w:bookmarkStart w:id="250" w:name="ref-BoscaEtAl2020Financial"/>
     <w:p>
       <w:pPr>
         <w:pStyle w:val="Bibliography"/>
@@ -61284,7 +61192,7 @@
       <w:r>
         <w:t xml:space="preserve"> </w:t>
       </w:r>
-      <w:hyperlink r:id="rId250">
+      <w:hyperlink r:id="rId249">
         <w:r>
           <w:rPr>
             <w:rStyle w:val="Hyperlink"/>
@@ -61296,8 +61204,8 @@
         <w:t xml:space="preserve">.</w:t>
       </w:r>
     </w:p>
-    <w:bookmarkEnd w:id="251"/>
-    <w:bookmarkStart w:id="253" w:name="ref-BoscaEtAl2026Ciclo"/>
+    <w:bookmarkEnd w:id="250"/>
+    <w:bookmarkStart w:id="252" w:name="ref-BoscaEtAl2026Ciclo"/>
     <w:p>
       <w:pPr>
         <w:pStyle w:val="Bibliography"/>
@@ -61317,7 +61225,7 @@
       <w:r>
         <w:t xml:space="preserve"> </w:t>
       </w:r>
-      <w:hyperlink r:id="rId252">
+      <w:hyperlink r:id="rId251">
         <w:r>
           <w:rPr>
             <w:rStyle w:val="Hyperlink"/>
@@ -61329,8 +61237,8 @@
         <w:t xml:space="preserve">.</w:t>
       </w:r>
     </w:p>
-    <w:bookmarkEnd w:id="253"/>
-    <w:bookmarkStart w:id="255" w:name="ref-Brouwer1911Abbildung"/>
+    <w:bookmarkEnd w:id="252"/>
+    <w:bookmarkStart w:id="254" w:name="ref-Brouwer1911Abbildung"/>
     <w:p>
       <w:pPr>
         <w:pStyle w:val="Bibliography"/>
@@ -61366,7 +61274,7 @@
       <w:r>
         <w:t xml:space="preserve"> </w:t>
       </w:r>
-      <w:hyperlink r:id="rId254">
+      <w:hyperlink r:id="rId253">
         <w:r>
           <w:rPr>
             <w:rStyle w:val="Hyperlink"/>
@@ -61378,8 +61286,8 @@
         <w:t xml:space="preserve">.</w:t>
       </w:r>
     </w:p>
-    <w:bookmarkEnd w:id="255"/>
-    <w:bookmarkStart w:id="256" w:name="ref-Clower1967Reconsideration"/>
+    <w:bookmarkEnd w:id="254"/>
+    <w:bookmarkStart w:id="255" w:name="ref-Clower1967Reconsideration"/>
     <w:p>
       <w:pPr>
         <w:pStyle w:val="Bibliography"/>
@@ -61413,8 +61321,8 @@
         <w:t xml:space="preserve">6 (1): 1-8.</w:t>
       </w:r>
     </w:p>
-    <w:bookmarkEnd w:id="256"/>
-    <w:bookmarkStart w:id="258" w:name="ref-CoenenEtAl2018NAWMII"/>
+    <w:bookmarkEnd w:id="255"/>
+    <w:bookmarkStart w:id="257" w:name="ref-CoenenEtAl2018NAWMII"/>
     <w:p>
       <w:pPr>
         <w:pStyle w:val="Bibliography"/>
@@ -61434,7 +61342,7 @@
       <w:r>
         <w:t xml:space="preserve"> </w:t>
       </w:r>
-      <w:hyperlink r:id="rId257">
+      <w:hyperlink r:id="rId256">
         <w:r>
           <w:rPr>
             <w:rStyle w:val="Hyperlink"/>
@@ -61446,8 +61354,8 @@
         <w:t xml:space="preserve">.</w:t>
       </w:r>
     </w:p>
-    <w:bookmarkEnd w:id="258"/>
-    <w:bookmarkStart w:id="260" w:name="ref-JRC2026QUEST"/>
+    <w:bookmarkEnd w:id="257"/>
+    <w:bookmarkStart w:id="259" w:name="ref-JRC2026QUEST"/>
     <w:p>
       <w:pPr>
         <w:pStyle w:val="Bibliography"/>
@@ -61467,7 +61375,7 @@
       <w:r>
         <w:t xml:space="preserve"> </w:t>
       </w:r>
-      <w:hyperlink r:id="rId259">
+      <w:hyperlink r:id="rId258">
         <w:r>
           <w:rPr>
             <w:rStyle w:val="Hyperlink"/>
@@ -61479,8 +61387,8 @@
         <w:t xml:space="preserve">.</w:t>
       </w:r>
     </w:p>
-    <w:bookmarkEnd w:id="260"/>
-    <w:bookmarkStart w:id="262" w:name="ref-CE2025MercosurAnalisis"/>
+    <w:bookmarkEnd w:id="259"/>
+    <w:bookmarkStart w:id="261" w:name="ref-CE2025MercosurAnalisis"/>
     <w:p>
       <w:pPr>
         <w:pStyle w:val="Bibliography"/>
@@ -61500,7 +61408,7 @@
       <w:r>
         <w:t xml:space="preserve"> </w:t>
       </w:r>
-      <w:hyperlink r:id="rId261">
+      <w:hyperlink r:id="rId260">
         <w:r>
           <w:rPr>
             <w:rStyle w:val="Hyperlink"/>
@@ -61512,8 +61420,8 @@
         <w:t xml:space="preserve">.</w:t>
       </w:r>
     </w:p>
-    <w:bookmarkEnd w:id="262"/>
-    <w:bookmarkStart w:id="264" w:name="ref-Consejo2019DecisionEEUU"/>
+    <w:bookmarkEnd w:id="261"/>
+    <w:bookmarkStart w:id="263" w:name="ref-Consejo2019DecisionEEUU"/>
     <w:p>
       <w:pPr>
         <w:pStyle w:val="Bibliography"/>
@@ -61533,7 +61441,7 @@
       <w:r>
         <w:t xml:space="preserve"> </w:t>
       </w:r>
-      <w:hyperlink r:id="rId263">
+      <w:hyperlink r:id="rId262">
         <w:r>
           <w:rPr>
             <w:rStyle w:val="Hyperlink"/>
@@ -61545,8 +61453,8 @@
         <w:t xml:space="preserve">.</w:t>
       </w:r>
     </w:p>
-    <w:bookmarkEnd w:id="264"/>
-    <w:bookmarkStart w:id="265" w:name="ref-CooperJohn1988Coordinating"/>
+    <w:bookmarkEnd w:id="263"/>
+    <w:bookmarkStart w:id="264" w:name="ref-CooperJohn1988Coordinating"/>
     <w:p>
       <w:pPr>
         <w:pStyle w:val="Bibliography"/>
@@ -61580,8 +61488,8 @@
         <w:t xml:space="preserve">103 (3): 441-63.</w:t>
       </w:r>
     </w:p>
-    <w:bookmarkEnd w:id="265"/>
-    <w:bookmarkStart w:id="266" w:name="ref-DeVroey2004History"/>
+    <w:bookmarkEnd w:id="264"/>
+    <w:bookmarkStart w:id="265" w:name="ref-DeVroey2004History"/>
     <w:p>
       <w:pPr>
         <w:pStyle w:val="Bibliography"/>
@@ -61615,8 +61523,8 @@
         <w:t xml:space="preserve">36 (5 (suplemento)): 57-91.</w:t>
       </w:r>
     </w:p>
-    <w:bookmarkEnd w:id="266"/>
-    <w:bookmarkStart w:id="268" w:name="ref-Debreu1951Coefficient"/>
+    <w:bookmarkEnd w:id="265"/>
+    <w:bookmarkStart w:id="267" w:name="ref-Debreu1951Coefficient"/>
     <w:p>
       <w:pPr>
         <w:pStyle w:val="Bibliography"/>
@@ -61652,7 +61560,7 @@
       <w:r>
         <w:t xml:space="preserve"> </w:t>
       </w:r>
-      <w:hyperlink r:id="rId267">
+      <w:hyperlink r:id="rId266">
         <w:r>
           <w:rPr>
             <w:rStyle w:val="Hyperlink"/>
@@ -61664,8 +61572,8 @@
         <w:t xml:space="preserve">.</w:t>
       </w:r>
     </w:p>
-    <w:bookmarkEnd w:id="268"/>
-    <w:bookmarkStart w:id="270" w:name="ref-Debreu1959Theory"/>
+    <w:bookmarkEnd w:id="267"/>
+    <w:bookmarkStart w:id="269" w:name="ref-Debreu1959Theory"/>
     <w:p>
       <w:pPr>
         <w:pStyle w:val="Bibliography"/>
@@ -61689,7 +61597,7 @@
       <w:r>
         <w:t xml:space="preserve"> </w:t>
       </w:r>
-      <w:hyperlink r:id="rId269">
+      <w:hyperlink r:id="rId268">
         <w:r>
           <w:rPr>
             <w:rStyle w:val="Hyperlink"/>
@@ -61701,8 +61609,8 @@
         <w:t xml:space="preserve">.</w:t>
       </w:r>
     </w:p>
-    <w:bookmarkEnd w:id="270"/>
-    <w:bookmarkStart w:id="272" w:name="ref-Debreu1970Economies"/>
+    <w:bookmarkEnd w:id="269"/>
+    <w:bookmarkStart w:id="271" w:name="ref-Debreu1970Economies"/>
     <w:p>
       <w:pPr>
         <w:pStyle w:val="Bibliography"/>
@@ -61738,7 +61646,7 @@
       <w:r>
         <w:t xml:space="preserve"> </w:t>
       </w:r>
-      <w:hyperlink r:id="rId271">
+      <w:hyperlink r:id="rId270">
         <w:r>
           <w:rPr>
             <w:rStyle w:val="Hyperlink"/>
@@ -61750,8 +61658,8 @@
         <w:t xml:space="preserve">.</w:t>
       </w:r>
     </w:p>
-    <w:bookmarkEnd w:id="272"/>
-    <w:bookmarkStart w:id="274" w:name="ref-Debreu1974Excess"/>
+    <w:bookmarkEnd w:id="271"/>
+    <w:bookmarkStart w:id="273" w:name="ref-Debreu1974Excess"/>
     <w:p>
       <w:pPr>
         <w:pStyle w:val="Bibliography"/>
@@ -61787,7 +61695,7 @@
       <w:r>
         <w:t xml:space="preserve"> </w:t>
       </w:r>
-      <w:hyperlink r:id="rId273">
+      <w:hyperlink r:id="rId272">
         <w:r>
           <w:rPr>
             <w:rStyle w:val="Hyperlink"/>
@@ -61799,8 +61707,8 @@
         <w:t xml:space="preserve">.</w:t>
       </w:r>
     </w:p>
-    <w:bookmarkEnd w:id="274"/>
-    <w:bookmarkStart w:id="276" w:name="ref-DebreuScarf1963Limit"/>
+    <w:bookmarkEnd w:id="273"/>
+    <w:bookmarkStart w:id="275" w:name="ref-DebreuScarf1963Limit"/>
     <w:p>
       <w:pPr>
         <w:pStyle w:val="Bibliography"/>
@@ -61836,7 +61744,7 @@
       <w:r>
         <w:t xml:space="preserve"> </w:t>
       </w:r>
-      <w:hyperlink r:id="rId275">
+      <w:hyperlink r:id="rId274">
         <w:r>
           <w:rPr>
             <w:rStyle w:val="Hyperlink"/>
@@ -61848,8 +61756,8 @@
         <w:t xml:space="preserve">.</w:t>
       </w:r>
     </w:p>
-    <w:bookmarkEnd w:id="276"/>
-    <w:bookmarkStart w:id="277" w:name="ref-DelgadoToral2014Introduccion"/>
+    <w:bookmarkEnd w:id="275"/>
+    <w:bookmarkStart w:id="276" w:name="ref-DelgadoToral2014Introduccion"/>
     <w:p>
       <w:pPr>
         <w:pStyle w:val="Bibliography"/>
@@ -61882,7 +61790,7 @@
       <w:r>
         <w:t xml:space="preserve"> </w:t>
       </w:r>
-      <w:hyperlink r:id="rId82">
+      <w:hyperlink r:id="rId81">
         <w:r>
           <w:rPr>
             <w:rStyle w:val="Hyperlink"/>
@@ -61894,8 +61802,8 @@
         <w:t xml:space="preserve">.</w:t>
       </w:r>
     </w:p>
-    <w:bookmarkEnd w:id="277"/>
-    <w:bookmarkStart w:id="278" w:name="ref-Dierker1972Two"/>
+    <w:bookmarkEnd w:id="276"/>
+    <w:bookmarkStart w:id="277" w:name="ref-Dierker1972Two"/>
     <w:p>
       <w:pPr>
         <w:pStyle w:val="Bibliography"/>
@@ -61929,8 +61837,8 @@
         <w:t xml:space="preserve">40 (5): 951-53.</w:t>
       </w:r>
     </w:p>
-    <w:bookmarkEnd w:id="278"/>
-    <w:bookmarkStart w:id="279" w:name="ref-Edgeworth1881Mathematical"/>
+    <w:bookmarkEnd w:id="277"/>
+    <w:bookmarkStart w:id="278" w:name="ref-Edgeworth1881Mathematical"/>
     <w:p>
       <w:pPr>
         <w:pStyle w:val="Bibliography"/>
@@ -61952,8 +61860,8 @@
         <w:t xml:space="preserve">. Londres: C. Kegan Paul.</w:t>
       </w:r>
     </w:p>
-    <w:bookmarkEnd w:id="279"/>
-    <w:bookmarkStart w:id="280" w:name="ref-EkelundHebert2013History"/>
+    <w:bookmarkEnd w:id="278"/>
+    <w:bookmarkStart w:id="279" w:name="ref-EkelundHebert2013History"/>
     <w:p>
       <w:pPr>
         <w:pStyle w:val="Bibliography"/>
@@ -61975,8 +61883,8 @@
         <w:t xml:space="preserve">. 6.ª ed. Long Grove (Illinois): Waveland Press.</w:t>
       </w:r>
     </w:p>
-    <w:bookmarkEnd w:id="280"/>
-    <w:bookmarkStart w:id="281" w:name="ref-Feldman1987Welfare"/>
+    <w:bookmarkEnd w:id="279"/>
+    <w:bookmarkStart w:id="280" w:name="ref-Feldman1987Welfare"/>
     <w:p>
       <w:pPr>
         <w:pStyle w:val="Bibliography"/>
@@ -62007,8 +61915,8 @@
         <w:t xml:space="preserve">, editado por John Eatwell, Murray Milgate y Peter Newman. Vol. 4. Londres: Macmillan.</w:t>
       </w:r>
     </w:p>
-    <w:bookmarkEnd w:id="281"/>
-    <w:bookmarkStart w:id="282" w:name="ref-Foley1967Resource"/>
+    <w:bookmarkEnd w:id="280"/>
+    <w:bookmarkStart w:id="281" w:name="ref-Foley1967Resource"/>
     <w:p>
       <w:pPr>
         <w:pStyle w:val="Bibliography"/>
@@ -62042,8 +61950,8 @@
         <w:t xml:space="preserve">7 (1): 45-98.</w:t>
       </w:r>
     </w:p>
-    <w:bookmarkEnd w:id="282"/>
-    <w:bookmarkStart w:id="284" w:name="ref-FrancoisEtAl2013TTIP"/>
+    <w:bookmarkEnd w:id="281"/>
+    <w:bookmarkStart w:id="283" w:name="ref-FrancoisEtAl2013TTIP"/>
     <w:p>
       <w:pPr>
         <w:pStyle w:val="Bibliography"/>
@@ -62063,7 +61971,7 @@
       <w:r>
         <w:t xml:space="preserve"> </w:t>
       </w:r>
-      <w:hyperlink r:id="rId283">
+      <w:hyperlink r:id="rId282">
         <w:r>
           <w:rPr>
             <w:rStyle w:val="Hyperlink"/>
@@ -62075,8 +61983,8 @@
         <w:t xml:space="preserve">.</w:t>
       </w:r>
     </w:p>
-    <w:bookmarkEnd w:id="284"/>
-    <w:bookmarkStart w:id="285" w:name="ref-GabszewiczVial1972Oligopoly"/>
+    <w:bookmarkEnd w:id="283"/>
+    <w:bookmarkStart w:id="284" w:name="ref-GabszewiczVial1972Oligopoly"/>
     <w:p>
       <w:pPr>
         <w:pStyle w:val="Bibliography"/>
@@ -62110,8 +62018,8 @@
         <w:t xml:space="preserve">4 (3): 381-400.</w:t>
       </w:r>
     </w:p>
-    <w:bookmarkEnd w:id="285"/>
-    <w:bookmarkStart w:id="287" w:name="ref-Gale1955Law"/>
+    <w:bookmarkEnd w:id="284"/>
+    <w:bookmarkStart w:id="286" w:name="ref-Gale1955Law"/>
     <w:p>
       <w:pPr>
         <w:pStyle w:val="Bibliography"/>
@@ -62147,7 +62055,7 @@
       <w:r>
         <w:t xml:space="preserve"> </w:t>
       </w:r>
-      <w:hyperlink r:id="rId286">
+      <w:hyperlink r:id="rId285">
         <w:r>
           <w:rPr>
             <w:rStyle w:val="Hyperlink"/>
@@ -62159,8 +62067,8 @@
         <w:t xml:space="preserve">.</w:t>
       </w:r>
     </w:p>
-    <w:bookmarkEnd w:id="287"/>
-    <w:bookmarkStart w:id="289" w:name="ref-Gale1976Linear"/>
+    <w:bookmarkEnd w:id="286"/>
+    <w:bookmarkStart w:id="288" w:name="ref-Gale1976Linear"/>
     <w:p>
       <w:pPr>
         <w:pStyle w:val="Bibliography"/>
@@ -62196,7 +62104,7 @@
       <w:r>
         <w:t xml:space="preserve"> </w:t>
       </w:r>
-      <w:hyperlink r:id="rId288">
+      <w:hyperlink r:id="rId287">
         <w:r>
           <w:rPr>
             <w:rStyle w:val="Hyperlink"/>
@@ -62208,8 +62116,8 @@
         <w:t xml:space="preserve">.</w:t>
       </w:r>
     </w:p>
-    <w:bookmarkEnd w:id="289"/>
-    <w:bookmarkStart w:id="290" w:name="X5282c39af3d56c258586e1f0ea5992ba9b44b54"/>
+    <w:bookmarkEnd w:id="288"/>
+    <w:bookmarkStart w:id="289" w:name="X5282c39af3d56c258586e1f0ea5992ba9b44b54"/>
     <w:p>
       <w:pPr>
         <w:pStyle w:val="Bibliography"/>
@@ -62240,8 +62148,8 @@
         <w:t xml:space="preserve">, editado por Walter P. Heller, Ross M. Starr y David A. Starrett, 3:65-95. Cambridge: Cambridge University Press.</w:t>
       </w:r>
     </w:p>
-    <w:bookmarkEnd w:id="290"/>
-    <w:bookmarkStart w:id="291" w:name="ref-GeanakoplosMasColell1989Real"/>
+    <w:bookmarkEnd w:id="289"/>
+    <w:bookmarkStart w:id="290" w:name="ref-GeanakoplosMasColell1989Real"/>
     <w:p>
       <w:pPr>
         <w:pStyle w:val="Bibliography"/>
@@ -62275,8 +62183,8 @@
         <w:t xml:space="preserve">47 (1): 22-38.</w:t>
       </w:r>
     </w:p>
-    <w:bookmarkEnd w:id="291"/>
-    <w:bookmarkStart w:id="292" w:name="ref-Gillies1959Solutions"/>
+    <w:bookmarkEnd w:id="290"/>
+    <w:bookmarkStart w:id="291" w:name="ref-Gillies1959Solutions"/>
     <w:p>
       <w:pPr>
         <w:pStyle w:val="Bibliography"/>
@@ -62307,8 +62215,8 @@
         <w:t xml:space="preserve">, editado por Albert W. Tucker y R. Duncan Luce, 47-85. Annals of Mathematics Studies 40. Princeton: Princeton University Press.</w:t>
       </w:r>
     </w:p>
-    <w:bookmarkEnd w:id="292"/>
-    <w:bookmarkStart w:id="293" w:name="ref-GravelleRees2004Microeconomics"/>
+    <w:bookmarkEnd w:id="291"/>
+    <w:bookmarkStart w:id="292" w:name="ref-GravelleRees2004Microeconomics"/>
     <w:p>
       <w:pPr>
         <w:pStyle w:val="Bibliography"/>
@@ -62330,8 +62238,8 @@
         <w:t xml:space="preserve">. 3.ª ed. Harlow: Financial Times/Prentice Hall.</w:t>
       </w:r>
     </w:p>
-    <w:bookmarkEnd w:id="293"/>
-    <w:bookmarkStart w:id="295" w:name="ref-Gronau1977Leisure"/>
+    <w:bookmarkEnd w:id="292"/>
+    <w:bookmarkStart w:id="294" w:name="ref-Gronau1977Leisure"/>
     <w:p>
       <w:pPr>
         <w:pStyle w:val="Bibliography"/>
@@ -62367,7 +62275,7 @@
       <w:r>
         <w:t xml:space="preserve"> </w:t>
       </w:r>
-      <w:hyperlink r:id="rId294">
+      <w:hyperlink r:id="rId293">
         <w:r>
           <w:rPr>
             <w:rStyle w:val="Hyperlink"/>
@@ -62379,8 +62287,8 @@
         <w:t xml:space="preserve">.</w:t>
       </w:r>
     </w:p>
-    <w:bookmarkEnd w:id="295"/>
-    <w:bookmarkStart w:id="296" w:name="ref-Hahn1965Problems"/>
+    <w:bookmarkEnd w:id="294"/>
+    <w:bookmarkStart w:id="295" w:name="ref-Hahn1965Problems"/>
     <w:p>
       <w:pPr>
         <w:pStyle w:val="Bibliography"/>
@@ -62411,8 +62319,8 @@
         <w:t xml:space="preserve">, editado por Frank H. Hahn y F. P. R. Brechling, 126-35. Londres: Macmillan.</w:t>
       </w:r>
     </w:p>
-    <w:bookmarkEnd w:id="296"/>
-    <w:bookmarkStart w:id="297" w:name="ref-Hahn1982Money"/>
+    <w:bookmarkEnd w:id="295"/>
+    <w:bookmarkStart w:id="296" w:name="ref-Hahn1982Money"/>
     <w:p>
       <w:pPr>
         <w:pStyle w:val="Bibliography"/>
@@ -62434,8 +62342,8 @@
         <w:t xml:space="preserve">. Oxford: Basil Blackwell.</w:t>
       </w:r>
     </w:p>
-    <w:bookmarkEnd w:id="297"/>
-    <w:bookmarkStart w:id="298" w:name="ref-Hart1975Optimality"/>
+    <w:bookmarkEnd w:id="296"/>
+    <w:bookmarkStart w:id="297" w:name="ref-Hart1975Optimality"/>
     <w:p>
       <w:pPr>
         <w:pStyle w:val="Bibliography"/>
@@ -62469,8 +62377,8 @@
         <w:t xml:space="preserve">11 (3): 418-43.</w:t>
       </w:r>
     </w:p>
-    <w:bookmarkEnd w:id="298"/>
-    <w:bookmarkStart w:id="299" w:name="ref-Hayek1945Use"/>
+    <w:bookmarkEnd w:id="297"/>
+    <w:bookmarkStart w:id="298" w:name="ref-Hayek1945Use"/>
     <w:p>
       <w:pPr>
         <w:pStyle w:val="Bibliography"/>
@@ -62504,8 +62412,8 @@
         <w:t xml:space="preserve">35 (4): 519-30.</w:t>
       </w:r>
     </w:p>
-    <w:bookmarkEnd w:id="299"/>
-    <w:bookmarkStart w:id="300" w:name="ref-Hicks1939Value"/>
+    <w:bookmarkEnd w:id="298"/>
+    <w:bookmarkStart w:id="299" w:name="ref-Hicks1939Value"/>
     <w:p>
       <w:pPr>
         <w:pStyle w:val="Bibliography"/>
@@ -62527,8 +62435,8 @@
         <w:t xml:space="preserve">. Oxford: Clarendon Press.</w:t>
       </w:r>
     </w:p>
-    <w:bookmarkEnd w:id="300"/>
-    <w:bookmarkStart w:id="301" w:name="ref-Hurwicz1972Informationally"/>
+    <w:bookmarkEnd w:id="299"/>
+    <w:bookmarkStart w:id="300" w:name="ref-Hurwicz1972Informationally"/>
     <w:p>
       <w:pPr>
         <w:pStyle w:val="Bibliography"/>
@@ -62559,27 +62467,27 @@
         <w:t xml:space="preserve">, editado por C. B. McGuire y Roy Radner, 297-336. Ámsterdam: North-Holland.</w:t>
       </w:r>
     </w:p>
+    <w:bookmarkEnd w:id="300"/>
+    <w:bookmarkStart w:id="301" w:name="ref-ICEXCECO3A21"/>
+    <w:p>
+      <w:pPr>
+        <w:pStyle w:val="Bibliography"/>
+      </w:pPr>
+      <w:r>
+        <w:t xml:space="preserve">ICEX-CECO. s. f.</w:t>
+      </w:r>
+      <w:r>
+        <w:t xml:space="preserve"> </w:t>
+      </w:r>
+      <w:r>
+        <w:t xml:space="preserve">«Tema 3.A.21: La teoría del equilibrio general»</w:t>
+      </w:r>
+      <w:r>
+        <w:t xml:space="preserve">. ICEX-CECO.</w:t>
+      </w:r>
+    </w:p>
     <w:bookmarkEnd w:id="301"/>
-    <w:bookmarkStart w:id="302" w:name="ref-ICEXCECO3A21"/>
-    <w:p>
-      <w:pPr>
-        <w:pStyle w:val="Bibliography"/>
-      </w:pPr>
-      <w:r>
-        <w:t xml:space="preserve">ICEX-CECO. s. f.</w:t>
-      </w:r>
-      <w:r>
-        <w:t xml:space="preserve"> </w:t>
-      </w:r>
-      <w:r>
-        <w:t xml:space="preserve">«Tema 3.A.21: La teoría del equilibrio general»</w:t>
-      </w:r>
-      <w:r>
-        <w:t xml:space="preserve">. ICEX-CECO.</w:t>
-      </w:r>
-    </w:p>
-    <w:bookmarkEnd w:id="302"/>
-    <w:bookmarkStart w:id="303" w:name="ref-JehleReny2011Advanced"/>
+    <w:bookmarkStart w:id="302" w:name="ref-JehleReny2011Advanced"/>
     <w:p>
       <w:pPr>
         <w:pStyle w:val="Bibliography"/>
@@ -62601,8 +62509,8 @@
         <w:t xml:space="preserve">. 3.ª ed. Harlow: Financial Times/Prentice Hall.</w:t>
       </w:r>
     </w:p>
-    <w:bookmarkEnd w:id="303"/>
-    <w:bookmarkStart w:id="304" w:name="ref-Jones1965Structure"/>
+    <w:bookmarkEnd w:id="302"/>
+    <w:bookmarkStart w:id="303" w:name="ref-Jones1965Structure"/>
     <w:p>
       <w:pPr>
         <w:pStyle w:val="Bibliography"/>
@@ -62636,8 +62544,8 @@
         <w:t xml:space="preserve">73 (6): 557-72.</w:t>
       </w:r>
     </w:p>
-    <w:bookmarkEnd w:id="304"/>
-    <w:bookmarkStart w:id="306" w:name="ref-Kakutani1941Generalization"/>
+    <w:bookmarkEnd w:id="303"/>
+    <w:bookmarkStart w:id="305" w:name="ref-Kakutani1941Generalization"/>
     <w:p>
       <w:pPr>
         <w:pStyle w:val="Bibliography"/>
@@ -62673,7 +62581,7 @@
       <w:r>
         <w:t xml:space="preserve"> </w:t>
       </w:r>
-      <w:hyperlink r:id="rId305">
+      <w:hyperlink r:id="rId304">
         <w:r>
           <w:rPr>
             <w:rStyle w:val="Hyperlink"/>
@@ -62685,8 +62593,8 @@
         <w:t xml:space="preserve">.</w:t>
       </w:r>
     </w:p>
-    <w:bookmarkEnd w:id="306"/>
-    <w:bookmarkStart w:id="308" w:name="ref-Kehoe2005Evaluation"/>
+    <w:bookmarkEnd w:id="305"/>
+    <w:bookmarkStart w:id="307" w:name="ref-Kehoe2005Evaluation"/>
     <w:p>
       <w:pPr>
         <w:pStyle w:val="Bibliography"/>
@@ -62719,7 +62627,7 @@
       <w:r>
         <w:t xml:space="preserve"> </w:t>
       </w:r>
-      <w:hyperlink r:id="rId307">
+      <w:hyperlink r:id="rId306">
         <w:r>
           <w:rPr>
             <w:rStyle w:val="Hyperlink"/>
@@ -62731,8 +62639,8 @@
         <w:t xml:space="preserve">.</w:t>
       </w:r>
     </w:p>
-    <w:bookmarkEnd w:id="308"/>
-    <w:bookmarkStart w:id="310" w:name="ref-Kirman1992Whom"/>
+    <w:bookmarkEnd w:id="307"/>
+    <w:bookmarkStart w:id="309" w:name="ref-Kirman1992Whom"/>
     <w:p>
       <w:pPr>
         <w:pStyle w:val="Bibliography"/>
@@ -62765,7 +62673,7 @@
       <w:r>
         <w:t xml:space="preserve"> </w:t>
       </w:r>
-      <w:hyperlink r:id="rId309">
+      <w:hyperlink r:id="rId308">
         <w:r>
           <w:rPr>
             <w:rStyle w:val="Hyperlink"/>
@@ -62777,8 +62685,8 @@
         <w:t xml:space="preserve">.</w:t>
       </w:r>
     </w:p>
-    <w:bookmarkEnd w:id="310"/>
-    <w:bookmarkStart w:id="311" w:name="ref-KiyotakiWright1989Money"/>
+    <w:bookmarkEnd w:id="309"/>
+    <w:bookmarkStart w:id="310" w:name="ref-KiyotakiWright1989Money"/>
     <w:p>
       <w:pPr>
         <w:pStyle w:val="Bibliography"/>
@@ -62812,8 +62720,8 @@
         <w:t xml:space="preserve">97 (4): 927-54.</w:t>
       </w:r>
     </w:p>
-    <w:bookmarkEnd w:id="311"/>
-    <w:bookmarkStart w:id="313" w:name="ref-Lancaster1966New"/>
+    <w:bookmarkEnd w:id="310"/>
+    <w:bookmarkStart w:id="312" w:name="ref-Lancaster1966New"/>
     <w:p>
       <w:pPr>
         <w:pStyle w:val="Bibliography"/>
@@ -62849,7 +62757,7 @@
       <w:r>
         <w:t xml:space="preserve"> </w:t>
       </w:r>
-      <w:hyperlink r:id="rId312">
+      <w:hyperlink r:id="rId311">
         <w:r>
           <w:rPr>
             <w:rStyle w:val="Hyperlink"/>
@@ -62861,8 +62769,8 @@
         <w:t xml:space="preserve">.</w:t>
       </w:r>
     </w:p>
-    <w:bookmarkEnd w:id="313"/>
-    <w:bookmarkStart w:id="314" w:name="ref-Lange1936Socialism"/>
+    <w:bookmarkEnd w:id="312"/>
+    <w:bookmarkStart w:id="313" w:name="ref-Lange1936Socialism"/>
     <w:p>
       <w:pPr>
         <w:pStyle w:val="Bibliography"/>
@@ -62896,8 +62804,8 @@
         <w:t xml:space="preserve">4 (1): 53-71.</w:t>
       </w:r>
     </w:p>
-    <w:bookmarkEnd w:id="314"/>
-    <w:bookmarkStart w:id="315" w:name="ref-Lange1942Say"/>
+    <w:bookmarkEnd w:id="313"/>
+    <w:bookmarkStart w:id="314" w:name="ref-Lange1942Say"/>
     <w:p>
       <w:pPr>
         <w:pStyle w:val="Bibliography"/>
@@ -62928,8 +62836,8 @@
         <w:t xml:space="preserve">, editado por Oskar Lange, Francis McIntyre y Theodore O. Yntema, 49-68. Chicago: University of Chicago Press.</w:t>
       </w:r>
     </w:p>
-    <w:bookmarkEnd w:id="315"/>
-    <w:bookmarkStart w:id="317" w:name="ref-Lange1942Foundations"/>
+    <w:bookmarkEnd w:id="314"/>
+    <w:bookmarkStart w:id="316" w:name="ref-Lange1942Foundations"/>
     <w:p>
       <w:pPr>
         <w:pStyle w:val="Bibliography"/>
@@ -62965,7 +62873,7 @@
       <w:r>
         <w:t xml:space="preserve"> </w:t>
       </w:r>
-      <w:hyperlink r:id="rId316">
+      <w:hyperlink r:id="rId315">
         <w:r>
           <w:rPr>
             <w:rStyle w:val="Hyperlink"/>
@@ -62977,8 +62885,8 @@
         <w:t xml:space="preserve">.</w:t>
       </w:r>
     </w:p>
-    <w:bookmarkEnd w:id="317"/>
-    <w:bookmarkStart w:id="319" w:name="ref-Lerner1934Economic"/>
+    <w:bookmarkEnd w:id="316"/>
+    <w:bookmarkStart w:id="318" w:name="ref-Lerner1934Economic"/>
     <w:p>
       <w:pPr>
         <w:pStyle w:val="Bibliography"/>
@@ -63014,7 +62922,7 @@
       <w:r>
         <w:t xml:space="preserve"> </w:t>
       </w:r>
-      <w:hyperlink r:id="rId318">
+      <w:hyperlink r:id="rId317">
         <w:r>
           <w:rPr>
             <w:rStyle w:val="Hyperlink"/>
@@ -63026,8 +62934,8 @@
         <w:t xml:space="preserve">.</w:t>
       </w:r>
     </w:p>
-    <w:bookmarkEnd w:id="319"/>
-    <w:bookmarkStart w:id="320" w:name="ref-Lerner1944Economics"/>
+    <w:bookmarkEnd w:id="318"/>
+    <w:bookmarkStart w:id="319" w:name="ref-Lerner1944Economics"/>
     <w:p>
       <w:pPr>
         <w:pStyle w:val="Bibliography"/>
@@ -63049,8 +62957,8 @@
         <w:t xml:space="preserve">. Nueva York: Macmillan.</w:t>
       </w:r>
     </w:p>
-    <w:bookmarkEnd w:id="320"/>
-    <w:bookmarkStart w:id="321" w:name="ref-Liu2019Fixed"/>
+    <w:bookmarkEnd w:id="319"/>
+    <w:bookmarkStart w:id="320" w:name="ref-Liu2019Fixed"/>
     <w:p>
       <w:pPr>
         <w:pStyle w:val="Bibliography"/>
@@ -63070,7 +62978,7 @@
       <w:r>
         <w:t xml:space="preserve"> </w:t>
       </w:r>
-      <w:hyperlink r:id="rId83">
+      <w:hyperlink r:id="rId82">
         <w:r>
           <w:rPr>
             <w:rStyle w:val="Hyperlink"/>
@@ -63082,8 +62990,8 @@
         <w:t xml:space="preserve">.</w:t>
       </w:r>
     </w:p>
-    <w:bookmarkEnd w:id="321"/>
-    <w:bookmarkStart w:id="323" w:name="ref-Mantel1974Characterization"/>
+    <w:bookmarkEnd w:id="320"/>
+    <w:bookmarkStart w:id="322" w:name="ref-Mantel1974Characterization"/>
     <w:p>
       <w:pPr>
         <w:pStyle w:val="Bibliography"/>
@@ -63119,7 +63027,7 @@
       <w:r>
         <w:t xml:space="preserve"> </w:t>
       </w:r>
-      <w:hyperlink r:id="rId322">
+      <w:hyperlink r:id="rId321">
         <w:r>
           <w:rPr>
             <w:rStyle w:val="Hyperlink"/>
@@ -63131,8 +63039,8 @@
         <w:t xml:space="preserve">.</w:t>
       </w:r>
     </w:p>
-    <w:bookmarkEnd w:id="323"/>
-    <w:bookmarkStart w:id="325" w:name="ref-MartinezGiralt2008Microeconomia"/>
+    <w:bookmarkEnd w:id="322"/>
+    <w:bookmarkStart w:id="324" w:name="ref-MartinezGiralt2008Microeconomia"/>
     <w:p>
       <w:pPr>
         <w:pStyle w:val="Bibliography"/>
@@ -63156,7 +63064,7 @@
       <w:r>
         <w:t xml:space="preserve"> </w:t>
       </w:r>
-      <w:hyperlink r:id="rId324">
+      <w:hyperlink r:id="rId323">
         <w:r>
           <w:rPr>
             <w:rStyle w:val="Hyperlink"/>
@@ -63168,8 +63076,8 @@
         <w:t xml:space="preserve">.</w:t>
       </w:r>
     </w:p>
-    <w:bookmarkEnd w:id="325"/>
-    <w:bookmarkStart w:id="326" w:name="ref-MasColellWhinstonGreen1995"/>
+    <w:bookmarkEnd w:id="324"/>
+    <w:bookmarkStart w:id="325" w:name="ref-MasColellWhinstonGreen1995"/>
     <w:p>
       <w:pPr>
         <w:pStyle w:val="Bibliography"/>
@@ -63191,8 +63099,8 @@
         <w:t xml:space="preserve">. Nueva York: Oxford University Press.</w:t>
       </w:r>
     </w:p>
-    <w:bookmarkEnd w:id="326"/>
-    <w:bookmarkStart w:id="328" w:name="ref-McKenzie1954Equilibrium"/>
+    <w:bookmarkEnd w:id="325"/>
+    <w:bookmarkStart w:id="327" w:name="ref-McKenzie1954Equilibrium"/>
     <w:p>
       <w:pPr>
         <w:pStyle w:val="Bibliography"/>
@@ -63228,7 +63136,7 @@
       <w:r>
         <w:t xml:space="preserve"> </w:t>
       </w:r>
-      <w:hyperlink r:id="rId327">
+      <w:hyperlink r:id="rId326">
         <w:r>
           <w:rPr>
             <w:rStyle w:val="Hyperlink"/>
@@ -63240,8 +63148,8 @@
         <w:t xml:space="preserve">.</w:t>
       </w:r>
     </w:p>
-    <w:bookmarkEnd w:id="328"/>
-    <w:bookmarkStart w:id="329" w:name="ref-McKenzie1959Existence"/>
+    <w:bookmarkEnd w:id="327"/>
+    <w:bookmarkStart w:id="328" w:name="ref-McKenzie1959Existence"/>
     <w:p>
       <w:pPr>
         <w:pStyle w:val="Bibliography"/>
@@ -63275,8 +63183,8 @@
         <w:t xml:space="preserve">27 (1): 54-71.</w:t>
       </w:r>
     </w:p>
-    <w:bookmarkEnd w:id="329"/>
-    <w:bookmarkStart w:id="330" w:name="ref-Metzler1945Stability"/>
+    <w:bookmarkEnd w:id="328"/>
+    <w:bookmarkStart w:id="329" w:name="ref-Metzler1945Stability"/>
     <w:p>
       <w:pPr>
         <w:pStyle w:val="Bibliography"/>
@@ -63310,8 +63218,8 @@
         <w:t xml:space="preserve">13 (4): 277-92.</w:t>
       </w:r>
     </w:p>
-    <w:bookmarkEnd w:id="330"/>
-    <w:bookmarkStart w:id="331" w:name="ref-Mill1844Essays"/>
+    <w:bookmarkEnd w:id="329"/>
+    <w:bookmarkStart w:id="330" w:name="ref-Mill1844Essays"/>
     <w:p>
       <w:pPr>
         <w:pStyle w:val="Bibliography"/>
@@ -63333,8 +63241,8 @@
         <w:t xml:space="preserve">. Londres: John W. Parker.</w:t>
       </w:r>
     </w:p>
-    <w:bookmarkEnd w:id="331"/>
-    <w:bookmarkStart w:id="332" w:name="ref-Mises1920Wirtschaftsrechnung"/>
+    <w:bookmarkEnd w:id="330"/>
+    <w:bookmarkStart w:id="331" w:name="ref-Mises1920Wirtschaftsrechnung"/>
     <w:p>
       <w:pPr>
         <w:pStyle w:val="Bibliography"/>
@@ -63368,8 +63276,8 @@
         <w:t xml:space="preserve">47: 86-121.</w:t>
       </w:r>
     </w:p>
-    <w:bookmarkEnd w:id="332"/>
-    <w:bookmarkStart w:id="333" w:name="ref-Musgrave1959Theory"/>
+    <w:bookmarkEnd w:id="331"/>
+    <w:bookmarkStart w:id="332" w:name="ref-Musgrave1959Theory"/>
     <w:p>
       <w:pPr>
         <w:pStyle w:val="Bibliography"/>
@@ -63391,8 +63299,8 @@
         <w:t xml:space="preserve">. Nueva York: McGraw-Hill.</w:t>
       </w:r>
     </w:p>
-    <w:bookmarkEnd w:id="333"/>
-    <w:bookmarkStart w:id="334" w:name="ref-Myerson1979Incentive"/>
+    <w:bookmarkEnd w:id="332"/>
+    <w:bookmarkStart w:id="333" w:name="ref-Myerson1979Incentive"/>
     <w:p>
       <w:pPr>
         <w:pStyle w:val="Bibliography"/>
@@ -63426,8 +63334,8 @@
         <w:t xml:space="preserve">47 (1): 61-73.</w:t>
       </w:r>
     </w:p>
-    <w:bookmarkEnd w:id="334"/>
-    <w:bookmarkStart w:id="336" w:name="ref-Nash1950Equilibrium"/>
+    <w:bookmarkEnd w:id="333"/>
+    <w:bookmarkStart w:id="335" w:name="ref-Nash1950Equilibrium"/>
     <w:p>
       <w:pPr>
         <w:pStyle w:val="Bibliography"/>
@@ -63463,7 +63371,7 @@
       <w:r>
         <w:t xml:space="preserve"> </w:t>
       </w:r>
-      <w:hyperlink r:id="rId335">
+      <w:hyperlink r:id="rId334">
         <w:r>
           <w:rPr>
             <w:rStyle w:val="Hyperlink"/>
@@ -63475,8 +63383,8 @@
         <w:t xml:space="preserve">.</w:t>
       </w:r>
     </w:p>
-    <w:bookmarkEnd w:id="336"/>
-    <w:bookmarkStart w:id="338" w:name="ref-Nash1950Bargaining"/>
+    <w:bookmarkEnd w:id="335"/>
+    <w:bookmarkStart w:id="337" w:name="ref-Nash1950Bargaining"/>
     <w:p>
       <w:pPr>
         <w:pStyle w:val="Bibliography"/>
@@ -63512,7 +63420,7 @@
       <w:r>
         <w:t xml:space="preserve"> </w:t>
       </w:r>
-      <w:hyperlink r:id="rId337">
+      <w:hyperlink r:id="rId336">
         <w:r>
           <w:rPr>
             <w:rStyle w:val="Hyperlink"/>
@@ -63524,8 +63432,8 @@
         <w:t xml:space="preserve">.</w:t>
       </w:r>
     </w:p>
-    <w:bookmarkEnd w:id="338"/>
-    <w:bookmarkStart w:id="339" w:name="ref-Negishi1961Monopolistic"/>
+    <w:bookmarkEnd w:id="337"/>
+    <w:bookmarkStart w:id="338" w:name="ref-Negishi1961Monopolistic"/>
     <w:p>
       <w:pPr>
         <w:pStyle w:val="Bibliography"/>
@@ -63559,8 +63467,8 @@
         <w:t xml:space="preserve">28 (3): 196-201.</w:t>
       </w:r>
     </w:p>
-    <w:bookmarkEnd w:id="339"/>
-    <w:bookmarkStart w:id="340" w:name="ref-VonNeumann1937Gleichungssystem"/>
+    <w:bookmarkEnd w:id="338"/>
+    <w:bookmarkStart w:id="339" w:name="ref-VonNeumann1937Gleichungssystem"/>
     <w:p>
       <w:pPr>
         <w:pStyle w:val="Bibliography"/>
@@ -63594,8 +63502,8 @@
         <w:t xml:space="preserve">8: 73-83.</w:t>
       </w:r>
     </w:p>
-    <w:bookmarkEnd w:id="340"/>
-    <w:bookmarkStart w:id="342" w:name="ref-Nikaido1956Classical"/>
+    <w:bookmarkEnd w:id="339"/>
+    <w:bookmarkStart w:id="341" w:name="ref-Nikaido1956Classical"/>
     <w:p>
       <w:pPr>
         <w:pStyle w:val="Bibliography"/>
@@ -63631,7 +63539,7 @@
       <w:r>
         <w:t xml:space="preserve"> </w:t>
       </w:r>
-      <w:hyperlink r:id="rId341">
+      <w:hyperlink r:id="rId340">
         <w:r>
           <w:rPr>
             <w:rStyle w:val="Hyperlink"/>
@@ -63643,8 +63551,8 @@
         <w:t xml:space="preserve">.</w:t>
       </w:r>
     </w:p>
-    <w:bookmarkEnd w:id="342"/>
-    <w:bookmarkStart w:id="344" w:name="ref-USTR2026USMCAReview"/>
+    <w:bookmarkEnd w:id="341"/>
+    <w:bookmarkStart w:id="343" w:name="ref-USTR2026USMCAReview"/>
     <w:p>
       <w:pPr>
         <w:pStyle w:val="Bibliography"/>
@@ -63664,7 +63572,7 @@
       <w:r>
         <w:t xml:space="preserve"> </w:t>
       </w:r>
-      <w:hyperlink r:id="rId343">
+      <w:hyperlink r:id="rId342">
         <w:r>
           <w:rPr>
             <w:rStyle w:val="Hyperlink"/>
@@ -63676,8 +63584,8 @@
         <w:t xml:space="preserve">.</w:t>
       </w:r>
     </w:p>
-    <w:bookmarkEnd w:id="344"/>
-    <w:bookmarkStart w:id="345" w:name="ref-Pareto1906Manuale"/>
+    <w:bookmarkEnd w:id="343"/>
+    <w:bookmarkStart w:id="344" w:name="ref-Pareto1906Manuale"/>
     <w:p>
       <w:pPr>
         <w:pStyle w:val="Bibliography"/>
@@ -63699,8 +63607,8 @@
         <w:t xml:space="preserve">. Milán: Società Editrice Libraria.</w:t>
       </w:r>
     </w:p>
-    <w:bookmarkEnd w:id="345"/>
-    <w:bookmarkStart w:id="346" w:name="ref-Patinkin1956Money"/>
+    <w:bookmarkEnd w:id="344"/>
+    <w:bookmarkStart w:id="345" w:name="ref-Patinkin1956Money"/>
     <w:p>
       <w:pPr>
         <w:pStyle w:val="Bibliography"/>
@@ -63722,8 +63630,8 @@
         <w:t xml:space="preserve">. Evanston: Row, Peterson.</w:t>
       </w:r>
     </w:p>
-    <w:bookmarkEnd w:id="346"/>
-    <w:bookmarkStart w:id="347" w:name="ref-Patinkin1965Money"/>
+    <w:bookmarkEnd w:id="345"/>
+    <w:bookmarkStart w:id="346" w:name="ref-Patinkin1965Money"/>
     <w:p>
       <w:pPr>
         <w:pStyle w:val="Bibliography"/>
@@ -63745,8 +63653,8 @@
         <w:t xml:space="preserve">. 2.ª ed. Nueva York: Harper &amp; Row.</w:t>
       </w:r>
     </w:p>
-    <w:bookmarkEnd w:id="347"/>
-    <w:bookmarkStart w:id="349" w:name="ref-Radner1972Existence"/>
+    <w:bookmarkEnd w:id="346"/>
+    <w:bookmarkStart w:id="348" w:name="ref-Radner1972Existence"/>
     <w:p>
       <w:pPr>
         <w:pStyle w:val="Bibliography"/>
@@ -63782,7 +63690,7 @@
       <w:r>
         <w:t xml:space="preserve"> </w:t>
       </w:r>
-      <w:hyperlink r:id="rId348">
+      <w:hyperlink r:id="rId347">
         <w:r>
           <w:rPr>
             <w:rStyle w:val="Hyperlink"/>
@@ -63794,8 +63702,8 @@
         <w:t xml:space="preserve">.</w:t>
       </w:r>
     </w:p>
-    <w:bookmarkEnd w:id="349"/>
-    <w:bookmarkStart w:id="350" w:name="ref-RobertsPostlewaite1976Incentives"/>
+    <w:bookmarkEnd w:id="348"/>
+    <w:bookmarkStart w:id="349" w:name="ref-RobertsPostlewaite1976Incentives"/>
     <w:p>
       <w:pPr>
         <w:pStyle w:val="Bibliography"/>
@@ -63829,8 +63737,8 @@
         <w:t xml:space="preserve">44 (1): 115-27.</w:t>
       </w:r>
     </w:p>
-    <w:bookmarkEnd w:id="350"/>
-    <w:bookmarkStart w:id="351" w:name="ref-RobertsSonnenschein1977Foundations"/>
+    <w:bookmarkEnd w:id="349"/>
+    <w:bookmarkStart w:id="350" w:name="ref-RobertsSonnenschein1977Foundations"/>
     <w:p>
       <w:pPr>
         <w:pStyle w:val="Bibliography"/>
@@ -63864,14 +63772,23 @@
         <w:t xml:space="preserve">45 (1): 101-13.</w:t>
       </w:r>
     </w:p>
-    <w:bookmarkEnd w:id="351"/>
-    <w:bookmarkStart w:id="352" w:name="ref-Robinson1962Economic"/>
+    <w:bookmarkEnd w:id="350"/>
+    <w:bookmarkStart w:id="352" w:name="ref-Rubinstein1982Perfect"/>
     <w:p>
       <w:pPr>
         <w:pStyle w:val="Bibliography"/>
       </w:pPr>
       <w:r>
-        <w:t xml:space="preserve">Robinson, Joan. 1962.</w:t>
+        <w:t xml:space="preserve">Rubinstein, Ariel. 1982.</w:t>
+      </w:r>
+      <w:r>
+        <w:t xml:space="preserve"> </w:t>
+      </w:r>
+      <w:r>
+        <w:t xml:space="preserve">«Perfect Equilibrium in a Bargaining Model»</w:t>
+      </w:r>
+      <w:r>
+        <w:t xml:space="preserve">.</w:t>
       </w:r>
       <w:r>
         <w:t xml:space="preserve"> </w:t>
@@ -63881,38 +63798,6 @@
           <w:i/>
           <w:iCs/>
         </w:rPr>
-        <w:t xml:space="preserve">Economic Philosophy</w:t>
-      </w:r>
-      <w:r>
-        <w:t xml:space="preserve">. Londres: C. A. Watts.</w:t>
-      </w:r>
-    </w:p>
-    <w:bookmarkEnd w:id="352"/>
-    <w:bookmarkStart w:id="354" w:name="ref-Rubinstein1982Perfect"/>
-    <w:p>
-      <w:pPr>
-        <w:pStyle w:val="Bibliography"/>
-      </w:pPr>
-      <w:r>
-        <w:t xml:space="preserve">Rubinstein, Ariel. 1982.</w:t>
-      </w:r>
-      <w:r>
-        <w:t xml:space="preserve"> </w:t>
-      </w:r>
-      <w:r>
-        <w:t xml:space="preserve">«Perfect Equilibrium in a Bargaining Model»</w:t>
-      </w:r>
-      <w:r>
-        <w:t xml:space="preserve">.</w:t>
-      </w:r>
-      <w:r>
-        <w:t xml:space="preserve"> </w:t>
-      </w:r>
-      <w:r>
-        <w:rPr>
-          <w:i/>
-          <w:iCs/>
-        </w:rPr>
         <w:t xml:space="preserve">Econometrica</w:t>
       </w:r>
       <w:r>
@@ -63924,7 +63809,7 @@
       <w:r>
         <w:t xml:space="preserve"> </w:t>
       </w:r>
-      <w:hyperlink r:id="rId353">
+      <w:hyperlink r:id="rId351">
         <w:r>
           <w:rPr>
             <w:rStyle w:val="Hyperlink"/>
@@ -63936,8 +63821,8 @@
         <w:t xml:space="preserve">.</w:t>
       </w:r>
     </w:p>
-    <w:bookmarkEnd w:id="354"/>
-    <w:bookmarkStart w:id="355" w:name="ref-Rybczynski1955Factor"/>
+    <w:bookmarkEnd w:id="352"/>
+    <w:bookmarkStart w:id="353" w:name="ref-Rybczynski1955Factor"/>
     <w:p>
       <w:pPr>
         <w:pStyle w:val="Bibliography"/>
@@ -63971,8 +63856,8 @@
         <w:t xml:space="preserve">22 (88): 336-41.</w:t>
       </w:r>
     </w:p>
-    <w:bookmarkEnd w:id="355"/>
-    <w:bookmarkStart w:id="356" w:name="ref-Samuelson1941Stability"/>
+    <w:bookmarkEnd w:id="353"/>
+    <w:bookmarkStart w:id="354" w:name="ref-Samuelson1941Stability"/>
     <w:p>
       <w:pPr>
         <w:pStyle w:val="Bibliography"/>
@@ -64006,8 +63891,8 @@
         <w:t xml:space="preserve">9 (2): 97-120.</w:t>
       </w:r>
     </w:p>
-    <w:bookmarkEnd w:id="356"/>
-    <w:bookmarkStart w:id="357" w:name="ref-Samuelson1947Foundations"/>
+    <w:bookmarkEnd w:id="354"/>
+    <w:bookmarkStart w:id="355" w:name="ref-Samuelson1947Foundations"/>
     <w:p>
       <w:pPr>
         <w:pStyle w:val="Bibliography"/>
@@ -64029,8 +63914,8 @@
         <w:t xml:space="preserve">. Cambridge (Massachusetts): Harvard University Press.</w:t>
       </w:r>
     </w:p>
-    <w:bookmarkEnd w:id="357"/>
-    <w:bookmarkStart w:id="358" w:name="ref-Samuelson1958Exact"/>
+    <w:bookmarkEnd w:id="355"/>
+    <w:bookmarkStart w:id="356" w:name="ref-Samuelson1958Exact"/>
     <w:p>
       <w:pPr>
         <w:pStyle w:val="Bibliography"/>
@@ -64064,8 +63949,8 @@
         <w:t xml:space="preserve">66 (6): 467-82.</w:t>
       </w:r>
     </w:p>
-    <w:bookmarkEnd w:id="358"/>
-    <w:bookmarkStart w:id="360" w:name="ref-Scarf1967Approximation"/>
+    <w:bookmarkEnd w:id="356"/>
+    <w:bookmarkStart w:id="358" w:name="ref-Scarf1967Approximation"/>
     <w:p>
       <w:pPr>
         <w:pStyle w:val="Bibliography"/>
@@ -64101,7 +63986,7 @@
       <w:r>
         <w:t xml:space="preserve"> </w:t>
       </w:r>
-      <w:hyperlink r:id="rId359">
+      <w:hyperlink r:id="rId357">
         <w:r>
           <w:rPr>
             <w:rStyle w:val="Hyperlink"/>
@@ -64113,8 +63998,8 @@
         <w:t xml:space="preserve">.</w:t>
       </w:r>
     </w:p>
-    <w:bookmarkEnd w:id="360"/>
-    <w:bookmarkStart w:id="361" w:name="ref-Scarf1960Examples"/>
+    <w:bookmarkEnd w:id="358"/>
+    <w:bookmarkStart w:id="359" w:name="ref-Scarf1960Examples"/>
     <w:p>
       <w:pPr>
         <w:pStyle w:val="Bibliography"/>
@@ -64148,8 +64033,8 @@
         <w:t xml:space="preserve">1 (3): 157-72.</w:t>
       </w:r>
     </w:p>
-    <w:bookmarkEnd w:id="361"/>
-    <w:bookmarkStart w:id="362" w:name="ref-ScarfHansen1973Computation"/>
+    <w:bookmarkEnd w:id="359"/>
+    <w:bookmarkStart w:id="360" w:name="ref-ScarfHansen1973Computation"/>
     <w:p>
       <w:pPr>
         <w:pStyle w:val="Bibliography"/>
@@ -64171,8 +64056,8 @@
         <w:t xml:space="preserve">. Cowles Foundation Monograph 24. New Haven: Yale University Press.</w:t>
       </w:r>
     </w:p>
-    <w:bookmarkEnd w:id="362"/>
-    <w:bookmarkStart w:id="363" w:name="ref-Segura1986Analisis"/>
+    <w:bookmarkEnd w:id="360"/>
+    <w:bookmarkStart w:id="361" w:name="ref-Segura1986Analisis"/>
     <w:p>
       <w:pPr>
         <w:pStyle w:val="Bibliography"/>
@@ -64194,8 +64079,8 @@
         <w:t xml:space="preserve">. 3.ª ed. Alianza Universidad Textos. Madrid: Alianza Editorial.</w:t>
       </w:r>
     </w:p>
-    <w:bookmarkEnd w:id="363"/>
-    <w:bookmarkStart w:id="364" w:name="ref-Shiller1993Macro"/>
+    <w:bookmarkEnd w:id="361"/>
+    <w:bookmarkStart w:id="362" w:name="ref-Shiller1993Macro"/>
     <w:p>
       <w:pPr>
         <w:pStyle w:val="Bibliography"/>
@@ -64217,8 +64102,8 @@
         <w:t xml:space="preserve">. Oxford: Clarendon Press.</w:t>
       </w:r>
     </w:p>
-    <w:bookmarkEnd w:id="364"/>
-    <w:bookmarkStart w:id="365" w:name="ref-ShovenWhalley1992Applying"/>
+    <w:bookmarkEnd w:id="362"/>
+    <w:bookmarkStart w:id="363" w:name="ref-ShovenWhalley1992Applying"/>
     <w:p>
       <w:pPr>
         <w:pStyle w:val="Bibliography"/>
@@ -64240,8 +64125,8 @@
         <w:t xml:space="preserve">. Cambridge: Cambridge University Press.</w:t>
       </w:r>
     </w:p>
-    <w:bookmarkEnd w:id="365"/>
-    <w:bookmarkStart w:id="366" w:name="ref-Shubik1959Edgeworth"/>
+    <w:bookmarkEnd w:id="363"/>
+    <w:bookmarkStart w:id="364" w:name="ref-Shubik1959Edgeworth"/>
     <w:p>
       <w:pPr>
         <w:pStyle w:val="Bibliography"/>
@@ -64272,8 +64157,8 @@
         <w:t xml:space="preserve">, editado por Albert W. Tucker y R. Duncan Luce, 267-78. Annals of Mathematics Studies 40. Princeton: Princeton University Press.</w:t>
       </w:r>
     </w:p>
-    <w:bookmarkEnd w:id="366"/>
-    <w:bookmarkStart w:id="367" w:name="ref-Sidrauski1967Rational"/>
+    <w:bookmarkEnd w:id="364"/>
+    <w:bookmarkStart w:id="365" w:name="ref-Sidrauski1967Rational"/>
     <w:p>
       <w:pPr>
         <w:pStyle w:val="Bibliography"/>
@@ -64307,8 +64192,8 @@
         <w:t xml:space="preserve">57 (2): 534-44.</w:t>
       </w:r>
     </w:p>
-    <w:bookmarkEnd w:id="367"/>
-    <w:bookmarkStart w:id="369" w:name="ref-Smith1776Wealth"/>
+    <w:bookmarkEnd w:id="365"/>
+    <w:bookmarkStart w:id="367" w:name="ref-Smith1776Wealth"/>
     <w:p>
       <w:pPr>
         <w:pStyle w:val="Bibliography"/>
@@ -64332,7 +64217,7 @@
       <w:r>
         <w:t xml:space="preserve"> </w:t>
       </w:r>
-      <w:hyperlink r:id="rId368">
+      <w:hyperlink r:id="rId366">
         <w:r>
           <w:rPr>
             <w:rStyle w:val="Hyperlink"/>
@@ -64344,8 +64229,8 @@
         <w:t xml:space="preserve">.</w:t>
       </w:r>
     </w:p>
-    <w:bookmarkEnd w:id="369"/>
-    <w:bookmarkStart w:id="371" w:name="ref-Sonnenschein1972Market"/>
+    <w:bookmarkEnd w:id="367"/>
+    <w:bookmarkStart w:id="369" w:name="ref-Sonnenschein1972Market"/>
     <w:p>
       <w:pPr>
         <w:pStyle w:val="Bibliography"/>
@@ -64381,7 +64266,7 @@
       <w:r>
         <w:t xml:space="preserve"> </w:t>
       </w:r>
-      <w:hyperlink r:id="rId370">
+      <w:hyperlink r:id="rId368">
         <w:r>
           <w:rPr>
             <w:rStyle w:val="Hyperlink"/>
@@ -64393,8 +64278,8 @@
         <w:t xml:space="preserve">.</w:t>
       </w:r>
     </w:p>
-    <w:bookmarkEnd w:id="371"/>
-    <w:bookmarkStart w:id="373" w:name="ref-Sonnenschein1973Walras"/>
+    <w:bookmarkEnd w:id="369"/>
+    <w:bookmarkStart w:id="371" w:name="ref-Sonnenschein1973Walras"/>
     <w:p>
       <w:pPr>
         <w:pStyle w:val="Bibliography"/>
@@ -64427,7 +64312,7 @@
       <w:r>
         <w:t xml:space="preserve"> </w:t>
       </w:r>
-      <w:hyperlink r:id="rId372">
+      <w:hyperlink r:id="rId370">
         <w:r>
           <w:rPr>
             <w:rStyle w:val="Hyperlink"/>
@@ -64439,8 +64324,8 @@
         <w:t xml:space="preserve">.</w:t>
       </w:r>
     </w:p>
-    <w:bookmarkEnd w:id="373"/>
-    <w:bookmarkStart w:id="375" w:name="ref-StahlerThomas2012FiMod"/>
+    <w:bookmarkEnd w:id="371"/>
+    <w:bookmarkStart w:id="373" w:name="ref-StahlerThomas2012FiMod"/>
     <w:p>
       <w:pPr>
         <w:pStyle w:val="Bibliography"/>
@@ -64476,7 +64361,7 @@
       <w:r>
         <w:t xml:space="preserve"> </w:t>
       </w:r>
-      <w:hyperlink r:id="rId374">
+      <w:hyperlink r:id="rId372">
         <w:r>
           <w:rPr>
             <w:rStyle w:val="Hyperlink"/>
@@ -64488,8 +64373,8 @@
         <w:t xml:space="preserve">.</w:t>
       </w:r>
     </w:p>
-    <w:bookmarkEnd w:id="375"/>
-    <w:bookmarkStart w:id="377" w:name="ref-Starr1969Quasi"/>
+    <w:bookmarkEnd w:id="373"/>
+    <w:bookmarkStart w:id="375" w:name="ref-Starr1969Quasi"/>
     <w:p>
       <w:pPr>
         <w:pStyle w:val="Bibliography"/>
@@ -64525,7 +64410,7 @@
       <w:r>
         <w:t xml:space="preserve"> </w:t>
       </w:r>
-      <w:hyperlink r:id="rId376">
+      <w:hyperlink r:id="rId374">
         <w:r>
           <w:rPr>
             <w:rStyle w:val="Hyperlink"/>
@@ -64537,8 +64422,8 @@
         <w:t xml:space="preserve">.</w:t>
       </w:r>
     </w:p>
-    <w:bookmarkEnd w:id="377"/>
-    <w:bookmarkStart w:id="379" w:name="ref-Stigler1961Information"/>
+    <w:bookmarkEnd w:id="375"/>
+    <w:bookmarkStart w:id="377" w:name="ref-Stigler1961Information"/>
     <w:p>
       <w:pPr>
         <w:pStyle w:val="Bibliography"/>
@@ -64574,7 +64459,7 @@
       <w:r>
         <w:t xml:space="preserve"> </w:t>
       </w:r>
-      <w:hyperlink r:id="rId378">
+      <w:hyperlink r:id="rId376">
         <w:r>
           <w:rPr>
             <w:rStyle w:val="Hyperlink"/>
@@ -64586,8 +64471,8 @@
         <w:t xml:space="preserve">.</w:t>
       </w:r>
     </w:p>
-    <w:bookmarkEnd w:id="379"/>
-    <w:bookmarkStart w:id="380" w:name="ref-StolperSamuelson1941Protection"/>
+    <w:bookmarkEnd w:id="377"/>
+    <w:bookmarkStart w:id="378" w:name="ref-StolperSamuelson1941Protection"/>
     <w:p>
       <w:pPr>
         <w:pStyle w:val="Bibliography"/>
@@ -64621,8 +64506,8 @@
         <w:t xml:space="preserve">9 (1): 58-73.</w:t>
       </w:r>
     </w:p>
-    <w:bookmarkEnd w:id="380"/>
-    <w:bookmarkStart w:id="382" w:name="ref-HET2026Wald"/>
+    <w:bookmarkEnd w:id="378"/>
+    <w:bookmarkStart w:id="380" w:name="ref-HET2026Wald"/>
     <w:p>
       <w:pPr>
         <w:pStyle w:val="Bibliography"/>
@@ -64642,7 +64527,7 @@
       <w:r>
         <w:t xml:space="preserve"> </w:t>
       </w:r>
-      <w:hyperlink r:id="rId381">
+      <w:hyperlink r:id="rId379">
         <w:r>
           <w:rPr>
             <w:rStyle w:val="Hyperlink"/>
@@ -64654,8 +64539,8 @@
         <w:t xml:space="preserve">.</w:t>
       </w:r>
     </w:p>
-    <w:bookmarkEnd w:id="382"/>
-    <w:bookmarkStart w:id="384" w:name="ref-HET2026Cassel"/>
+    <w:bookmarkEnd w:id="380"/>
+    <w:bookmarkStart w:id="382" w:name="ref-HET2026Cassel"/>
     <w:p>
       <w:pPr>
         <w:pStyle w:val="Bibliography"/>
@@ -64675,7 +64560,7 @@
       <w:r>
         <w:t xml:space="preserve"> </w:t>
       </w:r>
-      <w:hyperlink r:id="rId383">
+      <w:hyperlink r:id="rId381">
         <w:r>
           <w:rPr>
             <w:rStyle w:val="Hyperlink"/>
@@ -64687,8 +64572,8 @@
         <w:t xml:space="preserve">.</w:t>
       </w:r>
     </w:p>
-    <w:bookmarkEnd w:id="384"/>
-    <w:bookmarkStart w:id="386" w:name="ref-HET2026Swedish"/>
+    <w:bookmarkEnd w:id="382"/>
+    <w:bookmarkStart w:id="384" w:name="ref-HET2026Swedish"/>
     <w:p>
       <w:pPr>
         <w:pStyle w:val="Bibliography"/>
@@ -64708,7 +64593,7 @@
       <w:r>
         <w:t xml:space="preserve"> </w:t>
       </w:r>
-      <w:hyperlink r:id="rId385">
+      <w:hyperlink r:id="rId383">
         <w:r>
           <w:rPr>
             <w:rStyle w:val="Hyperlink"/>
@@ -64720,8 +64605,8 @@
         <w:t xml:space="preserve">.</w:t>
       </w:r>
     </w:p>
-    <w:bookmarkEnd w:id="386"/>
-    <w:bookmarkStart w:id="388" w:name="ref-Nobel1972HicksArrow"/>
+    <w:bookmarkEnd w:id="384"/>
+    <w:bookmarkStart w:id="386" w:name="ref-Nobel1972HicksArrow"/>
     <w:p>
       <w:pPr>
         <w:pStyle w:val="Bibliography"/>
@@ -64741,7 +64626,7 @@
       <w:r>
         <w:t xml:space="preserve"> </w:t>
       </w:r>
-      <w:hyperlink r:id="rId387">
+      <w:hyperlink r:id="rId385">
         <w:r>
           <w:rPr>
             <w:rStyle w:val="Hyperlink"/>
@@ -64753,8 +64638,8 @@
         <w:t xml:space="preserve">.</w:t>
       </w:r>
     </w:p>
-    <w:bookmarkEnd w:id="388"/>
-    <w:bookmarkStart w:id="390" w:name="ref-Nobel1983Debreu"/>
+    <w:bookmarkEnd w:id="386"/>
+    <w:bookmarkStart w:id="388" w:name="ref-Nobel1983Debreu"/>
     <w:p>
       <w:pPr>
         <w:pStyle w:val="Bibliography"/>
@@ -64774,7 +64659,7 @@
       <w:r>
         <w:t xml:space="preserve"> </w:t>
       </w:r>
-      <w:hyperlink r:id="rId389">
+      <w:hyperlink r:id="rId387">
         <w:r>
           <w:rPr>
             <w:rStyle w:val="Hyperlink"/>
@@ -64786,8 +64671,8 @@
         <w:t xml:space="preserve">.</w:t>
       </w:r>
     </w:p>
-    <w:bookmarkEnd w:id="390"/>
-    <w:bookmarkStart w:id="392" w:name="ref-Nobel1998Sen"/>
+    <w:bookmarkEnd w:id="388"/>
+    <w:bookmarkStart w:id="390" w:name="ref-Nobel1998Sen"/>
     <w:p>
       <w:pPr>
         <w:pStyle w:val="Bibliography"/>
@@ -64807,7 +64692,7 @@
       <w:r>
         <w:t xml:space="preserve"> </w:t>
       </w:r>
-      <w:hyperlink r:id="rId391">
+      <w:hyperlink r:id="rId389">
         <w:r>
           <w:rPr>
             <w:rStyle w:val="Hyperlink"/>
@@ -64819,8 +64704,8 @@
         <w:t xml:space="preserve">.</w:t>
       </w:r>
     </w:p>
-    <w:bookmarkEnd w:id="392"/>
-    <w:bookmarkStart w:id="394" w:name="ref-Nobel2017Thaler"/>
+    <w:bookmarkEnd w:id="390"/>
+    <w:bookmarkStart w:id="392" w:name="ref-Nobel2017Thaler"/>
     <w:p>
       <w:pPr>
         <w:pStyle w:val="Bibliography"/>
@@ -64840,7 +64725,7 @@
       <w:r>
         <w:t xml:space="preserve"> </w:t>
       </w:r>
-      <w:hyperlink r:id="rId393">
+      <w:hyperlink r:id="rId391">
         <w:r>
           <w:rPr>
             <w:rStyle w:val="Hyperlink"/>
@@ -64852,8 +64737,8 @@
         <w:t xml:space="preserve">.</w:t>
       </w:r>
     </w:p>
-    <w:bookmarkEnd w:id="394"/>
-    <w:bookmarkStart w:id="396" w:name="ref-Nobel2018Nordhaus"/>
+    <w:bookmarkEnd w:id="392"/>
+    <w:bookmarkStart w:id="394" w:name="ref-Nobel2018Nordhaus"/>
     <w:p>
       <w:pPr>
         <w:pStyle w:val="Bibliography"/>
@@ -64873,7 +64758,7 @@
       <w:r>
         <w:t xml:space="preserve"> </w:t>
       </w:r>
-      <w:hyperlink r:id="rId395">
+      <w:hyperlink r:id="rId393">
         <w:r>
           <w:rPr>
             <w:rStyle w:val="Hyperlink"/>
@@ -64885,8 +64770,8 @@
         <w:t xml:space="preserve">.</w:t>
       </w:r>
     </w:p>
-    <w:bookmarkEnd w:id="396"/>
-    <w:bookmarkStart w:id="398" w:name="ref-USITC2019USMCA"/>
+    <w:bookmarkEnd w:id="394"/>
+    <w:bookmarkStart w:id="396" w:name="ref-USITC2019USMCA"/>
     <w:p>
       <w:pPr>
         <w:pStyle w:val="Bibliography"/>
@@ -64906,7 +64791,7 @@
       <w:r>
         <w:t xml:space="preserve"> </w:t>
       </w:r>
-      <w:hyperlink r:id="rId397">
+      <w:hyperlink r:id="rId395">
         <w:r>
           <w:rPr>
             <w:rStyle w:val="Hyperlink"/>
@@ -64918,8 +64803,8 @@
         <w:t xml:space="preserve">.</w:t>
       </w:r>
     </w:p>
-    <w:bookmarkEnd w:id="398"/>
-    <w:bookmarkStart w:id="399" w:name="ref-Varian1992Microeconomic"/>
+    <w:bookmarkEnd w:id="396"/>
+    <w:bookmarkStart w:id="397" w:name="ref-Varian1992Microeconomic"/>
     <w:p>
       <w:pPr>
         <w:pStyle w:val="Bibliography"/>
@@ -64941,8 +64826,8 @@
         <w:t xml:space="preserve">. 3.ª ed. Nueva York: W. W. Norton.</w:t>
       </w:r>
     </w:p>
-    <w:bookmarkEnd w:id="399"/>
-    <w:bookmarkStart w:id="400" w:name="ref-Wald1936Gleichungssysteme"/>
+    <w:bookmarkEnd w:id="397"/>
+    <w:bookmarkStart w:id="398" w:name="ref-Wald1936Gleichungssysteme"/>
     <w:p>
       <w:pPr>
         <w:pStyle w:val="Bibliography"/>
@@ -64976,8 +64861,8 @@
         <w:t xml:space="preserve">7: 637-70.</w:t>
       </w:r>
     </w:p>
-    <w:bookmarkEnd w:id="400"/>
-    <w:bookmarkStart w:id="402" w:name="ref-Walker1987Tatonnement"/>
+    <w:bookmarkEnd w:id="398"/>
+    <w:bookmarkStart w:id="400" w:name="ref-Walker1987Tatonnement"/>
     <w:p>
       <w:pPr>
         <w:pStyle w:val="Bibliography"/>
@@ -65013,7 +64898,7 @@
       <w:r>
         <w:t xml:space="preserve"> </w:t>
       </w:r>
-      <w:hyperlink r:id="rId401">
+      <w:hyperlink r:id="rId399">
         <w:r>
           <w:rPr>
             <w:rStyle w:val="Hyperlink"/>
@@ -65025,8 +64910,8 @@
         <w:t xml:space="preserve">.</w:t>
       </w:r>
     </w:p>
-    <w:bookmarkEnd w:id="402"/>
-    <w:bookmarkStart w:id="404" w:name="ref-Walras1874Elements"/>
+    <w:bookmarkEnd w:id="400"/>
+    <w:bookmarkStart w:id="402" w:name="ref-Walras1874Elements"/>
     <w:p>
       <w:pPr>
         <w:pStyle w:val="Bibliography"/>
@@ -65050,7 +64935,7 @@
       <w:r>
         <w:t xml:space="preserve"> </w:t>
       </w:r>
-      <w:hyperlink r:id="rId403">
+      <w:hyperlink r:id="rId401">
         <w:r>
           <w:rPr>
             <w:rStyle w:val="Hyperlink"/>
@@ -65062,8 +64947,8 @@
         <w:t xml:space="preserve">.</w:t>
       </w:r>
     </w:p>
-    <w:bookmarkEnd w:id="404"/>
-    <w:bookmarkStart w:id="405" w:name="ref-Wicksell1958Selected"/>
+    <w:bookmarkEnd w:id="402"/>
+    <w:bookmarkStart w:id="403" w:name="ref-Wicksell1958Selected"/>
     <w:p>
       <w:pPr>
         <w:pStyle w:val="Bibliography"/>
@@ -65085,8 +64970,8 @@
         <w:t xml:space="preserve">. Editado por Erik Lindahl. Londres: Allen &amp; Unwin.</w:t>
       </w:r>
     </w:p>
-    <w:bookmarkEnd w:id="405"/>
-    <w:bookmarkStart w:id="406" w:name="ref-Wikipedia2026Tanteo"/>
+    <w:bookmarkEnd w:id="403"/>
+    <w:bookmarkStart w:id="404" w:name="ref-Wikipedia2026Tanteo"/>
     <w:p>
       <w:pPr>
         <w:pStyle w:val="Bibliography"/>
@@ -65106,7 +64991,7 @@
       <w:r>
         <w:t xml:space="preserve"> </w:t>
       </w:r>
-      <w:hyperlink r:id="rId28">
+      <w:hyperlink r:id="rId27">
         <w:r>
           <w:rPr>
             <w:rStyle w:val="Hyperlink"/>
@@ -65118,9 +65003,9 @@
         <w:t xml:space="preserve">.</w:t>
       </w:r>
     </w:p>
+    <w:bookmarkEnd w:id="404"/>
+    <w:bookmarkEnd w:id="405"/>
     <w:bookmarkEnd w:id="406"/>
-    <w:bookmarkEnd w:id="407"/>
-    <w:bookmarkEnd w:id="408"/>
     <w:sectPr>
       <w:headerReference r:id="rId9" w:type="default"/>
       <w:footerReference r:id="rIdTceeB" w:type="default"/>
@@ -66005,7 +65890,7 @@
       </w:r>
     </w:p>
   </w:footnote>
-  <w:footnote w:id="27">
+  <w:footnote w:id="30">
     <w:p>
       <w:pPr>
         <w:pStyle w:val="FootnoteText"/>
@@ -66020,154 +65905,92 @@
         <w:t xml:space="preserve"> </w:t>
       </w:r>
       <w:r>
-        <w:t xml:space="preserve">En el original: «</w:t>
+        <w:t xml:space="preserve">Cada agente conoce los precios y sus propias preferencias o su tecnología; no necesita conocer las de los demás, porque los precios resumen toda la información relevante.</w:t>
+      </w:r>
+    </w:p>
+  </w:footnote>
+  <w:footnote w:id="31">
+    <w:p>
+      <w:pPr>
+        <w:pStyle w:val="FootnoteText"/>
+      </w:pPr>
+      <w:r>
+        <w:rPr>
+          <w:rStyle w:val="FootnoteReference"/>
+        </w:rPr>
+        <w:footnoteRef/>
+      </w:r>
+      <w:r>
+        <w:t xml:space="preserve"> </w:t>
+      </w:r>
+      <w:r>
+        <w:t xml:space="preserve">Si los hubiera, los precios dejarían de ser señales válidas, porque no recogerían todos los costes y beneficios, y el equilibrio competitivo, si existe, no sería eficiente</w:t>
+      </w:r>
+      <w:r>
+        <w:t xml:space="preserve"> </w:t>
+      </w:r>
+      <w:r>
+        <w:rPr>
+          <w:rStyle w:val="Referenciaatema"/>
+        </w:rPr>
+        <w:t xml:space="preserve">[ver tema 3.A.23]</w:t>
+      </w:r>
+      <w:r>
+        <w:t xml:space="preserve">.</w:t>
+      </w:r>
+    </w:p>
+  </w:footnote>
+  <w:footnote w:id="32">
+    <w:p>
+      <w:pPr>
+        <w:pStyle w:val="FootnoteText"/>
+      </w:pPr>
+      <w:r>
+        <w:rPr>
+          <w:rStyle w:val="FootnoteReference"/>
+        </w:rPr>
+        <w:footnoteRef/>
+      </w:r>
+      <w:r>
+        <w:t xml:space="preserve"> </w:t>
+      </w:r>
+      <w:r>
+        <w:t xml:space="preserve">Para la ley de</w:t>
+      </w:r>
+      <w:r>
+        <w:t xml:space="preserve"> </w:t>
+      </w:r>
+      <w:r>
+        <w:rPr>
+          <w:smallCaps/>
+        </w:rPr>
+        <w:t xml:space="preserve">Walras</w:t>
+      </w:r>
+      <w:r>
+        <w:t xml:space="preserve"> </w:t>
+      </w:r>
+      <w:r>
+        <w:t xml:space="preserve">basta la no saciedad local, y para la existencia, la convexidad no estricta (apartado II.1.1). La convexidad estricta hace que la demanda sea una</w:t>
+      </w:r>
+      <w:r>
+        <w:t xml:space="preserve"> </w:t>
       </w:r>
       <w:r>
         <w:rPr>
           <w:i/>
           <w:iCs/>
         </w:rPr>
-        <w:t xml:space="preserve">A model which took account of all the variegation of reality would be of no more use than a map at the scale of one to one</w:t>
-      </w:r>
-      <w:r>
-        <w:t xml:space="preserve">»</w:t>
-      </w:r>
-      <w:r>
-        <w:t xml:space="preserve"> </w:t>
-      </w:r>
-      <w:r>
-        <w:t xml:space="preserve">(</w:t>
-      </w:r>
-      <w:hyperlink w:anchor="ref-Robinson1962Economic">
-        <w:r>
-          <w:rPr>
-            <w:rStyle w:val="Hyperlink"/>
-            <w:smallCaps/>
-          </w:rPr>
-          <w:t xml:space="preserve">Robinson</w:t>
-        </w:r>
-        <w:r>
-          <w:rPr>
-            <w:rStyle w:val="Hyperlink"/>
-          </w:rPr>
-          <w:t xml:space="preserve"> </w:t>
-        </w:r>
-        <w:r>
-          <w:rPr>
-            <w:rStyle w:val="Hyperlink"/>
-          </w:rPr>
-          <w:t xml:space="preserve">1962, 33</w:t>
-        </w:r>
-      </w:hyperlink>
-      <w:r>
-        <w:t xml:space="preserve">)</w:t>
-      </w:r>
-      <w:r>
-        <w:t xml:space="preserve">.</w:t>
-      </w:r>
-    </w:p>
-  </w:footnote>
-  <w:footnote w:id="31">
-    <w:p>
-      <w:pPr>
-        <w:pStyle w:val="FootnoteText"/>
-      </w:pPr>
-      <w:r>
-        <w:rPr>
-          <w:rStyle w:val="FootnoteReference"/>
-        </w:rPr>
-        <w:footnoteRef/>
-      </w:r>
-      <w:r>
-        <w:t xml:space="preserve"> </w:t>
-      </w:r>
-      <w:r>
-        <w:t xml:space="preserve">Cada agente conoce los precios y sus propias preferencias o su tecnología; no necesita conocer las de los demás, porque los precios resumen toda la información relevante.</w:t>
-      </w:r>
-    </w:p>
-  </w:footnote>
-  <w:footnote w:id="32">
-    <w:p>
-      <w:pPr>
-        <w:pStyle w:val="FootnoteText"/>
-      </w:pPr>
-      <w:r>
-        <w:rPr>
-          <w:rStyle w:val="FootnoteReference"/>
-        </w:rPr>
-        <w:footnoteRef/>
-      </w:r>
-      <w:r>
-        <w:t xml:space="preserve"> </w:t>
-      </w:r>
-      <w:r>
-        <w:t xml:space="preserve">Si los hubiera, los precios dejarían de ser señales válidas, porque no recogerían todos los costes y beneficios, y el equilibrio competitivo, si existe, no sería eficiente</w:t>
-      </w:r>
-      <w:r>
-        <w:t xml:space="preserve"> </w:t>
-      </w:r>
-      <w:r>
-        <w:rPr>
-          <w:rStyle w:val="Referenciaatema"/>
-        </w:rPr>
-        <w:t xml:space="preserve">[ver tema 3.A.23]</w:t>
-      </w:r>
-      <w:r>
-        <w:t xml:space="preserve">.</w:t>
+        <w:t xml:space="preserve">función</w:t>
+      </w:r>
+      <w:r>
+        <w:t xml:space="preserve"> </w:t>
+      </w:r>
+      <w:r>
+        <w:t xml:space="preserve">y no una correspondencia. La utilidad marginal decreciente no es un supuesto del modelo: no es una propiedad ordinal.</w:t>
       </w:r>
     </w:p>
   </w:footnote>
   <w:footnote w:id="33">
-    <w:p>
-      <w:pPr>
-        <w:pStyle w:val="FootnoteText"/>
-      </w:pPr>
-      <w:r>
-        <w:rPr>
-          <w:rStyle w:val="FootnoteReference"/>
-        </w:rPr>
-        <w:footnoteRef/>
-      </w:r>
-      <w:r>
-        <w:t xml:space="preserve"> </w:t>
-      </w:r>
-      <w:r>
-        <w:t xml:space="preserve">Para la ley de</w:t>
-      </w:r>
-      <w:r>
-        <w:t xml:space="preserve"> </w:t>
-      </w:r>
-      <w:r>
-        <w:rPr>
-          <w:smallCaps/>
-        </w:rPr>
-        <w:t xml:space="preserve">Walras</w:t>
-      </w:r>
-      <w:r>
-        <w:t xml:space="preserve"> </w:t>
-      </w:r>
-      <w:r>
-        <w:t xml:space="preserve">basta la no saciedad local, y para la existencia, la convexidad no estricta (apartado II.1.1). La convexidad estricta hace que la demanda sea una</w:t>
-      </w:r>
-      <w:r>
-        <w:t xml:space="preserve"> </w:t>
-      </w:r>
-      <w:r>
-        <w:rPr>
-          <w:i/>
-          <w:iCs/>
-        </w:rPr>
-        <w:t xml:space="preserve">función</w:t>
-      </w:r>
-      <w:r>
-        <w:t xml:space="preserve"> </w:t>
-      </w:r>
-      <w:r>
-        <w:t xml:space="preserve">y no una correspondencia. La utilidad marginal decreciente no es un supuesto del modelo: no es una propiedad ordinal.</w:t>
-      </w:r>
-    </w:p>
-  </w:footnote>
-  <w:footnote w:id="34">
     <w:p>
       <w:pPr>
         <w:pStyle w:val="FootnoteText"/>
@@ -66259,6 +66082,37 @@
       </w:r>
     </w:p>
   </w:footnote>
+  <w:footnote w:id="34">
+    <w:p>
+      <w:pPr>
+        <w:pStyle w:val="FootnoteText"/>
+      </w:pPr>
+      <w:r>
+        <w:rPr>
+          <w:rStyle w:val="FootnoteReference"/>
+        </w:rPr>
+        <w:footnoteRef/>
+      </w:r>
+      <w:r>
+        <w:t xml:space="preserve"> </w:t>
+      </w:r>
+      <w:r>
+        <w:t xml:space="preserve">La función de producción es una relación puramente técnica entre factores y producción: da la máxima cantidad de producto que se obtiene con cada combinación de factores, de modo que solo recoge los métodos de producción técnicamente eficientes</w:t>
+      </w:r>
+      <w:r>
+        <w:t xml:space="preserve"> </w:t>
+      </w:r>
+      <w:r>
+        <w:rPr>
+          <w:rStyle w:val="Referenciaatema"/>
+        </w:rPr>
+        <w:t xml:space="preserve">[ver tema 3.A.11]</w:t>
+      </w:r>
+      <w:r>
+        <w:t xml:space="preserve">.</w:t>
+      </w:r>
+    </w:p>
+  </w:footnote>
   <w:footnote w:id="35">
     <w:p>
       <w:pPr>
@@ -66274,42 +66128,11 @@
         <w:t xml:space="preserve"> </w:t>
       </w:r>
       <w:r>
-        <w:t xml:space="preserve">La función de producción es una relación puramente técnica entre factores y producción: da la máxima cantidad de producto que se obtiene con cada combinación de factores, de modo que solo recoge los métodos de producción técnicamente eficientes</w:t>
-      </w:r>
-      <w:r>
-        <w:t xml:space="preserve"> </w:t>
-      </w:r>
-      <w:r>
-        <w:rPr>
-          <w:rStyle w:val="Referenciaatema"/>
-        </w:rPr>
-        <w:t xml:space="preserve">[ver tema 3.A.11]</w:t>
-      </w:r>
-      <w:r>
-        <w:t xml:space="preserve">.</w:t>
+        <w:t xml:space="preserve">Las 2 tecnologías pueden ser distintas: no tienen por qué usar los factores con la misma intensidad.</w:t>
       </w:r>
     </w:p>
   </w:footnote>
   <w:footnote w:id="36">
-    <w:p>
-      <w:pPr>
-        <w:pStyle w:val="FootnoteText"/>
-      </w:pPr>
-      <w:r>
-        <w:rPr>
-          <w:rStyle w:val="FootnoteReference"/>
-        </w:rPr>
-        <w:footnoteRef/>
-      </w:r>
-      <w:r>
-        <w:t xml:space="preserve"> </w:t>
-      </w:r>
-      <w:r>
-        <w:t xml:space="preserve">Las 2 tecnologías pueden ser distintas: no tienen por qué usar los factores con la misma intensidad.</w:t>
-      </w:r>
-    </w:p>
-  </w:footnote>
-  <w:footnote w:id="37">
     <w:p>
       <w:pPr>
         <w:pStyle w:val="FootnoteText"/>
@@ -67023,7 +66846,7 @@
       </w:r>
     </w:p>
   </w:footnote>
-  <w:footnote w:id="39">
+  <w:footnote w:id="38">
     <w:p>
       <w:pPr>
         <w:pStyle w:val="FootnoteText"/>
@@ -67146,7 +66969,7 @@
       </w:r>
     </w:p>
   </w:footnote>
-  <w:footnote w:id="40">
+  <w:footnote w:id="39">
     <w:p>
       <w:pPr>
         <w:pStyle w:val="FootnoteText"/>
@@ -67372,6 +67195,25 @@
       </w:r>
     </w:p>
   </w:footnote>
+  <w:footnote w:id="40">
+    <w:p>
+      <w:pPr>
+        <w:pStyle w:val="FootnoteText"/>
+      </w:pPr>
+      <w:r>
+        <w:rPr>
+          <w:rStyle w:val="FootnoteReference"/>
+        </w:rPr>
+        <w:footnoteRef/>
+      </w:r>
+      <w:r>
+        <w:t xml:space="preserve"> </w:t>
+      </w:r>
+      <w:r>
+        <w:t xml:space="preserve">Los 2 vértices de la caja, en los que una empresa usa todos los factores y la otra ninguno, también forman parte de la curva de contrato. La pendiente común de las isocuantas cambia a lo largo de la curva de contrato: solo es constante (y la curva de contrato es la diagonal) si las 2 tecnologías usan los factores con la misma intensidad.</w:t>
+      </w:r>
+    </w:p>
+  </w:footnote>
   <w:footnote w:id="41">
     <w:p>
       <w:pPr>
@@ -67387,58 +67229,39 @@
         <w:t xml:space="preserve"> </w:t>
       </w:r>
       <w:r>
-        <w:t xml:space="preserve">Los 2 vértices de la caja, en los que una empresa usa todos los factores y la otra ninguno, también forman parte de la curva de contrato. La pendiente común de las isocuantas cambia a lo largo de la curva de contrato: solo es constante (y la curva de contrato es la diagonal) si las 2 tecnologías usan los factores con la misma intensidad.</w:t>
+        <w:t xml:space="preserve">Es decreciente, porque las funciones de producción son crecientes. Su forma depende de los rendimientos y de las intensidades factoriales: con rendimientos decrecientes es estrictamente cóncava; con rendimientos constantes es estrictamente cóncava si los 2 bienes usan los factores en proporciones distintas y</w:t>
+      </w:r>
+      <w:r>
+        <w:t xml:space="preserve"> </w:t>
+      </w:r>
+      <w:r>
+        <w:rPr>
+          <w:i/>
+          <w:iCs/>
+        </w:rPr>
+        <w:t xml:space="preserve">lineal</w:t>
+      </w:r>
+      <w:r>
+        <w:t xml:space="preserve"> </w:t>
+      </w:r>
+      <w:r>
+        <w:t xml:space="preserve">si las intensidades factoriales coinciden; con rendimientos crecientes puede ser convexa y el equilibrio competitivo puede no existir</w:t>
+      </w:r>
+      <w:r>
+        <w:t xml:space="preserve"> </w:t>
+      </w:r>
+      <w:r>
+        <w:rPr>
+          <w:rStyle w:val="Referenciaatema"/>
+        </w:rPr>
+        <w:t xml:space="preserve">[ver tema 3.B.6]</w:t>
+      </w:r>
+      <w:r>
+        <w:t xml:space="preserve">.</w:t>
       </w:r>
     </w:p>
   </w:footnote>
   <w:footnote w:id="42">
-    <w:p>
-      <w:pPr>
-        <w:pStyle w:val="FootnoteText"/>
-      </w:pPr>
-      <w:r>
-        <w:rPr>
-          <w:rStyle w:val="FootnoteReference"/>
-        </w:rPr>
-        <w:footnoteRef/>
-      </w:r>
-      <w:r>
-        <w:t xml:space="preserve"> </w:t>
-      </w:r>
-      <w:r>
-        <w:t xml:space="preserve">Es decreciente, porque las funciones de producción son crecientes. Su forma depende de los rendimientos y de las intensidades factoriales: con rendimientos decrecientes es estrictamente cóncava; con rendimientos constantes es estrictamente cóncava si los 2 bienes usan los factores en proporciones distintas y</w:t>
-      </w:r>
-      <w:r>
-        <w:t xml:space="preserve"> </w:t>
-      </w:r>
-      <w:r>
-        <w:rPr>
-          <w:i/>
-          <w:iCs/>
-        </w:rPr>
-        <w:t xml:space="preserve">lineal</w:t>
-      </w:r>
-      <w:r>
-        <w:t xml:space="preserve"> </w:t>
-      </w:r>
-      <w:r>
-        <w:t xml:space="preserve">si las intensidades factoriales coinciden; con rendimientos crecientes puede ser convexa y el equilibrio competitivo puede no existir</w:t>
-      </w:r>
-      <w:r>
-        <w:t xml:space="preserve"> </w:t>
-      </w:r>
-      <w:r>
-        <w:rPr>
-          <w:rStyle w:val="Referenciaatema"/>
-        </w:rPr>
-        <w:t xml:space="preserve">[ver tema 3.B.6]</w:t>
-      </w:r>
-      <w:r>
-        <w:t xml:space="preserve">.</w:t>
-      </w:r>
-    </w:p>
-  </w:footnote>
-  <w:footnote w:id="43">
     <w:p>
       <w:pPr>
         <w:pStyle w:val="FootnoteText"/>
@@ -67627,7 +67450,7 @@
       </w:r>
     </w:p>
   </w:footnote>
-  <w:footnote w:id="49">
+  <w:footnote w:id="48">
     <w:p>
       <w:pPr>
         <w:pStyle w:val="FootnoteText"/>
@@ -68060,7 +67883,7 @@
       </w:r>
     </w:p>
   </w:footnote>
-  <w:footnote w:id="52">
+  <w:footnote w:id="51">
     <w:p>
       <w:pPr>
         <w:pStyle w:val="FootnoteText"/>
@@ -68184,7 +68007,7 @@
       </w:r>
     </w:p>
   </w:footnote>
-  <w:footnote w:id="58">
+  <w:footnote w:id="57">
     <w:p>
       <w:pPr>
         <w:pStyle w:val="FootnoteText"/>
@@ -68347,7 +68170,7 @@
       </w:r>
     </w:p>
   </w:footnote>
-  <w:footnote w:id="68">
+  <w:footnote w:id="67">
     <w:p>
       <w:pPr>
         <w:pStyle w:val="FootnoteText"/>
@@ -68422,7 +68245,7 @@
       </w:r>
     </w:p>
   </w:footnote>
-  <w:footnote w:id="69">
+  <w:footnote w:id="68">
     <w:p>
       <w:pPr>
         <w:pStyle w:val="FootnoteText"/>
@@ -68546,7 +68369,7 @@
       </w:r>
     </w:p>
   </w:footnote>
-  <w:footnote w:id="71">
+  <w:footnote w:id="70">
     <w:p>
       <w:pPr>
         <w:pStyle w:val="FootnoteText"/>
@@ -68673,7 +68496,7 @@
       </w:r>
     </w:p>
   </w:footnote>
-  <w:footnote w:id="72">
+  <w:footnote w:id="71">
     <w:p>
       <w:pPr>
         <w:pStyle w:val="FootnoteText"/>
@@ -68721,7 +68544,7 @@
       </w:r>
     </w:p>
   </w:footnote>
-  <w:footnote w:id="78">
+  <w:footnote w:id="77">
     <w:p>
       <w:pPr>
         <w:pStyle w:val="FootnoteText"/>
@@ -68798,7 +68621,7 @@
       </w:r>
     </w:p>
   </w:footnote>
-  <w:footnote w:id="86">
+  <w:footnote w:id="85">
     <w:p>
       <w:pPr>
         <w:pStyle w:val="FootnoteText"/>
@@ -68868,7 +68691,7 @@
       </w:r>
     </w:p>
   </w:footnote>
-  <w:footnote w:id="96">
+  <w:footnote w:id="95">
     <w:p>
       <w:pPr>
         <w:pStyle w:val="FootnoteText"/>
@@ -68923,7 +68746,7 @@
       </w:r>
     </w:p>
   </w:footnote>
-  <w:footnote w:id="107">
+  <w:footnote w:id="106">
     <w:p>
       <w:pPr>
         <w:pStyle w:val="FootnoteText"/>
@@ -69160,7 +68983,7 @@
       </w:r>
     </w:p>
   </w:footnote>
-  <w:footnote w:id="108">
+  <w:footnote w:id="107">
     <w:p>
       <w:pPr>
         <w:pStyle w:val="FootnoteText"/>
@@ -69261,7 +69084,7 @@
       </w:r>
     </w:p>
   </w:footnote>
-  <w:footnote w:id="110">
+  <w:footnote w:id="109">
     <w:p>
       <w:pPr>
         <w:pStyle w:val="FootnoteText"/>
@@ -69306,7 +69129,7 @@
       </w:r>
     </w:p>
   </w:footnote>
-  <w:footnote w:id="111">
+  <w:footnote w:id="110">
     <w:p>
       <w:pPr>
         <w:pStyle w:val="FootnoteText"/>
@@ -69373,7 +69196,7 @@
       </w:r>
     </w:p>
   </w:footnote>
-  <w:footnote w:id="128">
+  <w:footnote w:id="127">
     <w:p>
       <w:pPr>
         <w:pStyle w:val="FootnoteText"/>
@@ -69792,7 +69615,7 @@
       </w:r>
     </w:p>
   </w:footnote>
-  <w:footnote w:id="150">
+  <w:footnote w:id="149">
     <w:p>
       <w:pPr>
         <w:pStyle w:val="FootnoteText"/>
@@ -69906,7 +69729,7 @@
       </w:r>
     </w:p>
   </w:footnote>
-  <w:footnote w:id="163">
+  <w:footnote w:id="162">
     <w:p>
       <w:pPr>
         <w:pStyle w:val="FootnoteText"/>
@@ -69922,29 +69745,29 @@
       </w:r>
       <w:r>
         <w:t xml:space="preserve">Además, obvia los costes de operar los propios mercados y da por hecho que el estado de la naturaleza que ocurre es verificable por todos, algo que en la práctica cuesta y a veces no se puede hacer.</w:t>
+      </w:r>
+    </w:p>
+  </w:footnote>
+  <w:footnote w:id="165">
+    <w:p>
+      <w:pPr>
+        <w:pStyle w:val="FootnoteText"/>
+      </w:pPr>
+      <w:r>
+        <w:rPr>
+          <w:rStyle w:val="FootnoteReference"/>
+        </w:rPr>
+        <w:footnoteRef/>
+      </w:r>
+      <w:r>
+        <w:t xml:space="preserve"> </w:t>
+      </w:r>
+      <w:r>
+        <w:t xml:space="preserve">Otra aplicación es la evaluación de impuestos y transferencias: por ejemplo, el efecto de un impuesto sobre la renta en la oferta de trabajo y su incidencia en equilibrio general.</w:t>
       </w:r>
     </w:p>
   </w:footnote>
   <w:footnote w:id="166">
-    <w:p>
-      <w:pPr>
-        <w:pStyle w:val="FootnoteText"/>
-      </w:pPr>
-      <w:r>
-        <w:rPr>
-          <w:rStyle w:val="FootnoteReference"/>
-        </w:rPr>
-        <w:footnoteRef/>
-      </w:r>
-      <w:r>
-        <w:t xml:space="preserve"> </w:t>
-      </w:r>
-      <w:r>
-        <w:t xml:space="preserve">Otra aplicación es la evaluación de impuestos y transferencias: por ejemplo, el efecto de un impuesto sobre la renta en la oferta de trabajo y su incidencia en equilibrio general.</w:t>
-      </w:r>
-    </w:p>
-  </w:footnote>
-  <w:footnote w:id="167">
     <w:p>
       <w:pPr>
         <w:pStyle w:val="FootnoteText"/>
@@ -70161,7 +69984,7 @@
       </w:r>
     </w:p>
   </w:footnote>
-  <w:footnote w:id="178">
+  <w:footnote w:id="177">
     <w:p>
       <w:pPr>
         <w:pStyle w:val="FootnoteText"/>
@@ -70390,7 +70213,7 @@
       </w:r>
     </w:p>
   </w:footnote>
-  <w:footnote w:id="208">
+  <w:footnote w:id="207">
     <w:p>
       <w:pPr>
         <w:pStyle w:val="FootnoteText"/>

</xml_diff>

<commit_message>
Retoques de coherencia en 3.A.12 y 3.A.21 a raíz del 3.A.16 y el 3.A.17
3.A.21: Musgrave se mantiene con el matiz de que la estabilización es una
analogía; en el anexo D, la oferta decreciente por economías externas a la
empresa (no por rendimientos crecientes); la nota de la negociación remite
al 3.A.17 para la solución de Nash generalizada. 3.A.12: oferta sobre el
mínimo del coste medio que la empresa puede evitar.

Co-Authored-By: Claude Opus 5.5 <noreply@anthropic.com>
Claude-Session: https://claude.ai/code/session_01PWJgAjs4PN1Rvp3aLA4tqT
</commit_message>
<xml_diff>
--- a/oposicion/temario/tercer-ejercicio/3A21.docx
+++ b/oposicion/temario/tercer-ejercicio/3A21.docx
@@ -19793,7 +19793,22 @@
         <w:t xml:space="preserve"> </w:t>
       </w:r>
       <w:r>
-        <w:t xml:space="preserve">incluye la estabilización entre las 3 funciones del sector público, junto a la asignación y la distribución.</w:t>
+        <w:t xml:space="preserve">incluye la estabilización entre las 3 funciones del sector público, junto a la asignación y la distribución. Es una analogía: la estabilización de</w:t>
+      </w:r>
+      <w:r>
+        <w:t xml:space="preserve"> </w:t>
+      </w:r>
+      <w:r>
+        <w:rPr>
+          <w:smallCaps/>
+        </w:rPr>
+        <w:t xml:space="preserve">Musgrave</w:t>
+      </w:r>
+      <w:r>
+        <w:t xml:space="preserve"> </w:t>
+      </w:r>
+      <w:r>
+        <w:t xml:space="preserve">se refiere al empleo y a los precios del conjunto de la economía; aquí la pregunta es si el tanteo lleva los precios relativos a su equilibrio.</w:t>
       </w:r>
     </w:p>
     <w:p>
@@ -53883,7 +53898,19 @@
         <w:t xml:space="preserve">Cuándo difieren</w:t>
       </w:r>
       <w:r>
-        <w:t xml:space="preserve">: si las 2 curvas tienen pendiente negativa (oferta con economías externas o rendimientos crecientes, o demanda de un bien</w:t>
+        <w:t xml:space="preserve">: si las 2 curvas tienen pendiente negativa (oferta de la industria con economías externas a la empresa, la industria de costes decrecientes</w:t>
+      </w:r>
+      <w:r>
+        <w:t xml:space="preserve"> </w:t>
+      </w:r>
+      <w:r>
+        <w:rPr>
+          <w:rStyle w:val="Referenciaatema"/>
+        </w:rPr>
+        <w:t xml:space="preserve">[ver tema 3.A.16]</w:t>
+      </w:r>
+      <w:r>
+        <w:t xml:space="preserve">, o demanda de un bien</w:t>
       </w:r>
       <w:r>
         <w:t xml:space="preserve"> </w:t>
@@ -69420,6 +69447,33 @@
           <m:t>′</m:t>
         </m:r>
       </m:oMath>
+      <w:r>
+        <w:t xml:space="preserve">. Con poder de negociación desigual, la solución de</w:t>
+      </w:r>
+      <w:r>
+        <w:t xml:space="preserve"> </w:t>
+      </w:r>
+      <w:r>
+        <w:rPr>
+          <w:smallCaps/>
+        </w:rPr>
+        <w:t xml:space="preserve">Nash</w:t>
+      </w:r>
+      <w:r>
+        <w:t xml:space="preserve"> </w:t>
+      </w:r>
+      <w:r>
+        <w:t xml:space="preserve">generalizada se aplica al monopolio bilateral</w:t>
+      </w:r>
+      <w:r>
+        <w:t xml:space="preserve"> </w:t>
+      </w:r>
+      <w:r>
+        <w:rPr>
+          <w:rStyle w:val="Referenciaatema"/>
+        </w:rPr>
+        <w:t xml:space="preserve">[ver tema 3.A.17]</w:t>
+      </w:r>
       <w:r>
         <w:t xml:space="preserve">.</w:t>
       </w:r>

</xml_diff>

<commit_message>
Refranes en el 3.A.8 y el 3.A.21 (enganche e idea final)
Sobre gustos no hay nada escrito; cada uno arrima el ascua a su sardina.

Co-Authored-By: Claude Opus 5.5 <noreply@anthropic.com>
Claude-Session: https://claude.ai/code/session_01PWJgAjs4PN1Rvp3aLA4tqT
</commit_message>
<xml_diff>
--- a/oposicion/temario/tercer-ejercicio/3A21.docx
+++ b/oposicion/temario/tercer-ejercicio/3A21.docx
@@ -71,6 +71,17 @@
       </w:r>
       <w:r>
         <w:t xml:space="preserve">:</w:t>
+      </w:r>
+    </w:p>
+    <w:p>
+      <w:pPr>
+        <w:numPr>
+          <w:ilvl w:val="1"/>
+          <w:numId w:val="1002"/>
+        </w:numPr>
+      </w:pPr>
+      <w:r>
+        <w:t xml:space="preserve">«Cada uno arrima el ascua a su sardina», dice el refrán: cada cual mira por lo suyo.</w:t>
       </w:r>
     </w:p>
     <w:p>
@@ -35470,7 +35481,7 @@
         <w:t xml:space="preserve">Bastiat</w:t>
       </w:r>
       <w:r>
-        <w:t xml:space="preserve">, París se abastece sin que nadie lo planifique porque los precios coordinan. Millones de decisiones descentralizadas pueden encajar sin que sobre ni falte nada, pero solo con supuestos exigentes: lo que el modelo enseña no es que el mercado siempre funcione, sino por qué funciona cuando lo hace.</w:t>
+        <w:t xml:space="preserve">, París se abastece sin que nadie lo planifique porque los precios coordinan: aunque cada uno arrime el ascua a su sardina, los precios consiguen que se asen todas. Millones de decisiones descentralizadas pueden encajar sin que sobre ni falte nada, pero solo con supuestos exigentes: lo que el modelo enseña no es que el mercado siempre funcione, sino por qué funciona cuando lo hace.</w:t>
       </w:r>
     </w:p>
     <w:p>

</xml_diff>